<commit_message>
Add NHANES feasibility results and analytic dataset to OSA-depression protocol
factibilidad.py builds the adapted STOP-BAG score and PHQ-9 outcome from the
2017-March 2020 prepandemic files, computes the participant flow and
design-based prevalences, and exports the analytic dataset (.csv/.dta).

Co-Authored-By: Claude Opus 5.5 <noreply@anthropic.com>
Claude-Session: https://claude.ai/code/session_01CVJPPDyHtXiZh6u6qkcjXo
</commit_message>
<xml_diff>
--- a/protocolo-nhanes/Protocolo_AOS_Depresion_NHANES.docx
+++ b/protocolo-nhanes/Protocolo_AOS_Depresion_NHANES.docx
@@ -4081,8 +4081,9 @@
         </w:tblBorders>
       </w:tblPr>
       <w:tblGrid>
-        <w:gridCol w:w="7259"/>
-        <w:gridCol w:w="1528"/>
+        <w:gridCol w:w="4959"/>
+        <w:gridCol w:w="1914"/>
+        <w:gridCol w:w="1914"/>
       </w:tblGrid>
       <w:tr>
         <w:trPr>
@@ -4091,7 +4092,7 @@
         </w:trPr>
         <w:tc>
           <w:tcPr>
-            <w:tcW w:type="dxa" w:w="7259"/>
+            <w:tcW w:type="dxa" w:w="4959"/>
             <w:tcBorders>
               <w:top w:val="single" w:color="000000" w:sz="4"/>
               <w:left w:val="single" w:color="000000" w:sz="4"/>
@@ -4125,7 +4126,7 @@
         </w:tc>
         <w:tc>
           <w:tcPr>
-            <w:tcW w:type="dxa" w:w="1528"/>
+            <w:tcW w:type="dxa" w:w="1914"/>
             <w:tcBorders>
               <w:top w:val="single" w:color="000000" w:sz="4"/>
               <w:left w:val="single" w:color="000000" w:sz="4"/>
@@ -4154,6 +4155,40 @@
                 <w:szCs w:val="20"/>
               </w:rPr>
               <w:t xml:space="preserve">Participantes (n)</w:t>
+            </w:r>
+          </w:p>
+        </w:tc>
+        <w:tc>
+          <w:tcPr>
+            <w:tcW w:type="dxa" w:w="1914"/>
+            <w:tcBorders>
+              <w:top w:val="single" w:color="000000" w:sz="4"/>
+              <w:left w:val="single" w:color="000000" w:sz="4"/>
+              <w:bottom w:val="single" w:color="000000" w:sz="4"/>
+              <w:right w:val="single" w:color="000000" w:sz="4"/>
+            </w:tcBorders>
+            <w:shd w:fill="E7E6E6" w:color="auto" w:val="clear"/>
+            <w:tcMar>
+              <w:top w:type="dxa" w:w="60"/>
+              <w:left w:type="dxa" w:w="100"/>
+              <w:bottom w:type="dxa" w:w="60"/>
+              <w:right w:type="dxa" w:w="100"/>
+            </w:tcMar>
+            <w:vAlign w:val="center"/>
+          </w:tcPr>
+          <w:p>
+            <w:pPr>
+              <w:spacing w:line="240"/>
+              <w:jc w:val="left"/>
+            </w:pPr>
+            <w:r>
+              <w:rPr>
+                <w:b/>
+                <w:bCs/>
+                <w:sz w:val="20"/>
+                <w:szCs w:val="20"/>
+              </w:rPr>
+              <w:t xml:space="preserve">Excluidos (n)</w:t>
             </w:r>
           </w:p>
         </w:tc>
@@ -4165,7 +4200,7 @@
         </w:trPr>
         <w:tc>
           <w:tcPr>
-            <w:tcW w:type="dxa" w:w="7259"/>
+            <w:tcW w:type="dxa" w:w="4959"/>
             <w:tcBorders>
               <w:top w:val="single" w:color="000000" w:sz="4"/>
               <w:left w:val="single" w:color="000000" w:sz="4"/>
@@ -4196,32 +4231,63 @@
         </w:tc>
         <w:tc>
           <w:tcPr>
-            <w:tcW w:type="dxa" w:w="1528"/>
-            <w:tcBorders>
-              <w:top w:val="single" w:color="000000" w:sz="4"/>
-              <w:left w:val="single" w:color="000000" w:sz="4"/>
-              <w:bottom w:val="single" w:color="000000" w:sz="4"/>
-              <w:right w:val="single" w:color="000000" w:sz="4"/>
-            </w:tcBorders>
-            <w:tcMar>
-              <w:top w:type="dxa" w:w="60"/>
-              <w:left w:type="dxa" w:w="100"/>
-              <w:bottom w:type="dxa" w:w="60"/>
-              <w:right w:type="dxa" w:w="100"/>
-            </w:tcMar>
-            <w:vAlign w:val="center"/>
-          </w:tcPr>
-          <w:p>
-            <w:pPr>
-              <w:spacing w:line="240"/>
-              <w:jc w:val="left"/>
-            </w:pPr>
-            <w:r>
-              <w:rPr>
-                <w:sz w:val="20"/>
-                <w:szCs w:val="20"/>
-              </w:rPr>
-              <w:t xml:space="preserve">[n]</w:t>
+            <w:tcW w:type="dxa" w:w="1914"/>
+            <w:tcBorders>
+              <w:top w:val="single" w:color="000000" w:sz="4"/>
+              <w:left w:val="single" w:color="000000" w:sz="4"/>
+              <w:bottom w:val="single" w:color="000000" w:sz="4"/>
+              <w:right w:val="single" w:color="000000" w:sz="4"/>
+            </w:tcBorders>
+            <w:tcMar>
+              <w:top w:type="dxa" w:w="60"/>
+              <w:left w:type="dxa" w:w="100"/>
+              <w:bottom w:type="dxa" w:w="60"/>
+              <w:right w:type="dxa" w:w="100"/>
+            </w:tcMar>
+            <w:vAlign w:val="center"/>
+          </w:tcPr>
+          <w:p>
+            <w:pPr>
+              <w:spacing w:line="240"/>
+              <w:jc w:val="left"/>
+            </w:pPr>
+            <w:r>
+              <w:rPr>
+                <w:sz w:val="20"/>
+                <w:szCs w:val="20"/>
+              </w:rPr>
+              <w:t xml:space="preserve">15,560</w:t>
+            </w:r>
+          </w:p>
+        </w:tc>
+        <w:tc>
+          <w:tcPr>
+            <w:tcW w:type="dxa" w:w="1914"/>
+            <w:tcBorders>
+              <w:top w:val="single" w:color="000000" w:sz="4"/>
+              <w:left w:val="single" w:color="000000" w:sz="4"/>
+              <w:bottom w:val="single" w:color="000000" w:sz="4"/>
+              <w:right w:val="single" w:color="000000" w:sz="4"/>
+            </w:tcBorders>
+            <w:tcMar>
+              <w:top w:type="dxa" w:w="60"/>
+              <w:left w:type="dxa" w:w="100"/>
+              <w:bottom w:type="dxa" w:w="60"/>
+              <w:right w:type="dxa" w:w="100"/>
+            </w:tcMar>
+            <w:vAlign w:val="center"/>
+          </w:tcPr>
+          <w:p>
+            <w:pPr>
+              <w:spacing w:line="240"/>
+              <w:jc w:val="left"/>
+            </w:pPr>
+            <w:r>
+              <w:rPr>
+                <w:sz w:val="20"/>
+                <w:szCs w:val="20"/>
+              </w:rPr>
+              <w:t xml:space="preserve">—</w:t>
             </w:r>
           </w:p>
         </w:tc>
@@ -4233,7 +4299,7 @@
         </w:trPr>
         <w:tc>
           <w:tcPr>
-            <w:tcW w:type="dxa" w:w="7259"/>
+            <w:tcW w:type="dxa" w:w="4959"/>
             <w:tcBorders>
               <w:top w:val="single" w:color="000000" w:sz="4"/>
               <w:left w:val="single" w:color="000000" w:sz="4"/>
@@ -4264,32 +4330,63 @@
         </w:tc>
         <w:tc>
           <w:tcPr>
-            <w:tcW w:type="dxa" w:w="1528"/>
-            <w:tcBorders>
-              <w:top w:val="single" w:color="000000" w:sz="4"/>
-              <w:left w:val="single" w:color="000000" w:sz="4"/>
-              <w:bottom w:val="single" w:color="000000" w:sz="4"/>
-              <w:right w:val="single" w:color="000000" w:sz="4"/>
-            </w:tcBorders>
-            <w:tcMar>
-              <w:top w:type="dxa" w:w="60"/>
-              <w:left w:type="dxa" w:w="100"/>
-              <w:bottom w:type="dxa" w:w="60"/>
-              <w:right w:type="dxa" w:w="100"/>
-            </w:tcMar>
-            <w:vAlign w:val="center"/>
-          </w:tcPr>
-          <w:p>
-            <w:pPr>
-              <w:spacing w:line="240"/>
-              <w:jc w:val="left"/>
-            </w:pPr>
-            <w:r>
-              <w:rPr>
-                <w:sz w:val="20"/>
-                <w:szCs w:val="20"/>
-              </w:rPr>
-              <w:t xml:space="preserve">[n]</w:t>
+            <w:tcW w:type="dxa" w:w="1914"/>
+            <w:tcBorders>
+              <w:top w:val="single" w:color="000000" w:sz="4"/>
+              <w:left w:val="single" w:color="000000" w:sz="4"/>
+              <w:bottom w:val="single" w:color="000000" w:sz="4"/>
+              <w:right w:val="single" w:color="000000" w:sz="4"/>
+            </w:tcBorders>
+            <w:tcMar>
+              <w:top w:type="dxa" w:w="60"/>
+              <w:left w:type="dxa" w:w="100"/>
+              <w:bottom w:type="dxa" w:w="60"/>
+              <w:right w:type="dxa" w:w="100"/>
+            </w:tcMar>
+            <w:vAlign w:val="center"/>
+          </w:tcPr>
+          <w:p>
+            <w:pPr>
+              <w:spacing w:line="240"/>
+              <w:jc w:val="left"/>
+            </w:pPr>
+            <w:r>
+              <w:rPr>
+                <w:sz w:val="20"/>
+                <w:szCs w:val="20"/>
+              </w:rPr>
+              <w:t xml:space="preserve">9,232</w:t>
+            </w:r>
+          </w:p>
+        </w:tc>
+        <w:tc>
+          <w:tcPr>
+            <w:tcW w:type="dxa" w:w="1914"/>
+            <w:tcBorders>
+              <w:top w:val="single" w:color="000000" w:sz="4"/>
+              <w:left w:val="single" w:color="000000" w:sz="4"/>
+              <w:bottom w:val="single" w:color="000000" w:sz="4"/>
+              <w:right w:val="single" w:color="000000" w:sz="4"/>
+            </w:tcBorders>
+            <w:tcMar>
+              <w:top w:type="dxa" w:w="60"/>
+              <w:left w:type="dxa" w:w="100"/>
+              <w:bottom w:type="dxa" w:w="60"/>
+              <w:right w:type="dxa" w:w="100"/>
+            </w:tcMar>
+            <w:vAlign w:val="center"/>
+          </w:tcPr>
+          <w:p>
+            <w:pPr>
+              <w:spacing w:line="240"/>
+              <w:jc w:val="left"/>
+            </w:pPr>
+            <w:r>
+              <w:rPr>
+                <w:sz w:val="20"/>
+                <w:szCs w:val="20"/>
+              </w:rPr>
+              <w:t xml:space="preserve">6,328</w:t>
             </w:r>
           </w:p>
         </w:tc>
@@ -4301,7 +4398,7 @@
         </w:trPr>
         <w:tc>
           <w:tcPr>
-            <w:tcW w:type="dxa" w:w="7259"/>
+            <w:tcW w:type="dxa" w:w="4959"/>
             <w:tcBorders>
               <w:top w:val="single" w:color="000000" w:sz="4"/>
               <w:left w:val="single" w:color="000000" w:sz="4"/>
@@ -4332,32 +4429,63 @@
         </w:tc>
         <w:tc>
           <w:tcPr>
-            <w:tcW w:type="dxa" w:w="1528"/>
-            <w:tcBorders>
-              <w:top w:val="single" w:color="000000" w:sz="4"/>
-              <w:left w:val="single" w:color="000000" w:sz="4"/>
-              <w:bottom w:val="single" w:color="000000" w:sz="4"/>
-              <w:right w:val="single" w:color="000000" w:sz="4"/>
-            </w:tcBorders>
-            <w:tcMar>
-              <w:top w:type="dxa" w:w="60"/>
-              <w:left w:type="dxa" w:w="100"/>
-              <w:bottom w:type="dxa" w:w="60"/>
-              <w:right w:type="dxa" w:w="100"/>
-            </w:tcMar>
-            <w:vAlign w:val="center"/>
-          </w:tcPr>
-          <w:p>
-            <w:pPr>
-              <w:spacing w:line="240"/>
-              <w:jc w:val="left"/>
-            </w:pPr>
-            <w:r>
-              <w:rPr>
-                <w:sz w:val="20"/>
-                <w:szCs w:val="20"/>
-              </w:rPr>
-              <w:t xml:space="preserve">[n]</w:t>
+            <w:tcW w:type="dxa" w:w="1914"/>
+            <w:tcBorders>
+              <w:top w:val="single" w:color="000000" w:sz="4"/>
+              <w:left w:val="single" w:color="000000" w:sz="4"/>
+              <w:bottom w:val="single" w:color="000000" w:sz="4"/>
+              <w:right w:val="single" w:color="000000" w:sz="4"/>
+            </w:tcBorders>
+            <w:tcMar>
+              <w:top w:type="dxa" w:w="60"/>
+              <w:left w:type="dxa" w:w="100"/>
+              <w:bottom w:type="dxa" w:w="60"/>
+              <w:right w:type="dxa" w:w="100"/>
+            </w:tcMar>
+            <w:vAlign w:val="center"/>
+          </w:tcPr>
+          <w:p>
+            <w:pPr>
+              <w:spacing w:line="240"/>
+              <w:jc w:val="left"/>
+            </w:pPr>
+            <w:r>
+              <w:rPr>
+                <w:sz w:val="20"/>
+                <w:szCs w:val="20"/>
+              </w:rPr>
+              <w:t xml:space="preserve">8,544</w:t>
+            </w:r>
+          </w:p>
+        </w:tc>
+        <w:tc>
+          <w:tcPr>
+            <w:tcW w:type="dxa" w:w="1914"/>
+            <w:tcBorders>
+              <w:top w:val="single" w:color="000000" w:sz="4"/>
+              <w:left w:val="single" w:color="000000" w:sz="4"/>
+              <w:bottom w:val="single" w:color="000000" w:sz="4"/>
+              <w:right w:val="single" w:color="000000" w:sz="4"/>
+            </w:tcBorders>
+            <w:tcMar>
+              <w:top w:type="dxa" w:w="60"/>
+              <w:left w:type="dxa" w:w="100"/>
+              <w:bottom w:type="dxa" w:w="60"/>
+              <w:right w:type="dxa" w:w="100"/>
+            </w:tcMar>
+            <w:vAlign w:val="center"/>
+          </w:tcPr>
+          <w:p>
+            <w:pPr>
+              <w:spacing w:line="240"/>
+              <w:jc w:val="left"/>
+            </w:pPr>
+            <w:r>
+              <w:rPr>
+                <w:sz w:val="20"/>
+                <w:szCs w:val="20"/>
+              </w:rPr>
+              <w:t xml:space="preserve">688</w:t>
             </w:r>
           </w:p>
         </w:tc>
@@ -4369,7 +4497,7 @@
         </w:trPr>
         <w:tc>
           <w:tcPr>
-            <w:tcW w:type="dxa" w:w="7259"/>
+            <w:tcW w:type="dxa" w:w="4959"/>
             <w:tcBorders>
               <w:top w:val="single" w:color="000000" w:sz="4"/>
               <w:left w:val="single" w:color="000000" w:sz="4"/>
@@ -4400,32 +4528,63 @@
         </w:tc>
         <w:tc>
           <w:tcPr>
-            <w:tcW w:type="dxa" w:w="1528"/>
-            <w:tcBorders>
-              <w:top w:val="single" w:color="000000" w:sz="4"/>
-              <w:left w:val="single" w:color="000000" w:sz="4"/>
-              <w:bottom w:val="single" w:color="000000" w:sz="4"/>
-              <w:right w:val="single" w:color="000000" w:sz="4"/>
-            </w:tcBorders>
-            <w:tcMar>
-              <w:top w:type="dxa" w:w="60"/>
-              <w:left w:type="dxa" w:w="100"/>
-              <w:bottom w:type="dxa" w:w="60"/>
-              <w:right w:type="dxa" w:w="100"/>
-            </w:tcMar>
-            <w:vAlign w:val="center"/>
-          </w:tcPr>
-          <w:p>
-            <w:pPr>
-              <w:spacing w:line="240"/>
-              <w:jc w:val="left"/>
-            </w:pPr>
-            <w:r>
-              <w:rPr>
-                <w:sz w:val="20"/>
-                <w:szCs w:val="20"/>
-              </w:rPr>
-              <w:t xml:space="preserve">[n]</w:t>
+            <w:tcW w:type="dxa" w:w="1914"/>
+            <w:tcBorders>
+              <w:top w:val="single" w:color="000000" w:sz="4"/>
+              <w:left w:val="single" w:color="000000" w:sz="4"/>
+              <w:bottom w:val="single" w:color="000000" w:sz="4"/>
+              <w:right w:val="single" w:color="000000" w:sz="4"/>
+            </w:tcBorders>
+            <w:tcMar>
+              <w:top w:type="dxa" w:w="60"/>
+              <w:left w:type="dxa" w:w="100"/>
+              <w:bottom w:type="dxa" w:w="60"/>
+              <w:right w:type="dxa" w:w="100"/>
+            </w:tcMar>
+            <w:vAlign w:val="center"/>
+          </w:tcPr>
+          <w:p>
+            <w:pPr>
+              <w:spacing w:line="240"/>
+              <w:jc w:val="left"/>
+            </w:pPr>
+            <w:r>
+              <w:rPr>
+                <w:sz w:val="20"/>
+                <w:szCs w:val="20"/>
+              </w:rPr>
+              <w:t xml:space="preserve">8,457</w:t>
+            </w:r>
+          </w:p>
+        </w:tc>
+        <w:tc>
+          <w:tcPr>
+            <w:tcW w:type="dxa" w:w="1914"/>
+            <w:tcBorders>
+              <w:top w:val="single" w:color="000000" w:sz="4"/>
+              <w:left w:val="single" w:color="000000" w:sz="4"/>
+              <w:bottom w:val="single" w:color="000000" w:sz="4"/>
+              <w:right w:val="single" w:color="000000" w:sz="4"/>
+            </w:tcBorders>
+            <w:tcMar>
+              <w:top w:type="dxa" w:w="60"/>
+              <w:left w:type="dxa" w:w="100"/>
+              <w:bottom w:type="dxa" w:w="60"/>
+              <w:right w:type="dxa" w:w="100"/>
+            </w:tcMar>
+            <w:vAlign w:val="center"/>
+          </w:tcPr>
+          <w:p>
+            <w:pPr>
+              <w:spacing w:line="240"/>
+              <w:jc w:val="left"/>
+            </w:pPr>
+            <w:r>
+              <w:rPr>
+                <w:sz w:val="20"/>
+                <w:szCs w:val="20"/>
+              </w:rPr>
+              <w:t xml:space="preserve">87</w:t>
             </w:r>
           </w:p>
         </w:tc>
@@ -4437,7 +4596,7 @@
         </w:trPr>
         <w:tc>
           <w:tcPr>
-            <w:tcW w:type="dxa" w:w="7259"/>
+            <w:tcW w:type="dxa" w:w="4959"/>
             <w:tcBorders>
               <w:top w:val="single" w:color="000000" w:sz="4"/>
               <w:left w:val="single" w:color="000000" w:sz="4"/>
@@ -4468,32 +4627,63 @@
         </w:tc>
         <w:tc>
           <w:tcPr>
-            <w:tcW w:type="dxa" w:w="1528"/>
-            <w:tcBorders>
-              <w:top w:val="single" w:color="000000" w:sz="4"/>
-              <w:left w:val="single" w:color="000000" w:sz="4"/>
-              <w:bottom w:val="single" w:color="000000" w:sz="4"/>
-              <w:right w:val="single" w:color="000000" w:sz="4"/>
-            </w:tcBorders>
-            <w:tcMar>
-              <w:top w:type="dxa" w:w="60"/>
-              <w:left w:type="dxa" w:w="100"/>
-              <w:bottom w:type="dxa" w:w="60"/>
-              <w:right w:type="dxa" w:w="100"/>
-            </w:tcMar>
-            <w:vAlign w:val="center"/>
-          </w:tcPr>
-          <w:p>
-            <w:pPr>
-              <w:spacing w:line="240"/>
-              <w:jc w:val="left"/>
-            </w:pPr>
-            <w:r>
-              <w:rPr>
-                <w:sz w:val="20"/>
-                <w:szCs w:val="20"/>
-              </w:rPr>
-              <w:t xml:space="preserve">[n]</w:t>
+            <w:tcW w:type="dxa" w:w="1914"/>
+            <w:tcBorders>
+              <w:top w:val="single" w:color="000000" w:sz="4"/>
+              <w:left w:val="single" w:color="000000" w:sz="4"/>
+              <w:bottom w:val="single" w:color="000000" w:sz="4"/>
+              <w:right w:val="single" w:color="000000" w:sz="4"/>
+            </w:tcBorders>
+            <w:tcMar>
+              <w:top w:type="dxa" w:w="60"/>
+              <w:left w:type="dxa" w:w="100"/>
+              <w:bottom w:type="dxa" w:w="60"/>
+              <w:right w:type="dxa" w:w="100"/>
+            </w:tcMar>
+            <w:vAlign w:val="center"/>
+          </w:tcPr>
+          <w:p>
+            <w:pPr>
+              <w:spacing w:line="240"/>
+              <w:jc w:val="left"/>
+            </w:pPr>
+            <w:r>
+              <w:rPr>
+                <w:sz w:val="20"/>
+                <w:szCs w:val="20"/>
+              </w:rPr>
+              <w:t xml:space="preserve">7,435</w:t>
+            </w:r>
+          </w:p>
+        </w:tc>
+        <w:tc>
+          <w:tcPr>
+            <w:tcW w:type="dxa" w:w="1914"/>
+            <w:tcBorders>
+              <w:top w:val="single" w:color="000000" w:sz="4"/>
+              <w:left w:val="single" w:color="000000" w:sz="4"/>
+              <w:bottom w:val="single" w:color="000000" w:sz="4"/>
+              <w:right w:val="single" w:color="000000" w:sz="4"/>
+            </w:tcBorders>
+            <w:tcMar>
+              <w:top w:type="dxa" w:w="60"/>
+              <w:left w:type="dxa" w:w="100"/>
+              <w:bottom w:type="dxa" w:w="60"/>
+              <w:right w:type="dxa" w:w="100"/>
+            </w:tcMar>
+            <w:vAlign w:val="center"/>
+          </w:tcPr>
+          <w:p>
+            <w:pPr>
+              <w:spacing w:line="240"/>
+              <w:jc w:val="left"/>
+            </w:pPr>
+            <w:r>
+              <w:rPr>
+                <w:sz w:val="20"/>
+                <w:szCs w:val="20"/>
+              </w:rPr>
+              <w:t xml:space="preserve">1,022</w:t>
             </w:r>
           </w:p>
         </w:tc>
@@ -4505,7 +4695,7 @@
         </w:trPr>
         <w:tc>
           <w:tcPr>
-            <w:tcW w:type="dxa" w:w="7259"/>
+            <w:tcW w:type="dxa" w:w="4959"/>
             <w:tcBorders>
               <w:top w:val="single" w:color="000000" w:sz="4"/>
               <w:left w:val="single" w:color="000000" w:sz="4"/>
@@ -4536,32 +4726,63 @@
         </w:tc>
         <w:tc>
           <w:tcPr>
-            <w:tcW w:type="dxa" w:w="1528"/>
-            <w:tcBorders>
-              <w:top w:val="single" w:color="000000" w:sz="4"/>
-              <w:left w:val="single" w:color="000000" w:sz="4"/>
-              <w:bottom w:val="single" w:color="000000" w:sz="4"/>
-              <w:right w:val="single" w:color="000000" w:sz="4"/>
-            </w:tcBorders>
-            <w:tcMar>
-              <w:top w:type="dxa" w:w="60"/>
-              <w:left w:type="dxa" w:w="100"/>
-              <w:bottom w:type="dxa" w:w="60"/>
-              <w:right w:type="dxa" w:w="100"/>
-            </w:tcMar>
-            <w:vAlign w:val="center"/>
-          </w:tcPr>
-          <w:p>
-            <w:pPr>
-              <w:spacing w:line="240"/>
-              <w:jc w:val="left"/>
-            </w:pPr>
-            <w:r>
-              <w:rPr>
-                <w:sz w:val="20"/>
-                <w:szCs w:val="20"/>
-              </w:rPr>
-              <w:t xml:space="preserve">[n]</w:t>
+            <w:tcW w:type="dxa" w:w="1914"/>
+            <w:tcBorders>
+              <w:top w:val="single" w:color="000000" w:sz="4"/>
+              <w:left w:val="single" w:color="000000" w:sz="4"/>
+              <w:bottom w:val="single" w:color="000000" w:sz="4"/>
+              <w:right w:val="single" w:color="000000" w:sz="4"/>
+            </w:tcBorders>
+            <w:tcMar>
+              <w:top w:type="dxa" w:w="60"/>
+              <w:left w:type="dxa" w:w="100"/>
+              <w:bottom w:type="dxa" w:w="60"/>
+              <w:right w:type="dxa" w:w="100"/>
+            </w:tcMar>
+            <w:vAlign w:val="center"/>
+          </w:tcPr>
+          <w:p>
+            <w:pPr>
+              <w:spacing w:line="240"/>
+              <w:jc w:val="left"/>
+            </w:pPr>
+            <w:r>
+              <w:rPr>
+                <w:sz w:val="20"/>
+                <w:szCs w:val="20"/>
+              </w:rPr>
+              <w:t xml:space="preserve">6,938</w:t>
+            </w:r>
+          </w:p>
+        </w:tc>
+        <w:tc>
+          <w:tcPr>
+            <w:tcW w:type="dxa" w:w="1914"/>
+            <w:tcBorders>
+              <w:top w:val="single" w:color="000000" w:sz="4"/>
+              <w:left w:val="single" w:color="000000" w:sz="4"/>
+              <w:bottom w:val="single" w:color="000000" w:sz="4"/>
+              <w:right w:val="single" w:color="000000" w:sz="4"/>
+            </w:tcBorders>
+            <w:tcMar>
+              <w:top w:type="dxa" w:w="60"/>
+              <w:left w:type="dxa" w:w="100"/>
+              <w:bottom w:type="dxa" w:w="60"/>
+              <w:right w:type="dxa" w:w="100"/>
+            </w:tcMar>
+            <w:vAlign w:val="center"/>
+          </w:tcPr>
+          <w:p>
+            <w:pPr>
+              <w:spacing w:line="240"/>
+              <w:jc w:val="left"/>
+            </w:pPr>
+            <w:r>
+              <w:rPr>
+                <w:sz w:val="20"/>
+                <w:szCs w:val="20"/>
+              </w:rPr>
+              <w:t xml:space="preserve">497</w:t>
             </w:r>
           </w:p>
         </w:tc>
@@ -4573,7 +4794,7 @@
         </w:trPr>
         <w:tc>
           <w:tcPr>
-            <w:tcW w:type="dxa" w:w="7259"/>
+            <w:tcW w:type="dxa" w:w="4959"/>
             <w:tcBorders>
               <w:top w:val="single" w:color="000000" w:sz="4"/>
               <w:left w:val="single" w:color="000000" w:sz="4"/>
@@ -4604,32 +4825,63 @@
         </w:tc>
         <w:tc>
           <w:tcPr>
-            <w:tcW w:type="dxa" w:w="1528"/>
-            <w:tcBorders>
-              <w:top w:val="single" w:color="000000" w:sz="4"/>
-              <w:left w:val="single" w:color="000000" w:sz="4"/>
-              <w:bottom w:val="single" w:color="000000" w:sz="4"/>
-              <w:right w:val="single" w:color="000000" w:sz="4"/>
-            </w:tcBorders>
-            <w:tcMar>
-              <w:top w:type="dxa" w:w="60"/>
-              <w:left w:type="dxa" w:w="100"/>
-              <w:bottom w:type="dxa" w:w="60"/>
-              <w:right w:type="dxa" w:w="100"/>
-            </w:tcMar>
-            <w:vAlign w:val="center"/>
-          </w:tcPr>
-          <w:p>
-            <w:pPr>
-              <w:spacing w:line="240"/>
-              <w:jc w:val="left"/>
-            </w:pPr>
-            <w:r>
-              <w:rPr>
-                <w:sz w:val="20"/>
-                <w:szCs w:val="20"/>
-              </w:rPr>
-              <w:t xml:space="preserve">[n]</w:t>
+            <w:tcW w:type="dxa" w:w="1914"/>
+            <w:tcBorders>
+              <w:top w:val="single" w:color="000000" w:sz="4"/>
+              <w:left w:val="single" w:color="000000" w:sz="4"/>
+              <w:bottom w:val="single" w:color="000000" w:sz="4"/>
+              <w:right w:val="single" w:color="000000" w:sz="4"/>
+            </w:tcBorders>
+            <w:tcMar>
+              <w:top w:type="dxa" w:w="60"/>
+              <w:left w:type="dxa" w:w="100"/>
+              <w:bottom w:type="dxa" w:w="60"/>
+              <w:right w:type="dxa" w:w="100"/>
+            </w:tcMar>
+            <w:vAlign w:val="center"/>
+          </w:tcPr>
+          <w:p>
+            <w:pPr>
+              <w:spacing w:line="240"/>
+              <w:jc w:val="left"/>
+            </w:pPr>
+            <w:r>
+              <w:rPr>
+                <w:sz w:val="20"/>
+                <w:szCs w:val="20"/>
+              </w:rPr>
+              <w:t xml:space="preserve">6,885</w:t>
+            </w:r>
+          </w:p>
+        </w:tc>
+        <w:tc>
+          <w:tcPr>
+            <w:tcW w:type="dxa" w:w="1914"/>
+            <w:tcBorders>
+              <w:top w:val="single" w:color="000000" w:sz="4"/>
+              <w:left w:val="single" w:color="000000" w:sz="4"/>
+              <w:bottom w:val="single" w:color="000000" w:sz="4"/>
+              <w:right w:val="single" w:color="000000" w:sz="4"/>
+            </w:tcBorders>
+            <w:tcMar>
+              <w:top w:type="dxa" w:w="60"/>
+              <w:left w:type="dxa" w:w="100"/>
+              <w:bottom w:type="dxa" w:w="60"/>
+              <w:right w:type="dxa" w:w="100"/>
+            </w:tcMar>
+            <w:vAlign w:val="center"/>
+          </w:tcPr>
+          <w:p>
+            <w:pPr>
+              <w:spacing w:line="240"/>
+              <w:jc w:val="left"/>
+            </w:pPr>
+            <w:r>
+              <w:rPr>
+                <w:sz w:val="20"/>
+                <w:szCs w:val="20"/>
+              </w:rPr>
+              <w:t xml:space="preserve">53</w:t>
             </w:r>
           </w:p>
         </w:tc>
@@ -4647,15 +4899,7 @@
         <w:jc w:val="both"/>
       </w:pPr>
       <w:r>
-        <w:t xml:space="preserve">Con estos datos se estimarán la prevalencia no ponderada y ponderada del alto riesgo de AOS y de los síntomas depresivos clínicamente relevantes, y el número de eventos por parámetro del modelo ajustado. Se considerará adecuado un mínimo de 10 eventos por parámetro. El código de Stata para la construcción de la base y la verificación de factibilidad se presenta en el Anexo 1.</w:t>
-      </w:r>
-    </w:p>
-    <w:p>
-      <w:pPr>
-        <w:pStyle w:val="Heading2"/>
-      </w:pPr>
-      <w:r>
-        <w:t xml:space="preserve">6.7 Instrumentos y procedimientos</w:t>
+        <w:t xml:space="preserve">La población analítica quedó constituida por 6,938 participantes. La principal causa de exclusión fue la falta de un puntaje STOP-BAG válido (1,022 participantes), sobre todo por respuestas "No sabe" a la pregunta de ronquido (SLQ030), lo que podría reflejar a personas que duermen solas. La razón ingreso/pobreza no estuvo disponible en 872 participantes (12.6%), que se analizarán como una categoría propia ("no reportado") para no reducir la muestra.</w:t>
       </w:r>
     </w:p>
     <w:p>
@@ -4664,85 +4908,15 @@
         <w:jc w:val="both"/>
       </w:pPr>
       <w:r>
-        <w:t xml:space="preserve">El estudio no requiere un instrumento de recolección propio. Se usarán los cuestionarios y mediciones estandarizados de NHANES 2017–marzo 2020, administrados por el NCHS de los Centers for Disease Control and Prevention (CDC) (10). No se realizará validación de contenido ni prueba piloto, porque la información ya fue recolectada con instrumentos estandarizados cuya documentación oficial describe cada pregunta, sus códigos de respuesta y sus frecuencias (11,12).</w:t>
-      </w:r>
-    </w:p>
-    <w:p>
-      <w:pPr>
-        <w:pStyle w:val="ListParagraph"/>
-        <w:numPr>
-          <w:ilvl w:val="0"/>
-          <w:numId w:val="3"/>
-        </w:numPr>
-        <w:spacing w:after="0" w:line="480"/>
-        <w:jc w:val="left"/>
-      </w:pPr>
-      <w:r>
-        <w:t xml:space="preserve">Se descargarán los archivos públicos indicados en la sección 6.6.2 desde el repositorio oficial del CDC.</w:t>
-      </w:r>
-    </w:p>
-    <w:p>
-      <w:pPr>
-        <w:pStyle w:val="ListParagraph"/>
-        <w:numPr>
-          <w:ilvl w:val="0"/>
-          <w:numId w:val="3"/>
-        </w:numPr>
-        <w:spacing w:after="0" w:line="480"/>
-        <w:jc w:val="left"/>
-      </w:pPr>
-      <w:r>
-        <w:t xml:space="preserve">Se integrarán mediante el identificador único del participante (SEQN) y se verificarán la estructura, los códigos de respuesta y los valores perdidos.</w:t>
-      </w:r>
-    </w:p>
-    <w:p>
-      <w:pPr>
-        <w:pStyle w:val="ListParagraph"/>
-        <w:numPr>
-          <w:ilvl w:val="0"/>
-          <w:numId w:val="3"/>
-        </w:numPr>
-        <w:spacing w:after="0" w:line="480"/>
-        <w:jc w:val="left"/>
-      </w:pPr>
-      <w:r>
-        <w:t xml:space="preserve">Se construirán el puntaje STOP-BAG, el puntaje PHQ-9 y las covariables según la sección 6.5.</w:t>
-      </w:r>
-    </w:p>
-    <w:p>
-      <w:pPr>
-        <w:pStyle w:val="ListParagraph"/>
-        <w:numPr>
-          <w:ilvl w:val="0"/>
-          <w:numId w:val="3"/>
-        </w:numPr>
-        <w:spacing w:after="0" w:line="480"/>
-        <w:jc w:val="left"/>
-      </w:pPr>
-      <w:r>
-        <w:t xml:space="preserve">Se declarará el diseño muestral complejo sobre la base completa de P_DEMO, sin eliminar observaciones, y la población analítica se identificará con una variable indicadora para que la estimación de la varianza refleje el diseño completo (15).</w:t>
-      </w:r>
-    </w:p>
-    <w:p>
-      <w:pPr>
-        <w:pStyle w:val="ListParagraph"/>
-        <w:numPr>
-          <w:ilvl w:val="0"/>
-          <w:numId w:val="3"/>
-        </w:numPr>
-        <w:spacing w:after="0" w:line="480"/>
-        <w:jc w:val="left"/>
-      </w:pPr>
-      <w:r>
-        <w:t xml:space="preserve">Se realizará el análisis descriptivo, bivariado y multivariado de la sección 6.9.</w:t>
-      </w:r>
-    </w:p>
-    <w:p>
-      <w:pPr>
-        <w:pStyle w:val="Heading2"/>
-      </w:pPr>
-      <w:r>
-        <w:t xml:space="preserve">6.8 Evaluación y control del sesgo</w:t>
+        <w:t xml:space="preserve">De los 6,938 participantes, 3,222 (46.4%) tuvieron alto riesgo de AOS y 597 (8.6%) síntomas depresivos clínicamente relevantes. La prevalencia ponderada del alto riesgo de AOS fue 42.6% (IC 95%: 39.8% a 45.5%; efecto de diseño 5.31) y la de síntomas depresivos, 8.0% (IC 95%: 7.2% a 8.8%; efecto de diseño 1.56). Se usó el peso WTMECPRP, la linealización de Taylor e intervalos logit con 25 grados de libertad de diseño (24 estratos y 49 unidades primarias de muestreo). El código de Stata para la construcción de la base y la verificación de factibilidad se presenta en el Anexo 1.</w:t>
+      </w:r>
+    </w:p>
+    <w:p>
+      <w:pPr>
+        <w:pStyle w:val="Heading3"/>
+      </w:pPr>
+      <w:r>
+        <w:t xml:space="preserve">6.6.3 Distribución preliminar del desenlace y potencia exploratoria</w:t>
       </w:r>
     </w:p>
     <w:p>
@@ -4751,538 +4925,7 @@
         <w:jc w:val="both"/>
       </w:pPr>
       <w:r>
-        <w:rPr>
-          <w:b/>
-          <w:bCs/>
-        </w:rPr>
-        <w:t xml:space="preserve">Sesgo de información.</w:t>
-      </w:r>
-      <w:r>
-        <w:t xml:space="preserve"> Los síntomas de sueño, la hipertensión y los antecedentes clínicos son autorreportados, y el STOP-BAG adaptado no ha sido validado frente a la polisomnografía en NHANES. Esto puede producir una clasificación incorrecta de la exposición, probablemente no diferencial, que tendería a subestimar la asociación.</w:t>
-      </w:r>
-    </w:p>
-    <w:p>
-      <w:pPr>
-        <w:spacing w:after="160" w:line="480"/>
-        <w:jc w:val="both"/>
-      </w:pPr>
-      <w:r>
-        <w:rPr>
-          <w:b/>
-          <w:bCs/>
-        </w:rPr>
-        <w:t xml:space="preserve">Superposición de síntomas.</w:t>
-      </w:r>
-      <w:r>
-        <w:t xml:space="preserve"> La somnolencia diurna (ítem T) se parece a los ítems de problemas de sueño (DPQ030) y de cansancio (DPQ040) del PHQ-9. Para evitar que esta superposición explique la asociación, se prespecifican análisis de sensibilidad sin estos ítems (sección 6.9).</w:t>
-      </w:r>
-    </w:p>
-    <w:p>
-      <w:pPr>
-        <w:spacing w:after="160" w:line="480"/>
-        <w:jc w:val="both"/>
-      </w:pPr>
-      <w:r>
-        <w:rPr>
-          <w:b/>
-          <w:bCs/>
-        </w:rPr>
-        <w:t xml:space="preserve">Sesgo de selección y no respuesta.</w:t>
-      </w:r>
-      <w:r>
-        <w:t xml:space="preserve"> Se usarán los pesos, estratos y unidades primarias de muestreo oficiales, que incorporan la probabilidad de selección y los ajustes por no respuesta (15). Aun así, puede persistir un sesgo residual.</w:t>
-      </w:r>
-    </w:p>
-    <w:p>
-      <w:pPr>
-        <w:spacing w:after="160" w:line="480"/>
-        <w:jc w:val="both"/>
-      </w:pPr>
-      <w:r>
-        <w:rPr>
-          <w:b/>
-          <w:bCs/>
-        </w:rPr>
-        <w:t xml:space="preserve">Confusión.</w:t>
-      </w:r>
-      <w:r>
-        <w:t xml:space="preserve"> Se controlará mediante el ajuste multivariable por las covariables definidas a priori.</w:t>
-      </w:r>
-    </w:p>
-    <w:p>
-      <w:pPr>
-        <w:spacing w:after="160" w:line="480"/>
-        <w:jc w:val="both"/>
-      </w:pPr>
-      <w:r>
-        <w:rPr>
-          <w:b/>
-          <w:bCs/>
-        </w:rPr>
-        <w:t xml:space="preserve">Temporalidad.</w:t>
-      </w:r>
-      <w:r>
-        <w:t xml:space="preserve"> Por el diseño transversal, no puede establecerse la secuencia temporal entre la exposición y el desenlace; la depresión también podría aumentar la percepción de somnolencia. Los resultados se interpretarán como asociaciones y no como relaciones causales.</w:t>
-      </w:r>
-    </w:p>
-    <w:p>
-      <w:pPr>
-        <w:spacing w:after="160" w:line="480"/>
-        <w:jc w:val="both"/>
-      </w:pPr>
-      <w:r>
-        <w:rPr>
-          <w:b/>
-          <w:bCs/>
-        </w:rPr>
-        <w:t xml:space="preserve">Datos faltantes.</w:t>
-      </w:r>
-      <w:r>
-        <w:t xml:space="preserve"> El análisis principal será de casos completos. Se reportará el número de exclusiones por variable y se compararán las características de los participantes incluidos y excluidos.</w:t>
-      </w:r>
-    </w:p>
-    <w:p>
-      <w:pPr>
-        <w:pStyle w:val="Heading2"/>
-      </w:pPr>
-      <w:r>
-        <w:t xml:space="preserve">6.9 Análisis estadístico</w:t>
-      </w:r>
-    </w:p>
-    <w:p>
-      <w:pPr>
-        <w:spacing w:after="160" w:line="480"/>
-        <w:jc w:val="both"/>
-      </w:pPr>
-      <w:r>
-        <w:t xml:space="preserve">Todos los análisis se realizarán en Stata 18 (21). El diseño muestral complejo se declarará con el comando svyset, usando SDMVPSU como unidad primaria de muestreo, SDMVSTRA como estrato y WTMECPRP como peso, porque el PHQ-9 se aplicó en el MEC (15). La varianza se estimará por linealización de Taylor y todas las estimaciones se restringirán a la población analítica con la opción subpop().</w:t>
-      </w:r>
-    </w:p>
-    <w:p>
-      <w:pPr>
-        <w:spacing w:after="160" w:line="480"/>
-        <w:jc w:val="both"/>
-      </w:pPr>
-      <w:r>
-        <w:rPr>
-          <w:b/>
-          <w:bCs/>
-        </w:rPr>
-        <w:t xml:space="preserve">Análisis descriptivo.</w:t>
-      </w:r>
-      <w:r>
-        <w:t xml:space="preserve"> Para las variables cualitativas se reportarán frecuencias absolutas no ponderadas y porcentajes ponderados con su intervalo de confianza del 95% (IC 95%); para las cuantitativas, la mediana ponderada y el rango intercuartílico. La confiabilidad de cada proporción se evaluará con los estándares de presentación del NCHS (18).</w:t>
-      </w:r>
-    </w:p>
-    <w:p>
-      <w:pPr>
-        <w:spacing w:after="160" w:line="480"/>
-        <w:jc w:val="both"/>
-      </w:pPr>
-      <w:r>
-        <w:rPr>
-          <w:b/>
-          <w:bCs/>
-        </w:rPr>
-        <w:t xml:space="preserve">Análisis bivariado.</w:t>
-      </w:r>
-      <w:r>
-        <w:t xml:space="preserve"> Se compararán las características según el riesgo de AOS y la prevalencia del desenlace según cada covariable con la prueba de chi-cuadrado con corrección de Rao-Scott (19).</w:t>
-      </w:r>
-    </w:p>
-    <w:p>
-      <w:pPr>
-        <w:spacing w:after="160" w:line="480"/>
-        <w:jc w:val="both"/>
-      </w:pPr>
-      <w:r>
-        <w:rPr>
-          <w:b/>
-          <w:bCs/>
-        </w:rPr>
-        <w:t xml:space="preserve">Análisis multivariado.</w:t>
-      </w:r>
-      <w:r>
-        <w:t xml:space="preserve"> Se estimarán razones de prevalencia (RP) con IC 95% mediante regresión de Poisson con varianza robusta, recomendada para desenlaces binarios frecuentes en estudios transversales (14). Se estimará primero la RP cruda y luego un modelo ajustado por edad, sexo, raza/etnia, nivel educativo, razón ingreso/pobreza, estado civil, tabaquismo, diabetes, enfermedad cardiovascular y seguro de salud. Antes de interpretarlo se evaluará la colinealidad con el factor de inflación de la varianza en un modelo lineal auxiliar no ponderado; un valor mayor de 10 se considerará colinealidad importante.</w:t>
-      </w:r>
-    </w:p>
-    <w:p>
-      <w:pPr>
-        <w:spacing w:after="160" w:line="480"/>
-        <w:jc w:val="both"/>
-      </w:pPr>
-      <w:r>
-        <w:rPr>
-          <w:b/>
-          <w:bCs/>
-        </w:rPr>
-        <w:t xml:space="preserve">Gradiente.</w:t>
-      </w:r>
-      <w:r>
-        <w:t xml:space="preserve"> Se estimarán las RP de las categorías 3–4 y 5–7 frente a 0–2, y la tendencia se evaluará incorporando el puntaje agrupado como término ordinal (p de tendencia).</w:t>
-      </w:r>
-    </w:p>
-    <w:p>
-      <w:pPr>
-        <w:spacing w:after="160" w:line="480"/>
-        <w:jc w:val="both"/>
-      </w:pPr>
-      <w:r>
-        <w:rPr>
-          <w:b/>
-          <w:bCs/>
-        </w:rPr>
-        <w:t xml:space="preserve">Modificación del efecto.</w:t>
-      </w:r>
-      <w:r>
-        <w:t xml:space="preserve"> Se evaluará la interacción entre el riesgo de AOS y el sexo con la prueba de Wald ajustada; si es significativa, se reportarán las RP por sexo.</w:t>
-      </w:r>
-    </w:p>
-    <w:p>
-      <w:pPr>
-        <w:spacing w:after="160" w:line="480"/>
-        <w:jc w:val="both"/>
-      </w:pPr>
-      <w:r>
-        <w:rPr>
-          <w:b/>
-          <w:bCs/>
-        </w:rPr>
-        <w:t xml:space="preserve">Análisis de sensibilidad prespecificados:</w:t>
-      </w:r>
-    </w:p>
-    <w:p>
-      <w:pPr>
-        <w:pStyle w:val="ListParagraph"/>
-        <w:numPr>
-          <w:ilvl w:val="0"/>
-          <w:numId w:val="4"/>
-        </w:numPr>
-        <w:spacing w:after="0" w:line="480"/>
-        <w:jc w:val="left"/>
-      </w:pPr>
-      <w:r>
-        <w:t xml:space="preserve">Exposición sin el ítem de cansancio (STOP-BAG sin T, 0 a 6 puntos, alto riesgo ≥ 3).</w:t>
-      </w:r>
-    </w:p>
-    <w:p>
-      <w:pPr>
-        <w:pStyle w:val="ListParagraph"/>
-        <w:numPr>
-          <w:ilvl w:val="0"/>
-          <w:numId w:val="4"/>
-        </w:numPr>
-        <w:spacing w:after="0" w:line="480"/>
-        <w:jc w:val="left"/>
-      </w:pPr>
-      <w:r>
-        <w:t xml:space="preserve">Desenlace con el puntaje PHQ-9 sin los ítems de sueño y cansancio (DPQ030 y DPQ040), analizado como variable continua mediante regresión lineal.</w:t>
-      </w:r>
-    </w:p>
-    <w:p>
-      <w:pPr>
-        <w:pStyle w:val="ListParagraph"/>
-        <w:numPr>
-          <w:ilvl w:val="0"/>
-          <w:numId w:val="4"/>
-        </w:numPr>
-        <w:spacing w:after="0" w:line="480"/>
-        <w:jc w:val="left"/>
-      </w:pPr>
-      <w:r>
-        <w:t xml:space="preserve">Desenlace con el PHQ-8 ≥ 10 (sin el ítem de ideación suicida), versión validada para estudios poblacionales (17).</w:t>
-      </w:r>
-    </w:p>
-    <w:p>
-      <w:pPr>
-        <w:pStyle w:val="ListParagraph"/>
-        <w:numPr>
-          <w:ilvl w:val="0"/>
-          <w:numId w:val="4"/>
-        </w:numPr>
-        <w:spacing w:after="0" w:line="480"/>
-        <w:jc w:val="left"/>
-      </w:pPr>
-      <w:r>
-        <w:t xml:space="preserve">Exposición definida solo por síntomas nocturnos: ronquido o resoplidos/pausas respiratorias 3 o más noches por semana.</w:t>
-      </w:r>
-    </w:p>
-    <w:p>
-      <w:pPr>
-        <w:pStyle w:val="ListParagraph"/>
-        <w:numPr>
-          <w:ilvl w:val="0"/>
-          <w:numId w:val="4"/>
-        </w:numPr>
-        <w:spacing w:after="0" w:line="480"/>
-        <w:jc w:val="left"/>
-      </w:pPr>
-      <w:r>
-        <w:t xml:space="preserve">Modelo principal con ajuste adicional por categorías de IMC.</w:t>
-      </w:r>
-    </w:p>
-    <w:p>
-      <w:pPr>
-        <w:spacing w:after="160" w:line="480"/>
-        <w:jc w:val="both"/>
-      </w:pPr>
-      <w:r>
-        <w:t xml:space="preserve">El nivel de significancia será p &lt; 0.05 (bilateral). Los resultados se reportarán según la guía STROBE (13) y se interpretarán como asociaciones.</w:t>
-      </w:r>
-    </w:p>
-    <w:p>
-      <w:pPr>
-        <w:pStyle w:val="Heading1"/>
-      </w:pPr>
-      <w:r>
-        <w:t xml:space="preserve">7. ASPECTOS ÉTICOS</w:t>
-      </w:r>
-    </w:p>
-    <w:p>
-      <w:pPr>
-        <w:spacing w:after="160" w:line="480"/>
-        <w:jc w:val="both"/>
-      </w:pPr>
-      <w:r>
-        <w:t xml:space="preserve">El estudio es un análisis secundario de archivos públicos, anonimizados y de libre acceso de NHANES 2017–marzo 2020, que no contienen identificadores personales. El protocolo de NHANES fue aprobado por el NCHS Ethics Review Board y la recolección original incluyó el consentimiento informado de los participantes (20). Los investigadores no tendrán contacto con los participantes ni realizarán una nueva recolección de información, por lo que no se solicitará un nuevo consentimiento informado.</w:t>
-      </w:r>
-    </w:p>
-    <w:p>
-      <w:pPr>
-        <w:spacing w:after="160" w:line="480"/>
-        <w:jc w:val="both"/>
-      </w:pPr>
-      <w:r>
-        <w:t xml:space="preserve">El protocolo será presentado al Subcomité de Ética en Investigación de la Facultad de Ciencias de la Salud de la Universidad Peruana de Ciencias Aplicadas, según los procedimientos institucionales vigentes para Tesis 2. Los resultados se presentarán de manera agregada, sin posibilidad de identificación individual. Los investigadores declaran no tener conflictos de interés y el estudio no cuenta con financiamiento externo.</w:t>
-      </w:r>
-    </w:p>
-    <w:p>
-      <w:pPr>
-        <w:pStyle w:val="Heading1"/>
-      </w:pPr>
-      <w:r>
-        <w:t xml:space="preserve">8. FORTALEZAS</w:t>
-      </w:r>
-    </w:p>
-    <w:p>
-      <w:pPr>
-        <w:pStyle w:val="ListParagraph"/>
-        <w:numPr>
-          <w:ilvl w:val="0"/>
-          <w:numId w:val="2"/>
-        </w:numPr>
-        <w:spacing w:after="0" w:line="480"/>
-        <w:jc w:val="both"/>
-      </w:pPr>
-      <w:r>
-        <w:t xml:space="preserve">Usa una muestra nacional con diseño probabilístico complejo, que permite obtener estimaciones representativas de la población civil no institucionalizada de Estados Unidos.</w:t>
-      </w:r>
-    </w:p>
-    <w:p>
-      <w:pPr>
-        <w:pStyle w:val="ListParagraph"/>
-        <w:numPr>
-          <w:ilvl w:val="0"/>
-          <w:numId w:val="2"/>
-        </w:numPr>
-        <w:spacing w:after="0" w:line="480"/>
-        <w:jc w:val="both"/>
-      </w:pPr>
-      <w:r>
-        <w:t xml:space="preserve">El desenlace se mide con el PHQ-9, un instrumento validado y ampliamente usado (4).</w:t>
-      </w:r>
-    </w:p>
-    <w:p>
-      <w:pPr>
-        <w:pStyle w:val="ListParagraph"/>
-        <w:numPr>
-          <w:ilvl w:val="0"/>
-          <w:numId w:val="2"/>
-        </w:numPr>
-        <w:spacing w:after="0" w:line="480"/>
-        <w:jc w:val="both"/>
-      </w:pPr>
-      <w:r>
-        <w:t xml:space="preserve">Emplea un puntaje compuesto de tamizaje basado en el STOP-BANG, en lugar de síntomas aislados, lo que lo acerca a la práctica clínica (9).</w:t>
-      </w:r>
-    </w:p>
-    <w:p>
-      <w:pPr>
-        <w:pStyle w:val="ListParagraph"/>
-        <w:numPr>
-          <w:ilvl w:val="0"/>
-          <w:numId w:val="2"/>
-        </w:numPr>
-        <w:spacing w:after="0" w:line="480"/>
-        <w:jc w:val="both"/>
-      </w:pPr>
-      <w:r>
-        <w:t xml:space="preserve">Incluye análisis de sensibilidad prespecificados para controlar la superposición de síntomas entre la exposición y el desenlace.</w:t>
-      </w:r>
-    </w:p>
-    <w:p>
-      <w:pPr>
-        <w:pStyle w:val="ListParagraph"/>
-        <w:numPr>
-          <w:ilvl w:val="0"/>
-          <w:numId w:val="2"/>
-        </w:numPr>
-        <w:spacing w:after="0" w:line="480"/>
-        <w:jc w:val="both"/>
-      </w:pPr>
-      <w:r>
-        <w:t xml:space="preserve">La factibilidad se verificará con los datos reales antes del análisis final.</w:t>
-      </w:r>
-    </w:p>
-    <w:p>
-      <w:pPr>
-        <w:pStyle w:val="Heading1"/>
-      </w:pPr>
-      <w:r>
-        <w:t xml:space="preserve">9. LIMITACIONES</w:t>
-      </w:r>
-    </w:p>
-    <w:p>
-      <w:pPr>
-        <w:pStyle w:val="ListParagraph"/>
-        <w:numPr>
-          <w:ilvl w:val="0"/>
-          <w:numId w:val="2"/>
-        </w:numPr>
-        <w:spacing w:after="0" w:line="480"/>
-        <w:jc w:val="both"/>
-      </w:pPr>
-      <w:r>
-        <w:rPr>
-          <w:b/>
-          <w:bCs/>
-        </w:rPr>
-        <w:t xml:space="preserve">Validez externa:</w:t>
-      </w:r>
-      <w:r>
-        <w:t xml:space="preserve"> los resultados serán generalizables a la población de Estados Unidos y no directamente a la población peruana.</w:t>
-      </w:r>
-    </w:p>
-    <w:p>
-      <w:pPr>
-        <w:pStyle w:val="ListParagraph"/>
-        <w:numPr>
-          <w:ilvl w:val="0"/>
-          <w:numId w:val="2"/>
-        </w:numPr>
-        <w:spacing w:after="0" w:line="480"/>
-        <w:jc w:val="both"/>
-      </w:pPr>
-      <w:r>
-        <w:rPr>
-          <w:b/>
-          <w:bCs/>
-        </w:rPr>
-        <w:t xml:space="preserve">Exposición indirecta:</w:t>
-      </w:r>
-      <w:r>
-        <w:t xml:space="preserve"> el STOP-BAG adaptado no incluye la circunferencia de cuello ni confirma la AOS con polisomnografía; mide riesgo, no diagnóstico.</w:t>
-      </w:r>
-    </w:p>
-    <w:p>
-      <w:pPr>
-        <w:pStyle w:val="ListParagraph"/>
-        <w:numPr>
-          <w:ilvl w:val="0"/>
-          <w:numId w:val="2"/>
-        </w:numPr>
-        <w:spacing w:after="0" w:line="480"/>
-        <w:jc w:val="both"/>
-      </w:pPr>
-      <w:r>
-        <w:rPr>
-          <w:b/>
-          <w:bCs/>
-        </w:rPr>
-        <w:t xml:space="preserve">Diseño transversal:</w:t>
-      </w:r>
-      <w:r>
-        <w:t xml:space="preserve"> no permite establecer causalidad ni la dirección de la asociación.</w:t>
-      </w:r>
-    </w:p>
-    <w:p>
-      <w:pPr>
-        <w:pStyle w:val="ListParagraph"/>
-        <w:numPr>
-          <w:ilvl w:val="0"/>
-          <w:numId w:val="2"/>
-        </w:numPr>
-        <w:spacing w:after="0" w:line="480"/>
-        <w:jc w:val="both"/>
-      </w:pPr>
-      <w:r>
-        <w:rPr>
-          <w:b/>
-          <w:bCs/>
-        </w:rPr>
-        <w:t xml:space="preserve">Autorreporte:</w:t>
-      </w:r>
-      <w:r>
-        <w:t xml:space="preserve"> varios datos dependen del recuerdo de los participantes.</w:t>
-      </w:r>
-    </w:p>
-    <w:p>
-      <w:pPr>
-        <w:pStyle w:val="ListParagraph"/>
-        <w:numPr>
-          <w:ilvl w:val="0"/>
-          <w:numId w:val="2"/>
-        </w:numPr>
-        <w:spacing w:after="0" w:line="480"/>
-        <w:jc w:val="both"/>
-      </w:pPr>
-      <w:r>
-        <w:rPr>
-          <w:b/>
-          <w:bCs/>
-        </w:rPr>
-        <w:t xml:space="preserve">Confusión residual:</w:t>
-      </w:r>
-      <w:r>
-        <w:t xml:space="preserve"> no se ajustará por el uso de antidepresivos, hipnóticos ni por actividad física, que podrían influir en ambas variables.</w:t>
-      </w:r>
-    </w:p>
-    <w:p>
-      <w:pPr>
-        <w:pStyle w:val="ListParagraph"/>
-        <w:numPr>
-          <w:ilvl w:val="0"/>
-          <w:numId w:val="2"/>
-        </w:numPr>
-        <w:spacing w:after="0" w:line="480"/>
-        <w:jc w:val="both"/>
-      </w:pPr>
-      <w:r>
-        <w:rPr>
-          <w:b/>
-          <w:bCs/>
-        </w:rPr>
-        <w:t xml:space="preserve">Antigüedad relativa:</w:t>
-      </w:r>
-      <w:r>
-        <w:t xml:space="preserve"> los datos son previos a la pandemia de COVID-19, que pudo modificar la prevalencia de síntomas depresivos.</w:t>
-      </w:r>
-    </w:p>
-    <w:p>
-      <w:pPr>
-        <w:pStyle w:val="Heading1"/>
-      </w:pPr>
-      <w:r>
-        <w:t xml:space="preserve">10. CRONOGRAMA Y PRESUPUESTO</w:t>
-      </w:r>
-    </w:p>
-    <w:p>
-      <w:pPr>
-        <w:spacing w:after="160" w:line="480"/>
-        <w:jc w:val="both"/>
-      </w:pPr>
-      <w:r>
-        <w:t xml:space="preserve">El estudio puede completarse en cuatro meses, con la base de datos lista para febrero de 2027.</w:t>
+        <w:t xml:space="preserve">De manera preliminar, la comparación no ponderada del desenlace según la exposición mostró la siguiente distribución:</w:t>
       </w:r>
     </w:p>
     <w:tbl>
@@ -5298,11 +4941,11 @@
         </w:tblBorders>
       </w:tblPr>
       <w:tblGrid>
-        <w:gridCol w:w="5742"/>
-        <w:gridCol w:w="761"/>
-        <w:gridCol w:w="761"/>
-        <w:gridCol w:w="761"/>
-        <w:gridCol w:w="762"/>
+        <w:gridCol w:w="3073"/>
+        <w:gridCol w:w="1428"/>
+        <w:gridCol w:w="1428"/>
+        <w:gridCol w:w="1428"/>
+        <w:gridCol w:w="1430"/>
       </w:tblGrid>
       <w:tr>
         <w:trPr>
@@ -5311,7 +4954,7 @@
         </w:trPr>
         <w:tc>
           <w:tcPr>
-            <w:tcW w:type="dxa" w:w="5742"/>
+            <w:tcW w:type="dxa" w:w="3073"/>
             <w:tcBorders>
               <w:top w:val="single" w:color="000000" w:sz="4"/>
               <w:left w:val="single" w:color="000000" w:sz="4"/>
@@ -5339,13 +4982,13 @@
                 <w:sz w:val="20"/>
                 <w:szCs w:val="20"/>
               </w:rPr>
-              <w:t xml:space="preserve">Actividad</w:t>
-            </w:r>
-          </w:p>
-        </w:tc>
-        <w:tc>
-          <w:tcPr>
-            <w:tcW w:type="dxa" w:w="761"/>
+              <w:t xml:space="preserve">Grupo</w:t>
+            </w:r>
+          </w:p>
+        </w:tc>
+        <w:tc>
+          <w:tcPr>
+            <w:tcW w:type="dxa" w:w="1428"/>
             <w:tcBorders>
               <w:top w:val="single" w:color="000000" w:sz="4"/>
               <w:left w:val="single" w:color="000000" w:sz="4"/>
@@ -5373,13 +5016,13 @@
                 <w:sz w:val="20"/>
                 <w:szCs w:val="20"/>
               </w:rPr>
-              <w:t xml:space="preserve">Nov 2026</w:t>
-            </w:r>
-          </w:p>
-        </w:tc>
-        <w:tc>
-          <w:tcPr>
-            <w:tcW w:type="dxa" w:w="761"/>
+              <w:t xml:space="preserve">n</w:t>
+            </w:r>
+          </w:p>
+        </w:tc>
+        <w:tc>
+          <w:tcPr>
+            <w:tcW w:type="dxa" w:w="1428"/>
             <w:tcBorders>
               <w:top w:val="single" w:color="000000" w:sz="4"/>
               <w:left w:val="single" w:color="000000" w:sz="4"/>
@@ -5407,13 +5050,13 @@
                 <w:sz w:val="20"/>
                 <w:szCs w:val="20"/>
               </w:rPr>
-              <w:t xml:space="preserve">Dic 2026</w:t>
-            </w:r>
-          </w:p>
-        </w:tc>
-        <w:tc>
-          <w:tcPr>
-            <w:tcW w:type="dxa" w:w="761"/>
+              <w:t xml:space="preserve">Casos (PHQ-9 ≥ 10)</w:t>
+            </w:r>
+          </w:p>
+        </w:tc>
+        <w:tc>
+          <w:tcPr>
+            <w:tcW w:type="dxa" w:w="1428"/>
             <w:tcBorders>
               <w:top w:val="single" w:color="000000" w:sz="4"/>
               <w:left w:val="single" w:color="000000" w:sz="4"/>
@@ -5441,13 +5084,13 @@
                 <w:sz w:val="20"/>
                 <w:szCs w:val="20"/>
               </w:rPr>
-              <w:t xml:space="preserve">Ene 2027</w:t>
-            </w:r>
-          </w:p>
-        </w:tc>
-        <w:tc>
-          <w:tcPr>
-            <w:tcW w:type="dxa" w:w="762"/>
+              <w:t xml:space="preserve">Prevalencia</w:t>
+            </w:r>
+          </w:p>
+        </w:tc>
+        <w:tc>
+          <w:tcPr>
+            <w:tcW w:type="dxa" w:w="1430"/>
             <w:tcBorders>
               <w:top w:val="single" w:color="000000" w:sz="4"/>
               <w:left w:val="single" w:color="000000" w:sz="4"/>
@@ -5475,7 +5118,7 @@
                 <w:sz w:val="20"/>
                 <w:szCs w:val="20"/>
               </w:rPr>
-              <w:t xml:space="preserve">Feb 2027</w:t>
+              <w:t xml:space="preserve">RP cruda</w:t>
             </w:r>
           </w:p>
         </w:tc>
@@ -5487,136 +5130,157 @@
         </w:trPr>
         <w:tc>
           <w:tcPr>
-            <w:tcW w:type="dxa" w:w="5742"/>
-            <w:tcBorders>
-              <w:top w:val="single" w:color="000000" w:sz="4"/>
-              <w:left w:val="single" w:color="000000" w:sz="4"/>
-              <w:bottom w:val="single" w:color="000000" w:sz="4"/>
-              <w:right w:val="single" w:color="000000" w:sz="4"/>
-            </w:tcBorders>
-            <w:tcMar>
-              <w:top w:type="dxa" w:w="60"/>
-              <w:left w:type="dxa" w:w="100"/>
-              <w:bottom w:type="dxa" w:w="60"/>
-              <w:right w:type="dxa" w:w="100"/>
-            </w:tcMar>
-            <w:vAlign w:val="center"/>
-          </w:tcPr>
-          <w:p>
-            <w:pPr>
-              <w:spacing w:line="240"/>
-              <w:jc w:val="left"/>
-            </w:pPr>
-            <w:r>
-              <w:rPr>
-                <w:sz w:val="20"/>
-                <w:szCs w:val="20"/>
-              </w:rPr>
-              <w:t xml:space="preserve">Revisión del protocolo con el asesor y aprobación del cambio de tema</w:t>
-            </w:r>
-          </w:p>
-        </w:tc>
-        <w:tc>
-          <w:tcPr>
-            <w:tcW w:type="dxa" w:w="761"/>
-            <w:tcBorders>
-              <w:top w:val="single" w:color="000000" w:sz="4"/>
-              <w:left w:val="single" w:color="000000" w:sz="4"/>
-              <w:bottom w:val="single" w:color="000000" w:sz="4"/>
-              <w:right w:val="single" w:color="000000" w:sz="4"/>
-            </w:tcBorders>
-            <w:tcMar>
-              <w:top w:type="dxa" w:w="60"/>
-              <w:left w:type="dxa" w:w="100"/>
-              <w:bottom w:type="dxa" w:w="60"/>
-              <w:right w:type="dxa" w:w="100"/>
-            </w:tcMar>
-            <w:vAlign w:val="center"/>
-          </w:tcPr>
-          <w:p>
-            <w:pPr>
-              <w:spacing w:line="240"/>
-              <w:jc w:val="center"/>
-            </w:pPr>
-            <w:r>
-              <w:rPr>
-                <w:sz w:val="20"/>
-                <w:szCs w:val="20"/>
-              </w:rPr>
-              <w:t xml:space="preserve">X</w:t>
-            </w:r>
-          </w:p>
-        </w:tc>
-        <w:tc>
-          <w:tcPr>
-            <w:tcW w:type="dxa" w:w="761"/>
-            <w:tcBorders>
-              <w:top w:val="single" w:color="000000" w:sz="4"/>
-              <w:left w:val="single" w:color="000000" w:sz="4"/>
-              <w:bottom w:val="single" w:color="000000" w:sz="4"/>
-              <w:right w:val="single" w:color="000000" w:sz="4"/>
-            </w:tcBorders>
-            <w:tcMar>
-              <w:top w:type="dxa" w:w="60"/>
-              <w:left w:type="dxa" w:w="100"/>
-              <w:bottom w:type="dxa" w:w="60"/>
-              <w:right w:type="dxa" w:w="100"/>
-            </w:tcMar>
-            <w:vAlign w:val="center"/>
-          </w:tcPr>
-          <w:p>
-            <w:pPr>
-              <w:spacing w:line="240"/>
-              <w:jc w:val="left"/>
-            </w:pPr>
-          </w:p>
-        </w:tc>
-        <w:tc>
-          <w:tcPr>
-            <w:tcW w:type="dxa" w:w="761"/>
-            <w:tcBorders>
-              <w:top w:val="single" w:color="000000" w:sz="4"/>
-              <w:left w:val="single" w:color="000000" w:sz="4"/>
-              <w:bottom w:val="single" w:color="000000" w:sz="4"/>
-              <w:right w:val="single" w:color="000000" w:sz="4"/>
-            </w:tcBorders>
-            <w:tcMar>
-              <w:top w:type="dxa" w:w="60"/>
-              <w:left w:type="dxa" w:w="100"/>
-              <w:bottom w:type="dxa" w:w="60"/>
-              <w:right w:type="dxa" w:w="100"/>
-            </w:tcMar>
-            <w:vAlign w:val="center"/>
-          </w:tcPr>
-          <w:p>
-            <w:pPr>
-              <w:spacing w:line="240"/>
-              <w:jc w:val="left"/>
-            </w:pPr>
-          </w:p>
-        </w:tc>
-        <w:tc>
-          <w:tcPr>
-            <w:tcW w:type="dxa" w:w="762"/>
-            <w:tcBorders>
-              <w:top w:val="single" w:color="000000" w:sz="4"/>
-              <w:left w:val="single" w:color="000000" w:sz="4"/>
-              <w:bottom w:val="single" w:color="000000" w:sz="4"/>
-              <w:right w:val="single" w:color="000000" w:sz="4"/>
-            </w:tcBorders>
-            <w:tcMar>
-              <w:top w:type="dxa" w:w="60"/>
-              <w:left w:type="dxa" w:w="100"/>
-              <w:bottom w:type="dxa" w:w="60"/>
-              <w:right w:type="dxa" w:w="100"/>
-            </w:tcMar>
-            <w:vAlign w:val="center"/>
-          </w:tcPr>
-          <w:p>
-            <w:pPr>
-              <w:spacing w:line="240"/>
-              <w:jc w:val="left"/>
-            </w:pPr>
+            <w:tcW w:type="dxa" w:w="3073"/>
+            <w:tcBorders>
+              <w:top w:val="single" w:color="000000" w:sz="4"/>
+              <w:left w:val="single" w:color="000000" w:sz="4"/>
+              <w:bottom w:val="single" w:color="000000" w:sz="4"/>
+              <w:right w:val="single" w:color="000000" w:sz="4"/>
+            </w:tcBorders>
+            <w:tcMar>
+              <w:top w:type="dxa" w:w="60"/>
+              <w:left w:type="dxa" w:w="100"/>
+              <w:bottom w:type="dxa" w:w="60"/>
+              <w:right w:type="dxa" w:w="100"/>
+            </w:tcMar>
+            <w:vAlign w:val="center"/>
+          </w:tcPr>
+          <w:p>
+            <w:pPr>
+              <w:spacing w:line="240"/>
+              <w:jc w:val="left"/>
+            </w:pPr>
+            <w:r>
+              <w:rPr>
+                <w:sz w:val="20"/>
+                <w:szCs w:val="20"/>
+              </w:rPr>
+              <w:t xml:space="preserve">Alto riesgo de AOS (STOP-BAG ≥ 3)</w:t>
+            </w:r>
+          </w:p>
+        </w:tc>
+        <w:tc>
+          <w:tcPr>
+            <w:tcW w:type="dxa" w:w="1428"/>
+            <w:tcBorders>
+              <w:top w:val="single" w:color="000000" w:sz="4"/>
+              <w:left w:val="single" w:color="000000" w:sz="4"/>
+              <w:bottom w:val="single" w:color="000000" w:sz="4"/>
+              <w:right w:val="single" w:color="000000" w:sz="4"/>
+            </w:tcBorders>
+            <w:tcMar>
+              <w:top w:type="dxa" w:w="60"/>
+              <w:left w:type="dxa" w:w="100"/>
+              <w:bottom w:type="dxa" w:w="60"/>
+              <w:right w:type="dxa" w:w="100"/>
+            </w:tcMar>
+            <w:vAlign w:val="center"/>
+          </w:tcPr>
+          <w:p>
+            <w:pPr>
+              <w:spacing w:line="240"/>
+              <w:jc w:val="left"/>
+            </w:pPr>
+            <w:r>
+              <w:rPr>
+                <w:sz w:val="20"/>
+                <w:szCs w:val="20"/>
+              </w:rPr>
+              <w:t xml:space="preserve">3,222</w:t>
+            </w:r>
+          </w:p>
+        </w:tc>
+        <w:tc>
+          <w:tcPr>
+            <w:tcW w:type="dxa" w:w="1428"/>
+            <w:tcBorders>
+              <w:top w:val="single" w:color="000000" w:sz="4"/>
+              <w:left w:val="single" w:color="000000" w:sz="4"/>
+              <w:bottom w:val="single" w:color="000000" w:sz="4"/>
+              <w:right w:val="single" w:color="000000" w:sz="4"/>
+            </w:tcBorders>
+            <w:tcMar>
+              <w:top w:type="dxa" w:w="60"/>
+              <w:left w:type="dxa" w:w="100"/>
+              <w:bottom w:type="dxa" w:w="60"/>
+              <w:right w:type="dxa" w:w="100"/>
+            </w:tcMar>
+            <w:vAlign w:val="center"/>
+          </w:tcPr>
+          <w:p>
+            <w:pPr>
+              <w:spacing w:line="240"/>
+              <w:jc w:val="left"/>
+            </w:pPr>
+            <w:r>
+              <w:rPr>
+                <w:sz w:val="20"/>
+                <w:szCs w:val="20"/>
+              </w:rPr>
+              <w:t xml:space="preserve">383</w:t>
+            </w:r>
+          </w:p>
+        </w:tc>
+        <w:tc>
+          <w:tcPr>
+            <w:tcW w:type="dxa" w:w="1428"/>
+            <w:tcBorders>
+              <w:top w:val="single" w:color="000000" w:sz="4"/>
+              <w:left w:val="single" w:color="000000" w:sz="4"/>
+              <w:bottom w:val="single" w:color="000000" w:sz="4"/>
+              <w:right w:val="single" w:color="000000" w:sz="4"/>
+            </w:tcBorders>
+            <w:tcMar>
+              <w:top w:type="dxa" w:w="60"/>
+              <w:left w:type="dxa" w:w="100"/>
+              <w:bottom w:type="dxa" w:w="60"/>
+              <w:right w:type="dxa" w:w="100"/>
+            </w:tcMar>
+            <w:vAlign w:val="center"/>
+          </w:tcPr>
+          <w:p>
+            <w:pPr>
+              <w:spacing w:line="240"/>
+              <w:jc w:val="left"/>
+            </w:pPr>
+            <w:r>
+              <w:rPr>
+                <w:sz w:val="20"/>
+                <w:szCs w:val="20"/>
+              </w:rPr>
+              <w:t xml:space="preserve">11.9%</w:t>
+            </w:r>
+          </w:p>
+        </w:tc>
+        <w:tc>
+          <w:tcPr>
+            <w:tcW w:type="dxa" w:w="1430"/>
+            <w:tcBorders>
+              <w:top w:val="single" w:color="000000" w:sz="4"/>
+              <w:left w:val="single" w:color="000000" w:sz="4"/>
+              <w:bottom w:val="single" w:color="000000" w:sz="4"/>
+              <w:right w:val="single" w:color="000000" w:sz="4"/>
+            </w:tcBorders>
+            <w:tcMar>
+              <w:top w:type="dxa" w:w="60"/>
+              <w:left w:type="dxa" w:w="100"/>
+              <w:bottom w:type="dxa" w:w="60"/>
+              <w:right w:type="dxa" w:w="100"/>
+            </w:tcMar>
+            <w:vAlign w:val="center"/>
+          </w:tcPr>
+          <w:p>
+            <w:pPr>
+              <w:spacing w:line="240"/>
+              <w:jc w:val="left"/>
+            </w:pPr>
+            <w:r>
+              <w:rPr>
+                <w:sz w:val="20"/>
+                <w:szCs w:val="20"/>
+              </w:rPr>
+              <w:t xml:space="preserve">2.06</w:t>
+            </w:r>
           </w:p>
         </w:tc>
       </w:tr>
@@ -5627,143 +5291,1012 @@
         </w:trPr>
         <w:tc>
           <w:tcPr>
-            <w:tcW w:type="dxa" w:w="5742"/>
-            <w:tcBorders>
-              <w:top w:val="single" w:color="000000" w:sz="4"/>
-              <w:left w:val="single" w:color="000000" w:sz="4"/>
-              <w:bottom w:val="single" w:color="000000" w:sz="4"/>
-              <w:right w:val="single" w:color="000000" w:sz="4"/>
-            </w:tcBorders>
-            <w:tcMar>
-              <w:top w:type="dxa" w:w="60"/>
-              <w:left w:type="dxa" w:w="100"/>
-              <w:bottom w:type="dxa" w:w="60"/>
-              <w:right w:type="dxa" w:w="100"/>
-            </w:tcMar>
-            <w:vAlign w:val="center"/>
-          </w:tcPr>
-          <w:p>
-            <w:pPr>
-              <w:spacing w:line="240"/>
-              <w:jc w:val="left"/>
-            </w:pPr>
-            <w:r>
-              <w:rPr>
-                <w:sz w:val="20"/>
-                <w:szCs w:val="20"/>
-              </w:rPr>
-              <w:t xml:space="preserve">Presentación y aprobación del Subcomité de Ética de la UPC</w:t>
-            </w:r>
-          </w:p>
-        </w:tc>
-        <w:tc>
-          <w:tcPr>
-            <w:tcW w:type="dxa" w:w="761"/>
-            <w:tcBorders>
-              <w:top w:val="single" w:color="000000" w:sz="4"/>
-              <w:left w:val="single" w:color="000000" w:sz="4"/>
-              <w:bottom w:val="single" w:color="000000" w:sz="4"/>
-              <w:right w:val="single" w:color="000000" w:sz="4"/>
-            </w:tcBorders>
-            <w:tcMar>
-              <w:top w:type="dxa" w:w="60"/>
-              <w:left w:type="dxa" w:w="100"/>
-              <w:bottom w:type="dxa" w:w="60"/>
-              <w:right w:type="dxa" w:w="100"/>
-            </w:tcMar>
-            <w:vAlign w:val="center"/>
-          </w:tcPr>
-          <w:p>
-            <w:pPr>
-              <w:spacing w:line="240"/>
-              <w:jc w:val="center"/>
-            </w:pPr>
-            <w:r>
-              <w:rPr>
-                <w:sz w:val="20"/>
-                <w:szCs w:val="20"/>
-              </w:rPr>
-              <w:t xml:space="preserve">X</w:t>
-            </w:r>
-          </w:p>
-        </w:tc>
-        <w:tc>
-          <w:tcPr>
-            <w:tcW w:type="dxa" w:w="761"/>
-            <w:tcBorders>
-              <w:top w:val="single" w:color="000000" w:sz="4"/>
-              <w:left w:val="single" w:color="000000" w:sz="4"/>
-              <w:bottom w:val="single" w:color="000000" w:sz="4"/>
-              <w:right w:val="single" w:color="000000" w:sz="4"/>
-            </w:tcBorders>
-            <w:tcMar>
-              <w:top w:type="dxa" w:w="60"/>
-              <w:left w:type="dxa" w:w="100"/>
-              <w:bottom w:type="dxa" w:w="60"/>
-              <w:right w:type="dxa" w:w="100"/>
-            </w:tcMar>
-            <w:vAlign w:val="center"/>
-          </w:tcPr>
-          <w:p>
-            <w:pPr>
-              <w:spacing w:line="240"/>
-              <w:jc w:val="center"/>
-            </w:pPr>
-            <w:r>
-              <w:rPr>
-                <w:sz w:val="20"/>
-                <w:szCs w:val="20"/>
-              </w:rPr>
-              <w:t xml:space="preserve">X</w:t>
-            </w:r>
-          </w:p>
-        </w:tc>
-        <w:tc>
-          <w:tcPr>
-            <w:tcW w:type="dxa" w:w="761"/>
-            <w:tcBorders>
-              <w:top w:val="single" w:color="000000" w:sz="4"/>
-              <w:left w:val="single" w:color="000000" w:sz="4"/>
-              <w:bottom w:val="single" w:color="000000" w:sz="4"/>
-              <w:right w:val="single" w:color="000000" w:sz="4"/>
-            </w:tcBorders>
-            <w:tcMar>
-              <w:top w:type="dxa" w:w="60"/>
-              <w:left w:type="dxa" w:w="100"/>
-              <w:bottom w:type="dxa" w:w="60"/>
-              <w:right w:type="dxa" w:w="100"/>
-            </w:tcMar>
-            <w:vAlign w:val="center"/>
-          </w:tcPr>
-          <w:p>
-            <w:pPr>
-              <w:spacing w:line="240"/>
-              <w:jc w:val="left"/>
-            </w:pPr>
-          </w:p>
-        </w:tc>
-        <w:tc>
-          <w:tcPr>
-            <w:tcW w:type="dxa" w:w="762"/>
-            <w:tcBorders>
-              <w:top w:val="single" w:color="000000" w:sz="4"/>
-              <w:left w:val="single" w:color="000000" w:sz="4"/>
-              <w:bottom w:val="single" w:color="000000" w:sz="4"/>
-              <w:right w:val="single" w:color="000000" w:sz="4"/>
-            </w:tcBorders>
-            <w:tcMar>
-              <w:top w:type="dxa" w:w="60"/>
-              <w:left w:type="dxa" w:w="100"/>
-              <w:bottom w:type="dxa" w:w="60"/>
-              <w:right w:type="dxa" w:w="100"/>
-            </w:tcMar>
-            <w:vAlign w:val="center"/>
-          </w:tcPr>
-          <w:p>
-            <w:pPr>
-              <w:spacing w:line="240"/>
-              <w:jc w:val="left"/>
-            </w:pPr>
+            <w:tcW w:type="dxa" w:w="3073"/>
+            <w:tcBorders>
+              <w:top w:val="single" w:color="000000" w:sz="4"/>
+              <w:left w:val="single" w:color="000000" w:sz="4"/>
+              <w:bottom w:val="single" w:color="000000" w:sz="4"/>
+              <w:right w:val="single" w:color="000000" w:sz="4"/>
+            </w:tcBorders>
+            <w:tcMar>
+              <w:top w:type="dxa" w:w="60"/>
+              <w:left w:type="dxa" w:w="100"/>
+              <w:bottom w:type="dxa" w:w="60"/>
+              <w:right w:type="dxa" w:w="100"/>
+            </w:tcMar>
+            <w:vAlign w:val="center"/>
+          </w:tcPr>
+          <w:p>
+            <w:pPr>
+              <w:spacing w:line="240"/>
+              <w:jc w:val="left"/>
+            </w:pPr>
+            <w:r>
+              <w:rPr>
+                <w:sz w:val="20"/>
+                <w:szCs w:val="20"/>
+              </w:rPr>
+              <w:t xml:space="preserve">Bajo riesgo de AOS (STOP-BAG 0–2)</w:t>
+            </w:r>
+          </w:p>
+        </w:tc>
+        <w:tc>
+          <w:tcPr>
+            <w:tcW w:type="dxa" w:w="1428"/>
+            <w:tcBorders>
+              <w:top w:val="single" w:color="000000" w:sz="4"/>
+              <w:left w:val="single" w:color="000000" w:sz="4"/>
+              <w:bottom w:val="single" w:color="000000" w:sz="4"/>
+              <w:right w:val="single" w:color="000000" w:sz="4"/>
+            </w:tcBorders>
+            <w:tcMar>
+              <w:top w:type="dxa" w:w="60"/>
+              <w:left w:type="dxa" w:w="100"/>
+              <w:bottom w:type="dxa" w:w="60"/>
+              <w:right w:type="dxa" w:w="100"/>
+            </w:tcMar>
+            <w:vAlign w:val="center"/>
+          </w:tcPr>
+          <w:p>
+            <w:pPr>
+              <w:spacing w:line="240"/>
+              <w:jc w:val="left"/>
+            </w:pPr>
+            <w:r>
+              <w:rPr>
+                <w:sz w:val="20"/>
+                <w:szCs w:val="20"/>
+              </w:rPr>
+              <w:t xml:space="preserve">3,716</w:t>
+            </w:r>
+          </w:p>
+        </w:tc>
+        <w:tc>
+          <w:tcPr>
+            <w:tcW w:type="dxa" w:w="1428"/>
+            <w:tcBorders>
+              <w:top w:val="single" w:color="000000" w:sz="4"/>
+              <w:left w:val="single" w:color="000000" w:sz="4"/>
+              <w:bottom w:val="single" w:color="000000" w:sz="4"/>
+              <w:right w:val="single" w:color="000000" w:sz="4"/>
+            </w:tcBorders>
+            <w:tcMar>
+              <w:top w:type="dxa" w:w="60"/>
+              <w:left w:type="dxa" w:w="100"/>
+              <w:bottom w:type="dxa" w:w="60"/>
+              <w:right w:type="dxa" w:w="100"/>
+            </w:tcMar>
+            <w:vAlign w:val="center"/>
+          </w:tcPr>
+          <w:p>
+            <w:pPr>
+              <w:spacing w:line="240"/>
+              <w:jc w:val="left"/>
+            </w:pPr>
+            <w:r>
+              <w:rPr>
+                <w:sz w:val="20"/>
+                <w:szCs w:val="20"/>
+              </w:rPr>
+              <w:t xml:space="preserve">214</w:t>
+            </w:r>
+          </w:p>
+        </w:tc>
+        <w:tc>
+          <w:tcPr>
+            <w:tcW w:type="dxa" w:w="1428"/>
+            <w:tcBorders>
+              <w:top w:val="single" w:color="000000" w:sz="4"/>
+              <w:left w:val="single" w:color="000000" w:sz="4"/>
+              <w:bottom w:val="single" w:color="000000" w:sz="4"/>
+              <w:right w:val="single" w:color="000000" w:sz="4"/>
+            </w:tcBorders>
+            <w:tcMar>
+              <w:top w:type="dxa" w:w="60"/>
+              <w:left w:type="dxa" w:w="100"/>
+              <w:bottom w:type="dxa" w:w="60"/>
+              <w:right w:type="dxa" w:w="100"/>
+            </w:tcMar>
+            <w:vAlign w:val="center"/>
+          </w:tcPr>
+          <w:p>
+            <w:pPr>
+              <w:spacing w:line="240"/>
+              <w:jc w:val="left"/>
+            </w:pPr>
+            <w:r>
+              <w:rPr>
+                <w:sz w:val="20"/>
+                <w:szCs w:val="20"/>
+              </w:rPr>
+              <w:t xml:space="preserve">5.8%</w:t>
+            </w:r>
+          </w:p>
+        </w:tc>
+        <w:tc>
+          <w:tcPr>
+            <w:tcW w:type="dxa" w:w="1430"/>
+            <w:tcBorders>
+              <w:top w:val="single" w:color="000000" w:sz="4"/>
+              <w:left w:val="single" w:color="000000" w:sz="4"/>
+              <w:bottom w:val="single" w:color="000000" w:sz="4"/>
+              <w:right w:val="single" w:color="000000" w:sz="4"/>
+            </w:tcBorders>
+            <w:tcMar>
+              <w:top w:type="dxa" w:w="60"/>
+              <w:left w:type="dxa" w:w="100"/>
+              <w:bottom w:type="dxa" w:w="60"/>
+              <w:right w:type="dxa" w:w="100"/>
+            </w:tcMar>
+            <w:vAlign w:val="center"/>
+          </w:tcPr>
+          <w:p>
+            <w:pPr>
+              <w:spacing w:line="240"/>
+              <w:jc w:val="left"/>
+            </w:pPr>
+            <w:r>
+              <w:rPr>
+                <w:sz w:val="20"/>
+                <w:szCs w:val="20"/>
+              </w:rPr>
+              <w:t xml:space="preserve">Referencia</w:t>
+            </w:r>
+          </w:p>
+        </w:tc>
+      </w:tr>
+    </w:tbl>
+    <w:p>
+      <w:pPr>
+        <w:spacing w:after="160" w:line="480"/>
+        <w:jc w:val="both"/>
+      </w:pPr>
+    </w:p>
+    <w:p>
+      <w:pPr>
+        <w:spacing w:after="160" w:line="480"/>
+        <w:jc w:val="both"/>
+      </w:pPr>
+      <w:r>
+        <w:t xml:space="preserve">Con una prueba de comparación de dos proporciones y un nivel de significancia bilateral de 0.05, la potencia para detectar esta diferencia fue mayor de 99%, incluso al asumir un efecto de diseño de 2, lo que equivale a reducir a la mitad el tamaño efectivo de la muestra. En los 6,885 participantes con covariables completas hubo 588 casos; con 21 parámetros en el modelo ajustado, se dispone de unos 28 eventos por parámetro, por encima del mínimo de 10.</w:t>
+      </w:r>
+    </w:p>
+    <w:p>
+      <w:pPr>
+        <w:spacing w:after="160" w:line="480"/>
+        <w:jc w:val="both"/>
+      </w:pPr>
+      <w:r>
+        <w:t xml:space="preserve">Estas estimaciones solo verifican la factibilidad y no constituyen el análisis final. Las razones de prevalencia ponderadas, crudas y ajustadas, y su interpretación se obtendrán después, según la metodología de este protocolo, para evitar modificar las hipótesis o la estrategia analítica en función de los datos explorados.</w:t>
+      </w:r>
+    </w:p>
+    <w:p>
+      <w:pPr>
+        <w:pStyle w:val="Heading2"/>
+      </w:pPr>
+      <w:r>
+        <w:t xml:space="preserve">6.7 Instrumentos y procedimientos</w:t>
+      </w:r>
+    </w:p>
+    <w:p>
+      <w:pPr>
+        <w:spacing w:after="160" w:line="480"/>
+        <w:jc w:val="both"/>
+      </w:pPr>
+      <w:r>
+        <w:t xml:space="preserve">El estudio no requiere un instrumento de recolección propio. Se usarán los cuestionarios y mediciones estandarizados de NHANES 2017–marzo 2020, administrados por el NCHS de los Centers for Disease Control and Prevention (CDC) (10). No se realizará validación de contenido ni prueba piloto, porque la información ya fue recolectada con instrumentos estandarizados cuya documentación oficial describe cada pregunta, sus códigos de respuesta y sus frecuencias (11,12).</w:t>
+      </w:r>
+    </w:p>
+    <w:p>
+      <w:pPr>
+        <w:pStyle w:val="ListParagraph"/>
+        <w:numPr>
+          <w:ilvl w:val="0"/>
+          <w:numId w:val="3"/>
+        </w:numPr>
+        <w:spacing w:after="0" w:line="480"/>
+        <w:jc w:val="left"/>
+      </w:pPr>
+      <w:r>
+        <w:t xml:space="preserve">Se descargarán los archivos públicos indicados en la sección 6.6.2 desde el repositorio oficial del CDC.</w:t>
+      </w:r>
+    </w:p>
+    <w:p>
+      <w:pPr>
+        <w:pStyle w:val="ListParagraph"/>
+        <w:numPr>
+          <w:ilvl w:val="0"/>
+          <w:numId w:val="3"/>
+        </w:numPr>
+        <w:spacing w:after="0" w:line="480"/>
+        <w:jc w:val="left"/>
+      </w:pPr>
+      <w:r>
+        <w:t xml:space="preserve">Se integrarán mediante el identificador único del participante (SEQN) y se verificarán la estructura, los códigos de respuesta y los valores perdidos.</w:t>
+      </w:r>
+    </w:p>
+    <w:p>
+      <w:pPr>
+        <w:pStyle w:val="ListParagraph"/>
+        <w:numPr>
+          <w:ilvl w:val="0"/>
+          <w:numId w:val="3"/>
+        </w:numPr>
+        <w:spacing w:after="0" w:line="480"/>
+        <w:jc w:val="left"/>
+      </w:pPr>
+      <w:r>
+        <w:t xml:space="preserve">Se construirán el puntaje STOP-BAG, el puntaje PHQ-9 y las covariables según la sección 6.5.</w:t>
+      </w:r>
+    </w:p>
+    <w:p>
+      <w:pPr>
+        <w:pStyle w:val="ListParagraph"/>
+        <w:numPr>
+          <w:ilvl w:val="0"/>
+          <w:numId w:val="3"/>
+        </w:numPr>
+        <w:spacing w:after="0" w:line="480"/>
+        <w:jc w:val="left"/>
+      </w:pPr>
+      <w:r>
+        <w:t xml:space="preserve">Se declarará el diseño muestral complejo sobre la base completa de P_DEMO, sin eliminar observaciones, y la población analítica se identificará con una variable indicadora para que la estimación de la varianza refleje el diseño completo (15).</w:t>
+      </w:r>
+    </w:p>
+    <w:p>
+      <w:pPr>
+        <w:pStyle w:val="ListParagraph"/>
+        <w:numPr>
+          <w:ilvl w:val="0"/>
+          <w:numId w:val="3"/>
+        </w:numPr>
+        <w:spacing w:after="0" w:line="480"/>
+        <w:jc w:val="left"/>
+      </w:pPr>
+      <w:r>
+        <w:t xml:space="preserve">Se realizará el análisis descriptivo, bivariado y multivariado de la sección 6.9.</w:t>
+      </w:r>
+    </w:p>
+    <w:p>
+      <w:pPr>
+        <w:pStyle w:val="Heading2"/>
+      </w:pPr>
+      <w:r>
+        <w:t xml:space="preserve">6.8 Evaluación y control del sesgo</w:t>
+      </w:r>
+    </w:p>
+    <w:p>
+      <w:pPr>
+        <w:spacing w:after="160" w:line="480"/>
+        <w:jc w:val="both"/>
+      </w:pPr>
+      <w:r>
+        <w:rPr>
+          <w:b/>
+          <w:bCs/>
+        </w:rPr>
+        <w:t xml:space="preserve">Sesgo de información.</w:t>
+      </w:r>
+      <w:r>
+        <w:t xml:space="preserve"> Los síntomas de sueño, la hipertensión y los antecedentes clínicos son autorreportados, y el STOP-BAG adaptado no ha sido validado frente a la polisomnografía en NHANES. Esto puede producir una clasificación incorrecta de la exposición, probablemente no diferencial, que tendería a subestimar la asociación.</w:t>
+      </w:r>
+    </w:p>
+    <w:p>
+      <w:pPr>
+        <w:spacing w:after="160" w:line="480"/>
+        <w:jc w:val="both"/>
+      </w:pPr>
+      <w:r>
+        <w:rPr>
+          <w:b/>
+          <w:bCs/>
+        </w:rPr>
+        <w:t xml:space="preserve">Superposición de síntomas.</w:t>
+      </w:r>
+      <w:r>
+        <w:t xml:space="preserve"> La somnolencia diurna (ítem T) se parece a los ítems de problemas de sueño (DPQ030) y de cansancio (DPQ040) del PHQ-9. Para evitar que esta superposición explique la asociación, se prespecifican análisis de sensibilidad sin estos ítems (sección 6.9).</w:t>
+      </w:r>
+    </w:p>
+    <w:p>
+      <w:pPr>
+        <w:spacing w:after="160" w:line="480"/>
+        <w:jc w:val="both"/>
+      </w:pPr>
+      <w:r>
+        <w:rPr>
+          <w:b/>
+          <w:bCs/>
+        </w:rPr>
+        <w:t xml:space="preserve">Sesgo de selección y no respuesta.</w:t>
+      </w:r>
+      <w:r>
+        <w:t xml:space="preserve"> Se usarán los pesos, estratos y unidades primarias de muestreo oficiales, que incorporan la probabilidad de selección y los ajustes por no respuesta (15). Aun así, puede persistir un sesgo residual.</w:t>
+      </w:r>
+    </w:p>
+    <w:p>
+      <w:pPr>
+        <w:spacing w:after="160" w:line="480"/>
+        <w:jc w:val="both"/>
+      </w:pPr>
+      <w:r>
+        <w:rPr>
+          <w:b/>
+          <w:bCs/>
+        </w:rPr>
+        <w:t xml:space="preserve">Confusión.</w:t>
+      </w:r>
+      <w:r>
+        <w:t xml:space="preserve"> Se controlará mediante el ajuste multivariable por las covariables definidas a priori.</w:t>
+      </w:r>
+    </w:p>
+    <w:p>
+      <w:pPr>
+        <w:spacing w:after="160" w:line="480"/>
+        <w:jc w:val="both"/>
+      </w:pPr>
+      <w:r>
+        <w:rPr>
+          <w:b/>
+          <w:bCs/>
+        </w:rPr>
+        <w:t xml:space="preserve">Temporalidad.</w:t>
+      </w:r>
+      <w:r>
+        <w:t xml:space="preserve"> Por el diseño transversal, no puede establecerse la secuencia temporal entre la exposición y el desenlace; la depresión también podría aumentar la percepción de somnolencia. Los resultados se interpretarán como asociaciones y no como relaciones causales.</w:t>
+      </w:r>
+    </w:p>
+    <w:p>
+      <w:pPr>
+        <w:spacing w:after="160" w:line="480"/>
+        <w:jc w:val="both"/>
+      </w:pPr>
+      <w:r>
+        <w:rPr>
+          <w:b/>
+          <w:bCs/>
+        </w:rPr>
+        <w:t xml:space="preserve">Datos faltantes.</w:t>
+      </w:r>
+      <w:r>
+        <w:t xml:space="preserve"> El análisis principal será de casos completos. Se reportará el número de exclusiones por variable y se compararán las características de los participantes incluidos y excluidos.</w:t>
+      </w:r>
+    </w:p>
+    <w:p>
+      <w:pPr>
+        <w:pStyle w:val="Heading2"/>
+      </w:pPr>
+      <w:r>
+        <w:t xml:space="preserve">6.9 Análisis estadístico</w:t>
+      </w:r>
+    </w:p>
+    <w:p>
+      <w:pPr>
+        <w:spacing w:after="160" w:line="480"/>
+        <w:jc w:val="both"/>
+      </w:pPr>
+      <w:r>
+        <w:t xml:space="preserve">Todos los análisis se realizarán en Stata 18 (21). El diseño muestral complejo se declarará con el comando svyset, usando SDMVPSU como unidad primaria de muestreo, SDMVSTRA como estrato y WTMECPRP como peso, porque el PHQ-9 se aplicó en el MEC (15). La varianza se estimará por linealización de Taylor y todas las estimaciones se restringirán a la población analítica con la opción subpop().</w:t>
+      </w:r>
+    </w:p>
+    <w:p>
+      <w:pPr>
+        <w:spacing w:after="160" w:line="480"/>
+        <w:jc w:val="both"/>
+      </w:pPr>
+      <w:r>
+        <w:rPr>
+          <w:b/>
+          <w:bCs/>
+        </w:rPr>
+        <w:t xml:space="preserve">Análisis descriptivo.</w:t>
+      </w:r>
+      <w:r>
+        <w:t xml:space="preserve"> Para las variables cualitativas se reportarán frecuencias absolutas no ponderadas y porcentajes ponderados con su intervalo de confianza del 95% (IC 95%); para las cuantitativas, la mediana ponderada y el rango intercuartílico. La confiabilidad de cada proporción se evaluará con los estándares de presentación del NCHS (18).</w:t>
+      </w:r>
+    </w:p>
+    <w:p>
+      <w:pPr>
+        <w:spacing w:after="160" w:line="480"/>
+        <w:jc w:val="both"/>
+      </w:pPr>
+      <w:r>
+        <w:rPr>
+          <w:b/>
+          <w:bCs/>
+        </w:rPr>
+        <w:t xml:space="preserve">Análisis bivariado.</w:t>
+      </w:r>
+      <w:r>
+        <w:t xml:space="preserve"> Se compararán las características según el riesgo de AOS y la prevalencia del desenlace según cada covariable con la prueba de chi-cuadrado con corrección de Rao-Scott (19).</w:t>
+      </w:r>
+    </w:p>
+    <w:p>
+      <w:pPr>
+        <w:spacing w:after="160" w:line="480"/>
+        <w:jc w:val="both"/>
+      </w:pPr>
+      <w:r>
+        <w:rPr>
+          <w:b/>
+          <w:bCs/>
+        </w:rPr>
+        <w:t xml:space="preserve">Análisis multivariado.</w:t>
+      </w:r>
+      <w:r>
+        <w:t xml:space="preserve"> Se estimarán razones de prevalencia (RP) con IC 95% mediante regresión de Poisson con varianza robusta, recomendada para desenlaces binarios frecuentes en estudios transversales (14). Se estimará primero la RP cruda y luego un modelo ajustado por edad, sexo, raza/etnia, nivel educativo, razón ingreso/pobreza, estado civil, tabaquismo, diabetes, enfermedad cardiovascular y seguro de salud. Antes de interpretarlo se evaluará la colinealidad con el factor de inflación de la varianza en un modelo lineal auxiliar no ponderado; un valor mayor de 10 se considerará colinealidad importante.</w:t>
+      </w:r>
+    </w:p>
+    <w:p>
+      <w:pPr>
+        <w:spacing w:after="160" w:line="480"/>
+        <w:jc w:val="both"/>
+      </w:pPr>
+      <w:r>
+        <w:rPr>
+          <w:b/>
+          <w:bCs/>
+        </w:rPr>
+        <w:t xml:space="preserve">Gradiente.</w:t>
+      </w:r>
+      <w:r>
+        <w:t xml:space="preserve"> Se estimarán las RP de las categorías 3–4 y 5–7 frente a 0–2, y la tendencia se evaluará incorporando el puntaje agrupado como término ordinal (p de tendencia).</w:t>
+      </w:r>
+    </w:p>
+    <w:p>
+      <w:pPr>
+        <w:spacing w:after="160" w:line="480"/>
+        <w:jc w:val="both"/>
+      </w:pPr>
+      <w:r>
+        <w:rPr>
+          <w:b/>
+          <w:bCs/>
+        </w:rPr>
+        <w:t xml:space="preserve">Modificación del efecto.</w:t>
+      </w:r>
+      <w:r>
+        <w:t xml:space="preserve"> Se evaluará la interacción entre el riesgo de AOS y el sexo con la prueba de Wald ajustada; si es significativa, se reportarán las RP por sexo.</w:t>
+      </w:r>
+    </w:p>
+    <w:p>
+      <w:pPr>
+        <w:spacing w:after="160" w:line="480"/>
+        <w:jc w:val="both"/>
+      </w:pPr>
+      <w:r>
+        <w:rPr>
+          <w:b/>
+          <w:bCs/>
+        </w:rPr>
+        <w:t xml:space="preserve">Análisis de sensibilidad prespecificados:</w:t>
+      </w:r>
+    </w:p>
+    <w:p>
+      <w:pPr>
+        <w:pStyle w:val="ListParagraph"/>
+        <w:numPr>
+          <w:ilvl w:val="0"/>
+          <w:numId w:val="4"/>
+        </w:numPr>
+        <w:spacing w:after="0" w:line="480"/>
+        <w:jc w:val="left"/>
+      </w:pPr>
+      <w:r>
+        <w:t xml:space="preserve">Exposición sin el ítem de cansancio (STOP-BAG sin T, 0 a 6 puntos, alto riesgo ≥ 3).</w:t>
+      </w:r>
+    </w:p>
+    <w:p>
+      <w:pPr>
+        <w:pStyle w:val="ListParagraph"/>
+        <w:numPr>
+          <w:ilvl w:val="0"/>
+          <w:numId w:val="4"/>
+        </w:numPr>
+        <w:spacing w:after="0" w:line="480"/>
+        <w:jc w:val="left"/>
+      </w:pPr>
+      <w:r>
+        <w:t xml:space="preserve">Desenlace con el puntaje PHQ-9 sin los ítems de sueño y cansancio (DPQ030 y DPQ040), analizado como variable continua mediante regresión lineal.</w:t>
+      </w:r>
+    </w:p>
+    <w:p>
+      <w:pPr>
+        <w:pStyle w:val="ListParagraph"/>
+        <w:numPr>
+          <w:ilvl w:val="0"/>
+          <w:numId w:val="4"/>
+        </w:numPr>
+        <w:spacing w:after="0" w:line="480"/>
+        <w:jc w:val="left"/>
+      </w:pPr>
+      <w:r>
+        <w:t xml:space="preserve">Desenlace con el PHQ-8 ≥ 10 (sin el ítem de ideación suicida), versión validada para estudios poblacionales (17).</w:t>
+      </w:r>
+    </w:p>
+    <w:p>
+      <w:pPr>
+        <w:pStyle w:val="ListParagraph"/>
+        <w:numPr>
+          <w:ilvl w:val="0"/>
+          <w:numId w:val="4"/>
+        </w:numPr>
+        <w:spacing w:after="0" w:line="480"/>
+        <w:jc w:val="left"/>
+      </w:pPr>
+      <w:r>
+        <w:t xml:space="preserve">Exposición definida solo por síntomas nocturnos: ronquido o resoplidos/pausas respiratorias 3 o más noches por semana.</w:t>
+      </w:r>
+    </w:p>
+    <w:p>
+      <w:pPr>
+        <w:pStyle w:val="ListParagraph"/>
+        <w:numPr>
+          <w:ilvl w:val="0"/>
+          <w:numId w:val="4"/>
+        </w:numPr>
+        <w:spacing w:after="0" w:line="480"/>
+        <w:jc w:val="left"/>
+      </w:pPr>
+      <w:r>
+        <w:t xml:space="preserve">Modelo principal con ajuste adicional por categorías de IMC.</w:t>
+      </w:r>
+    </w:p>
+    <w:p>
+      <w:pPr>
+        <w:spacing w:after="160" w:line="480"/>
+        <w:jc w:val="both"/>
+      </w:pPr>
+      <w:r>
+        <w:t xml:space="preserve">El nivel de significancia será p &lt; 0.05 (bilateral). Los resultados se reportarán según la guía STROBE (13) y se interpretarán como asociaciones.</w:t>
+      </w:r>
+    </w:p>
+    <w:p>
+      <w:pPr>
+        <w:pStyle w:val="Heading1"/>
+      </w:pPr>
+      <w:r>
+        <w:t xml:space="preserve">7. ASPECTOS ÉTICOS</w:t>
+      </w:r>
+    </w:p>
+    <w:p>
+      <w:pPr>
+        <w:spacing w:after="160" w:line="480"/>
+        <w:jc w:val="both"/>
+      </w:pPr>
+      <w:r>
+        <w:t xml:space="preserve">El estudio es un análisis secundario de archivos públicos, anonimizados y de libre acceso de NHANES 2017–marzo 2020, que no contienen identificadores personales. El protocolo de NHANES fue aprobado por el NCHS Ethics Review Board y la recolección original incluyó el consentimiento informado de los participantes (20). Los investigadores no tendrán contacto con los participantes ni realizarán una nueva recolección de información, por lo que no se solicitará un nuevo consentimiento informado.</w:t>
+      </w:r>
+    </w:p>
+    <w:p>
+      <w:pPr>
+        <w:spacing w:after="160" w:line="480"/>
+        <w:jc w:val="both"/>
+      </w:pPr>
+      <w:r>
+        <w:t xml:space="preserve">El protocolo será presentado al Subcomité de Ética en Investigación de la Facultad de Ciencias de la Salud de la Universidad Peruana de Ciencias Aplicadas, según los procedimientos institucionales vigentes para Tesis 2. Los resultados se presentarán de manera agregada, sin posibilidad de identificación individual. Los investigadores declaran no tener conflictos de interés y el estudio no cuenta con financiamiento externo.</w:t>
+      </w:r>
+    </w:p>
+    <w:p>
+      <w:pPr>
+        <w:pStyle w:val="Heading1"/>
+      </w:pPr>
+      <w:r>
+        <w:t xml:space="preserve">8. FORTALEZAS</w:t>
+      </w:r>
+    </w:p>
+    <w:p>
+      <w:pPr>
+        <w:pStyle w:val="ListParagraph"/>
+        <w:numPr>
+          <w:ilvl w:val="0"/>
+          <w:numId w:val="2"/>
+        </w:numPr>
+        <w:spacing w:after="0" w:line="480"/>
+        <w:jc w:val="both"/>
+      </w:pPr>
+      <w:r>
+        <w:t xml:space="preserve">Usa una muestra nacional con diseño probabilístico complejo, que permite obtener estimaciones representativas de la población civil no institucionalizada de Estados Unidos.</w:t>
+      </w:r>
+    </w:p>
+    <w:p>
+      <w:pPr>
+        <w:pStyle w:val="ListParagraph"/>
+        <w:numPr>
+          <w:ilvl w:val="0"/>
+          <w:numId w:val="2"/>
+        </w:numPr>
+        <w:spacing w:after="0" w:line="480"/>
+        <w:jc w:val="both"/>
+      </w:pPr>
+      <w:r>
+        <w:t xml:space="preserve">El desenlace se mide con el PHQ-9, un instrumento validado y ampliamente usado (4).</w:t>
+      </w:r>
+    </w:p>
+    <w:p>
+      <w:pPr>
+        <w:pStyle w:val="ListParagraph"/>
+        <w:numPr>
+          <w:ilvl w:val="0"/>
+          <w:numId w:val="2"/>
+        </w:numPr>
+        <w:spacing w:after="0" w:line="480"/>
+        <w:jc w:val="both"/>
+      </w:pPr>
+      <w:r>
+        <w:t xml:space="preserve">Emplea un puntaje compuesto de tamizaje basado en el STOP-BANG, en lugar de síntomas aislados, lo que lo acerca a la práctica clínica (9).</w:t>
+      </w:r>
+    </w:p>
+    <w:p>
+      <w:pPr>
+        <w:pStyle w:val="ListParagraph"/>
+        <w:numPr>
+          <w:ilvl w:val="0"/>
+          <w:numId w:val="2"/>
+        </w:numPr>
+        <w:spacing w:after="0" w:line="480"/>
+        <w:jc w:val="both"/>
+      </w:pPr>
+      <w:r>
+        <w:t xml:space="preserve">Incluye análisis de sensibilidad prespecificados para controlar la superposición de síntomas entre la exposición y el desenlace.</w:t>
+      </w:r>
+    </w:p>
+    <w:p>
+      <w:pPr>
+        <w:pStyle w:val="ListParagraph"/>
+        <w:numPr>
+          <w:ilvl w:val="0"/>
+          <w:numId w:val="2"/>
+        </w:numPr>
+        <w:spacing w:after="0" w:line="480"/>
+        <w:jc w:val="both"/>
+      </w:pPr>
+      <w:r>
+        <w:t xml:space="preserve">La factibilidad se verificó con los datos reales de NHANES 2017–marzo 2020 antes del análisis final.</w:t>
+      </w:r>
+    </w:p>
+    <w:p>
+      <w:pPr>
+        <w:pStyle w:val="Heading1"/>
+      </w:pPr>
+      <w:r>
+        <w:t xml:space="preserve">9. LIMITACIONES</w:t>
+      </w:r>
+    </w:p>
+    <w:p>
+      <w:pPr>
+        <w:pStyle w:val="ListParagraph"/>
+        <w:numPr>
+          <w:ilvl w:val="0"/>
+          <w:numId w:val="2"/>
+        </w:numPr>
+        <w:spacing w:after="0" w:line="480"/>
+        <w:jc w:val="both"/>
+      </w:pPr>
+      <w:r>
+        <w:rPr>
+          <w:b/>
+          <w:bCs/>
+        </w:rPr>
+        <w:t xml:space="preserve">Validez externa:</w:t>
+      </w:r>
+      <w:r>
+        <w:t xml:space="preserve"> los resultados serán generalizables a la población de Estados Unidos y no directamente a la población peruana.</w:t>
+      </w:r>
+    </w:p>
+    <w:p>
+      <w:pPr>
+        <w:pStyle w:val="ListParagraph"/>
+        <w:numPr>
+          <w:ilvl w:val="0"/>
+          <w:numId w:val="2"/>
+        </w:numPr>
+        <w:spacing w:after="0" w:line="480"/>
+        <w:jc w:val="both"/>
+      </w:pPr>
+      <w:r>
+        <w:rPr>
+          <w:b/>
+          <w:bCs/>
+        </w:rPr>
+        <w:t xml:space="preserve">Exposición indirecta:</w:t>
+      </w:r>
+      <w:r>
+        <w:t xml:space="preserve"> el STOP-BAG adaptado no incluye la circunferencia de cuello ni confirma la AOS con polisomnografía; mide riesgo, no diagnóstico.</w:t>
+      </w:r>
+    </w:p>
+    <w:p>
+      <w:pPr>
+        <w:pStyle w:val="ListParagraph"/>
+        <w:numPr>
+          <w:ilvl w:val="0"/>
+          <w:numId w:val="2"/>
+        </w:numPr>
+        <w:spacing w:after="0" w:line="480"/>
+        <w:jc w:val="both"/>
+      </w:pPr>
+      <w:r>
+        <w:rPr>
+          <w:b/>
+          <w:bCs/>
+        </w:rPr>
+        <w:t xml:space="preserve">Diseño transversal:</w:t>
+      </w:r>
+      <w:r>
+        <w:t xml:space="preserve"> no permite establecer causalidad ni la dirección de la asociación.</w:t>
+      </w:r>
+    </w:p>
+    <w:p>
+      <w:pPr>
+        <w:pStyle w:val="ListParagraph"/>
+        <w:numPr>
+          <w:ilvl w:val="0"/>
+          <w:numId w:val="2"/>
+        </w:numPr>
+        <w:spacing w:after="0" w:line="480"/>
+        <w:jc w:val="both"/>
+      </w:pPr>
+      <w:r>
+        <w:rPr>
+          <w:b/>
+          <w:bCs/>
+        </w:rPr>
+        <w:t xml:space="preserve">Autorreporte:</w:t>
+      </w:r>
+      <w:r>
+        <w:t xml:space="preserve"> varios datos dependen del recuerdo de los participantes.</w:t>
+      </w:r>
+    </w:p>
+    <w:p>
+      <w:pPr>
+        <w:pStyle w:val="ListParagraph"/>
+        <w:numPr>
+          <w:ilvl w:val="0"/>
+          <w:numId w:val="2"/>
+        </w:numPr>
+        <w:spacing w:after="0" w:line="480"/>
+        <w:jc w:val="both"/>
+      </w:pPr>
+      <w:r>
+        <w:rPr>
+          <w:b/>
+          <w:bCs/>
+        </w:rPr>
+        <w:t xml:space="preserve">Confusión residual:</w:t>
+      </w:r>
+      <w:r>
+        <w:t xml:space="preserve"> no se ajustará por el uso de antidepresivos, hipnóticos ni por actividad física, que podrían influir en ambas variables.</w:t>
+      </w:r>
+    </w:p>
+    <w:p>
+      <w:pPr>
+        <w:pStyle w:val="ListParagraph"/>
+        <w:numPr>
+          <w:ilvl w:val="0"/>
+          <w:numId w:val="2"/>
+        </w:numPr>
+        <w:spacing w:after="0" w:line="480"/>
+        <w:jc w:val="both"/>
+      </w:pPr>
+      <w:r>
+        <w:rPr>
+          <w:b/>
+          <w:bCs/>
+        </w:rPr>
+        <w:t xml:space="preserve">Antigüedad relativa:</w:t>
+      </w:r>
+      <w:r>
+        <w:t xml:space="preserve"> los datos son previos a la pandemia de COVID-19, que pudo modificar la prevalencia de síntomas depresivos.</w:t>
+      </w:r>
+    </w:p>
+    <w:p>
+      <w:pPr>
+        <w:pStyle w:val="Heading1"/>
+      </w:pPr>
+      <w:r>
+        <w:t xml:space="preserve">10. CRONOGRAMA Y PRESUPUESTO</w:t>
+      </w:r>
+    </w:p>
+    <w:p>
+      <w:pPr>
+        <w:spacing w:after="160" w:line="480"/>
+        <w:jc w:val="both"/>
+      </w:pPr>
+      <w:r>
+        <w:t xml:space="preserve">El estudio puede completarse en cuatro meses, con la base de datos lista para febrero de 2027.</w:t>
+      </w:r>
+    </w:p>
+    <w:tbl>
+      <w:tblPr>
+        <w:tblW w:type="dxa" w:w="8787"/>
+        <w:tblBorders>
+          <w:top w:val="single" w:color="auto" w:sz="4"/>
+          <w:left w:val="single" w:color="auto" w:sz="4"/>
+          <w:bottom w:val="single" w:color="auto" w:sz="4"/>
+          <w:right w:val="single" w:color="auto" w:sz="4"/>
+          <w:insideH w:val="single" w:color="auto" w:sz="4"/>
+          <w:insideV w:val="single" w:color="auto" w:sz="4"/>
+        </w:tblBorders>
+      </w:tblPr>
+      <w:tblGrid>
+        <w:gridCol w:w="4455"/>
+        <w:gridCol w:w="1083"/>
+        <w:gridCol w:w="1083"/>
+        <w:gridCol w:w="1083"/>
+        <w:gridCol w:w="1083"/>
+      </w:tblGrid>
+      <w:tr>
+        <w:trPr>
+          <w:cantSplit/>
+          <w:tblHeader/>
+        </w:trPr>
+        <w:tc>
+          <w:tcPr>
+            <w:tcW w:type="dxa" w:w="4455"/>
+            <w:tcBorders>
+              <w:top w:val="single" w:color="000000" w:sz="4"/>
+              <w:left w:val="single" w:color="000000" w:sz="4"/>
+              <w:bottom w:val="single" w:color="000000" w:sz="4"/>
+              <w:right w:val="single" w:color="000000" w:sz="4"/>
+            </w:tcBorders>
+            <w:shd w:fill="E7E6E6" w:color="auto" w:val="clear"/>
+            <w:tcMar>
+              <w:top w:type="dxa" w:w="60"/>
+              <w:left w:type="dxa" w:w="100"/>
+              <w:bottom w:type="dxa" w:w="60"/>
+              <w:right w:type="dxa" w:w="100"/>
+            </w:tcMar>
+            <w:vAlign w:val="center"/>
+          </w:tcPr>
+          <w:p>
+            <w:pPr>
+              <w:spacing w:line="240"/>
+              <w:jc w:val="left"/>
+            </w:pPr>
+            <w:r>
+              <w:rPr>
+                <w:b/>
+                <w:bCs/>
+                <w:sz w:val="20"/>
+                <w:szCs w:val="20"/>
+              </w:rPr>
+              <w:t xml:space="preserve">Actividad</w:t>
+            </w:r>
+          </w:p>
+        </w:tc>
+        <w:tc>
+          <w:tcPr>
+            <w:tcW w:type="dxa" w:w="1083"/>
+            <w:tcBorders>
+              <w:top w:val="single" w:color="000000" w:sz="4"/>
+              <w:left w:val="single" w:color="000000" w:sz="4"/>
+              <w:bottom w:val="single" w:color="000000" w:sz="4"/>
+              <w:right w:val="single" w:color="000000" w:sz="4"/>
+            </w:tcBorders>
+            <w:shd w:fill="E7E6E6" w:color="auto" w:val="clear"/>
+            <w:tcMar>
+              <w:top w:type="dxa" w:w="60"/>
+              <w:left w:type="dxa" w:w="100"/>
+              <w:bottom w:type="dxa" w:w="60"/>
+              <w:right w:type="dxa" w:w="100"/>
+            </w:tcMar>
+            <w:vAlign w:val="center"/>
+          </w:tcPr>
+          <w:p>
+            <w:pPr>
+              <w:spacing w:line="240"/>
+              <w:jc w:val="left"/>
+            </w:pPr>
+            <w:r>
+              <w:rPr>
+                <w:b/>
+                <w:bCs/>
+                <w:sz w:val="20"/>
+                <w:szCs w:val="20"/>
+              </w:rPr>
+              <w:t xml:space="preserve">Nov 2026</w:t>
+            </w:r>
+          </w:p>
+        </w:tc>
+        <w:tc>
+          <w:tcPr>
+            <w:tcW w:type="dxa" w:w="1083"/>
+            <w:tcBorders>
+              <w:top w:val="single" w:color="000000" w:sz="4"/>
+              <w:left w:val="single" w:color="000000" w:sz="4"/>
+              <w:bottom w:val="single" w:color="000000" w:sz="4"/>
+              <w:right w:val="single" w:color="000000" w:sz="4"/>
+            </w:tcBorders>
+            <w:shd w:fill="E7E6E6" w:color="auto" w:val="clear"/>
+            <w:tcMar>
+              <w:top w:type="dxa" w:w="60"/>
+              <w:left w:type="dxa" w:w="100"/>
+              <w:bottom w:type="dxa" w:w="60"/>
+              <w:right w:type="dxa" w:w="100"/>
+            </w:tcMar>
+            <w:vAlign w:val="center"/>
+          </w:tcPr>
+          <w:p>
+            <w:pPr>
+              <w:spacing w:line="240"/>
+              <w:jc w:val="left"/>
+            </w:pPr>
+            <w:r>
+              <w:rPr>
+                <w:b/>
+                <w:bCs/>
+                <w:sz w:val="20"/>
+                <w:szCs w:val="20"/>
+              </w:rPr>
+              <w:t xml:space="preserve">Dic 2026</w:t>
+            </w:r>
+          </w:p>
+        </w:tc>
+        <w:tc>
+          <w:tcPr>
+            <w:tcW w:type="dxa" w:w="1083"/>
+            <w:tcBorders>
+              <w:top w:val="single" w:color="000000" w:sz="4"/>
+              <w:left w:val="single" w:color="000000" w:sz="4"/>
+              <w:bottom w:val="single" w:color="000000" w:sz="4"/>
+              <w:right w:val="single" w:color="000000" w:sz="4"/>
+            </w:tcBorders>
+            <w:shd w:fill="E7E6E6" w:color="auto" w:val="clear"/>
+            <w:tcMar>
+              <w:top w:type="dxa" w:w="60"/>
+              <w:left w:type="dxa" w:w="100"/>
+              <w:bottom w:type="dxa" w:w="60"/>
+              <w:right w:type="dxa" w:w="100"/>
+            </w:tcMar>
+            <w:vAlign w:val="center"/>
+          </w:tcPr>
+          <w:p>
+            <w:pPr>
+              <w:spacing w:line="240"/>
+              <w:jc w:val="left"/>
+            </w:pPr>
+            <w:r>
+              <w:rPr>
+                <w:b/>
+                <w:bCs/>
+                <w:sz w:val="20"/>
+                <w:szCs w:val="20"/>
+              </w:rPr>
+              <w:t xml:space="preserve">Ene 2027</w:t>
+            </w:r>
+          </w:p>
+        </w:tc>
+        <w:tc>
+          <w:tcPr>
+            <w:tcW w:type="dxa" w:w="1083"/>
+            <w:tcBorders>
+              <w:top w:val="single" w:color="000000" w:sz="4"/>
+              <w:left w:val="single" w:color="000000" w:sz="4"/>
+              <w:bottom w:val="single" w:color="000000" w:sz="4"/>
+              <w:right w:val="single" w:color="000000" w:sz="4"/>
+            </w:tcBorders>
+            <w:shd w:fill="E7E6E6" w:color="auto" w:val="clear"/>
+            <w:tcMar>
+              <w:top w:type="dxa" w:w="60"/>
+              <w:left w:type="dxa" w:w="100"/>
+              <w:bottom w:type="dxa" w:w="60"/>
+              <w:right w:type="dxa" w:w="100"/>
+            </w:tcMar>
+            <w:vAlign w:val="center"/>
+          </w:tcPr>
+          <w:p>
+            <w:pPr>
+              <w:spacing w:line="240"/>
+              <w:jc w:val="left"/>
+            </w:pPr>
+            <w:r>
+              <w:rPr>
+                <w:b/>
+                <w:bCs/>
+                <w:sz w:val="20"/>
+                <w:szCs w:val="20"/>
+              </w:rPr>
+              <w:t xml:space="preserve">Feb 2027</w:t>
+            </w:r>
           </w:p>
         </w:tc>
       </w:tr>
@@ -5774,38 +6307,38 @@
         </w:trPr>
         <w:tc>
           <w:tcPr>
-            <w:tcW w:type="dxa" w:w="5742"/>
-            <w:tcBorders>
-              <w:top w:val="single" w:color="000000" w:sz="4"/>
-              <w:left w:val="single" w:color="000000" w:sz="4"/>
-              <w:bottom w:val="single" w:color="000000" w:sz="4"/>
-              <w:right w:val="single" w:color="000000" w:sz="4"/>
-            </w:tcBorders>
-            <w:tcMar>
-              <w:top w:type="dxa" w:w="60"/>
-              <w:left w:type="dxa" w:w="100"/>
-              <w:bottom w:type="dxa" w:w="60"/>
-              <w:right w:type="dxa" w:w="100"/>
-            </w:tcMar>
-            <w:vAlign w:val="center"/>
-          </w:tcPr>
-          <w:p>
-            <w:pPr>
-              <w:spacing w:line="240"/>
-              <w:jc w:val="left"/>
-            </w:pPr>
-            <w:r>
-              <w:rPr>
-                <w:sz w:val="20"/>
-                <w:szCs w:val="20"/>
-              </w:rPr>
-              <w:t xml:space="preserve">Descarga de los archivos y verificación de factibilidad</w:t>
-            </w:r>
-          </w:p>
-        </w:tc>
-        <w:tc>
-          <w:tcPr>
-            <w:tcW w:type="dxa" w:w="761"/>
+            <w:tcW w:type="dxa" w:w="4455"/>
+            <w:tcBorders>
+              <w:top w:val="single" w:color="000000" w:sz="4"/>
+              <w:left w:val="single" w:color="000000" w:sz="4"/>
+              <w:bottom w:val="single" w:color="000000" w:sz="4"/>
+              <w:right w:val="single" w:color="000000" w:sz="4"/>
+            </w:tcBorders>
+            <w:tcMar>
+              <w:top w:type="dxa" w:w="60"/>
+              <w:left w:type="dxa" w:w="100"/>
+              <w:bottom w:type="dxa" w:w="60"/>
+              <w:right w:type="dxa" w:w="100"/>
+            </w:tcMar>
+            <w:vAlign w:val="center"/>
+          </w:tcPr>
+          <w:p>
+            <w:pPr>
+              <w:spacing w:line="240"/>
+              <w:jc w:val="left"/>
+            </w:pPr>
+            <w:r>
+              <w:rPr>
+                <w:sz w:val="20"/>
+                <w:szCs w:val="20"/>
+              </w:rPr>
+              <w:t xml:space="preserve">Revisión del protocolo con el asesor y aprobación del cambio de tema</w:t>
+            </w:r>
+          </w:p>
+        </w:tc>
+        <w:tc>
+          <w:tcPr>
+            <w:tcW w:type="dxa" w:w="1083"/>
             <w:tcBorders>
               <w:top w:val="single" w:color="000000" w:sz="4"/>
               <w:left w:val="single" w:color="000000" w:sz="4"/>
@@ -5836,55 +6369,55 @@
         </w:tc>
         <w:tc>
           <w:tcPr>
-            <w:tcW w:type="dxa" w:w="761"/>
-            <w:tcBorders>
-              <w:top w:val="single" w:color="000000" w:sz="4"/>
-              <w:left w:val="single" w:color="000000" w:sz="4"/>
-              <w:bottom w:val="single" w:color="000000" w:sz="4"/>
-              <w:right w:val="single" w:color="000000" w:sz="4"/>
-            </w:tcBorders>
-            <w:tcMar>
-              <w:top w:type="dxa" w:w="60"/>
-              <w:left w:type="dxa" w:w="100"/>
-              <w:bottom w:type="dxa" w:w="60"/>
-              <w:right w:type="dxa" w:w="100"/>
-            </w:tcMar>
-            <w:vAlign w:val="center"/>
-          </w:tcPr>
-          <w:p>
-            <w:pPr>
-              <w:spacing w:line="240"/>
-              <w:jc w:val="left"/>
-            </w:pPr>
-          </w:p>
-        </w:tc>
-        <w:tc>
-          <w:tcPr>
-            <w:tcW w:type="dxa" w:w="761"/>
-            <w:tcBorders>
-              <w:top w:val="single" w:color="000000" w:sz="4"/>
-              <w:left w:val="single" w:color="000000" w:sz="4"/>
-              <w:bottom w:val="single" w:color="000000" w:sz="4"/>
-              <w:right w:val="single" w:color="000000" w:sz="4"/>
-            </w:tcBorders>
-            <w:tcMar>
-              <w:top w:type="dxa" w:w="60"/>
-              <w:left w:type="dxa" w:w="100"/>
-              <w:bottom w:type="dxa" w:w="60"/>
-              <w:right w:type="dxa" w:w="100"/>
-            </w:tcMar>
-            <w:vAlign w:val="center"/>
-          </w:tcPr>
-          <w:p>
-            <w:pPr>
-              <w:spacing w:line="240"/>
-              <w:jc w:val="left"/>
-            </w:pPr>
-          </w:p>
-        </w:tc>
-        <w:tc>
-          <w:tcPr>
-            <w:tcW w:type="dxa" w:w="762"/>
+            <w:tcW w:type="dxa" w:w="1083"/>
+            <w:tcBorders>
+              <w:top w:val="single" w:color="000000" w:sz="4"/>
+              <w:left w:val="single" w:color="000000" w:sz="4"/>
+              <w:bottom w:val="single" w:color="000000" w:sz="4"/>
+              <w:right w:val="single" w:color="000000" w:sz="4"/>
+            </w:tcBorders>
+            <w:tcMar>
+              <w:top w:type="dxa" w:w="60"/>
+              <w:left w:type="dxa" w:w="100"/>
+              <w:bottom w:type="dxa" w:w="60"/>
+              <w:right w:type="dxa" w:w="100"/>
+            </w:tcMar>
+            <w:vAlign w:val="center"/>
+          </w:tcPr>
+          <w:p>
+            <w:pPr>
+              <w:spacing w:line="240"/>
+              <w:jc w:val="left"/>
+            </w:pPr>
+          </w:p>
+        </w:tc>
+        <w:tc>
+          <w:tcPr>
+            <w:tcW w:type="dxa" w:w="1083"/>
+            <w:tcBorders>
+              <w:top w:val="single" w:color="000000" w:sz="4"/>
+              <w:left w:val="single" w:color="000000" w:sz="4"/>
+              <w:bottom w:val="single" w:color="000000" w:sz="4"/>
+              <w:right w:val="single" w:color="000000" w:sz="4"/>
+            </w:tcBorders>
+            <w:tcMar>
+              <w:top w:type="dxa" w:w="60"/>
+              <w:left w:type="dxa" w:w="100"/>
+              <w:bottom w:type="dxa" w:w="60"/>
+              <w:right w:type="dxa" w:w="100"/>
+            </w:tcMar>
+            <w:vAlign w:val="center"/>
+          </w:tcPr>
+          <w:p>
+            <w:pPr>
+              <w:spacing w:line="240"/>
+              <w:jc w:val="left"/>
+            </w:pPr>
+          </w:p>
+        </w:tc>
+        <w:tc>
+          <w:tcPr>
+            <w:tcW w:type="dxa" w:w="1083"/>
             <w:tcBorders>
               <w:top w:val="single" w:color="000000" w:sz="4"/>
               <w:left w:val="single" w:color="000000" w:sz="4"/>
@@ -5914,62 +6447,38 @@
         </w:trPr>
         <w:tc>
           <w:tcPr>
-            <w:tcW w:type="dxa" w:w="5742"/>
-            <w:tcBorders>
-              <w:top w:val="single" w:color="000000" w:sz="4"/>
-              <w:left w:val="single" w:color="000000" w:sz="4"/>
-              <w:bottom w:val="single" w:color="000000" w:sz="4"/>
-              <w:right w:val="single" w:color="000000" w:sz="4"/>
-            </w:tcBorders>
-            <w:tcMar>
-              <w:top w:type="dxa" w:w="60"/>
-              <w:left w:type="dxa" w:w="100"/>
-              <w:bottom w:type="dxa" w:w="60"/>
-              <w:right w:type="dxa" w:w="100"/>
-            </w:tcMar>
-            <w:vAlign w:val="center"/>
-          </w:tcPr>
-          <w:p>
-            <w:pPr>
-              <w:spacing w:line="240"/>
-              <w:jc w:val="left"/>
-            </w:pPr>
-            <w:r>
-              <w:rPr>
-                <w:sz w:val="20"/>
-                <w:szCs w:val="20"/>
-              </w:rPr>
-              <w:t xml:space="preserve">Construcción y depuración de la base analítica</w:t>
-            </w:r>
-          </w:p>
-        </w:tc>
-        <w:tc>
-          <w:tcPr>
-            <w:tcW w:type="dxa" w:w="761"/>
-            <w:tcBorders>
-              <w:top w:val="single" w:color="000000" w:sz="4"/>
-              <w:left w:val="single" w:color="000000" w:sz="4"/>
-              <w:bottom w:val="single" w:color="000000" w:sz="4"/>
-              <w:right w:val="single" w:color="000000" w:sz="4"/>
-            </w:tcBorders>
-            <w:tcMar>
-              <w:top w:type="dxa" w:w="60"/>
-              <w:left w:type="dxa" w:w="100"/>
-              <w:bottom w:type="dxa" w:w="60"/>
-              <w:right w:type="dxa" w:w="100"/>
-            </w:tcMar>
-            <w:vAlign w:val="center"/>
-          </w:tcPr>
-          <w:p>
-            <w:pPr>
-              <w:spacing w:line="240"/>
-              <w:jc w:val="left"/>
-            </w:pPr>
-          </w:p>
-        </w:tc>
-        <w:tc>
-          <w:tcPr>
-            <w:tcW w:type="dxa" w:w="761"/>
+            <w:tcW w:type="dxa" w:w="4455"/>
+            <w:tcBorders>
+              <w:top w:val="single" w:color="000000" w:sz="4"/>
+              <w:left w:val="single" w:color="000000" w:sz="4"/>
+              <w:bottom w:val="single" w:color="000000" w:sz="4"/>
+              <w:right w:val="single" w:color="000000" w:sz="4"/>
+            </w:tcBorders>
+            <w:tcMar>
+              <w:top w:type="dxa" w:w="60"/>
+              <w:left w:type="dxa" w:w="100"/>
+              <w:bottom w:type="dxa" w:w="60"/>
+              <w:right w:type="dxa" w:w="100"/>
+            </w:tcMar>
+            <w:vAlign w:val="center"/>
+          </w:tcPr>
+          <w:p>
+            <w:pPr>
+              <w:spacing w:line="240"/>
+              <w:jc w:val="left"/>
+            </w:pPr>
+            <w:r>
+              <w:rPr>
+                <w:sz w:val="20"/>
+                <w:szCs w:val="20"/>
+              </w:rPr>
+              <w:t xml:space="preserve">Presentación y aprobación del Subcomité de Ética de la UPC</w:t>
+            </w:r>
+          </w:p>
+        </w:tc>
+        <w:tc>
+          <w:tcPr>
+            <w:tcW w:type="dxa" w:w="1083"/>
             <w:tcBorders>
               <w:top w:val="single" w:color="000000" w:sz="4"/>
               <w:left w:val="single" w:color="000000" w:sz="4"/>
@@ -6000,31 +6509,62 @@
         </w:tc>
         <w:tc>
           <w:tcPr>
-            <w:tcW w:type="dxa" w:w="761"/>
-            <w:tcBorders>
-              <w:top w:val="single" w:color="000000" w:sz="4"/>
-              <w:left w:val="single" w:color="000000" w:sz="4"/>
-              <w:bottom w:val="single" w:color="000000" w:sz="4"/>
-              <w:right w:val="single" w:color="000000" w:sz="4"/>
-            </w:tcBorders>
-            <w:tcMar>
-              <w:top w:type="dxa" w:w="60"/>
-              <w:left w:type="dxa" w:w="100"/>
-              <w:bottom w:type="dxa" w:w="60"/>
-              <w:right w:type="dxa" w:w="100"/>
-            </w:tcMar>
-            <w:vAlign w:val="center"/>
-          </w:tcPr>
-          <w:p>
-            <w:pPr>
-              <w:spacing w:line="240"/>
-              <w:jc w:val="left"/>
-            </w:pPr>
-          </w:p>
-        </w:tc>
-        <w:tc>
-          <w:tcPr>
-            <w:tcW w:type="dxa" w:w="762"/>
+            <w:tcW w:type="dxa" w:w="1083"/>
+            <w:tcBorders>
+              <w:top w:val="single" w:color="000000" w:sz="4"/>
+              <w:left w:val="single" w:color="000000" w:sz="4"/>
+              <w:bottom w:val="single" w:color="000000" w:sz="4"/>
+              <w:right w:val="single" w:color="000000" w:sz="4"/>
+            </w:tcBorders>
+            <w:tcMar>
+              <w:top w:type="dxa" w:w="60"/>
+              <w:left w:type="dxa" w:w="100"/>
+              <w:bottom w:type="dxa" w:w="60"/>
+              <w:right w:type="dxa" w:w="100"/>
+            </w:tcMar>
+            <w:vAlign w:val="center"/>
+          </w:tcPr>
+          <w:p>
+            <w:pPr>
+              <w:spacing w:line="240"/>
+              <w:jc w:val="center"/>
+            </w:pPr>
+            <w:r>
+              <w:rPr>
+                <w:sz w:val="20"/>
+                <w:szCs w:val="20"/>
+              </w:rPr>
+              <w:t xml:space="preserve">X</w:t>
+            </w:r>
+          </w:p>
+        </w:tc>
+        <w:tc>
+          <w:tcPr>
+            <w:tcW w:type="dxa" w:w="1083"/>
+            <w:tcBorders>
+              <w:top w:val="single" w:color="000000" w:sz="4"/>
+              <w:left w:val="single" w:color="000000" w:sz="4"/>
+              <w:bottom w:val="single" w:color="000000" w:sz="4"/>
+              <w:right w:val="single" w:color="000000" w:sz="4"/>
+            </w:tcBorders>
+            <w:tcMar>
+              <w:top w:type="dxa" w:w="60"/>
+              <w:left w:type="dxa" w:w="100"/>
+              <w:bottom w:type="dxa" w:w="60"/>
+              <w:right w:type="dxa" w:w="100"/>
+            </w:tcMar>
+            <w:vAlign w:val="center"/>
+          </w:tcPr>
+          <w:p>
+            <w:pPr>
+              <w:spacing w:line="240"/>
+              <w:jc w:val="left"/>
+            </w:pPr>
+          </w:p>
+        </w:tc>
+        <w:tc>
+          <w:tcPr>
+            <w:tcW w:type="dxa" w:w="1083"/>
             <w:tcBorders>
               <w:top w:val="single" w:color="000000" w:sz="4"/>
               <w:left w:val="single" w:color="000000" w:sz="4"/>
@@ -6054,62 +6594,38 @@
         </w:trPr>
         <w:tc>
           <w:tcPr>
-            <w:tcW w:type="dxa" w:w="5742"/>
-            <w:tcBorders>
-              <w:top w:val="single" w:color="000000" w:sz="4"/>
-              <w:left w:val="single" w:color="000000" w:sz="4"/>
-              <w:bottom w:val="single" w:color="000000" w:sz="4"/>
-              <w:right w:val="single" w:color="000000" w:sz="4"/>
-            </w:tcBorders>
-            <w:tcMar>
-              <w:top w:type="dxa" w:w="60"/>
-              <w:left w:type="dxa" w:w="100"/>
-              <w:bottom w:type="dxa" w:w="60"/>
-              <w:right w:type="dxa" w:w="100"/>
-            </w:tcMar>
-            <w:vAlign w:val="center"/>
-          </w:tcPr>
-          <w:p>
-            <w:pPr>
-              <w:spacing w:line="240"/>
-              <w:jc w:val="left"/>
-            </w:pPr>
-            <w:r>
-              <w:rPr>
-                <w:sz w:val="20"/>
-                <w:szCs w:val="20"/>
-              </w:rPr>
-              <w:t xml:space="preserve">Análisis estadístico</w:t>
-            </w:r>
-          </w:p>
-        </w:tc>
-        <w:tc>
-          <w:tcPr>
-            <w:tcW w:type="dxa" w:w="761"/>
-            <w:tcBorders>
-              <w:top w:val="single" w:color="000000" w:sz="4"/>
-              <w:left w:val="single" w:color="000000" w:sz="4"/>
-              <w:bottom w:val="single" w:color="000000" w:sz="4"/>
-              <w:right w:val="single" w:color="000000" w:sz="4"/>
-            </w:tcBorders>
-            <w:tcMar>
-              <w:top w:type="dxa" w:w="60"/>
-              <w:left w:type="dxa" w:w="100"/>
-              <w:bottom w:type="dxa" w:w="60"/>
-              <w:right w:type="dxa" w:w="100"/>
-            </w:tcMar>
-            <w:vAlign w:val="center"/>
-          </w:tcPr>
-          <w:p>
-            <w:pPr>
-              <w:spacing w:line="240"/>
-              <w:jc w:val="left"/>
-            </w:pPr>
-          </w:p>
-        </w:tc>
-        <w:tc>
-          <w:tcPr>
-            <w:tcW w:type="dxa" w:w="761"/>
+            <w:tcW w:type="dxa" w:w="4455"/>
+            <w:tcBorders>
+              <w:top w:val="single" w:color="000000" w:sz="4"/>
+              <w:left w:val="single" w:color="000000" w:sz="4"/>
+              <w:bottom w:val="single" w:color="000000" w:sz="4"/>
+              <w:right w:val="single" w:color="000000" w:sz="4"/>
+            </w:tcBorders>
+            <w:tcMar>
+              <w:top w:type="dxa" w:w="60"/>
+              <w:left w:type="dxa" w:w="100"/>
+              <w:bottom w:type="dxa" w:w="60"/>
+              <w:right w:type="dxa" w:w="100"/>
+            </w:tcMar>
+            <w:vAlign w:val="center"/>
+          </w:tcPr>
+          <w:p>
+            <w:pPr>
+              <w:spacing w:line="240"/>
+              <w:jc w:val="left"/>
+            </w:pPr>
+            <w:r>
+              <w:rPr>
+                <w:sz w:val="20"/>
+                <w:szCs w:val="20"/>
+              </w:rPr>
+              <w:t xml:space="preserve">Descarga de los archivos y verificación de factibilidad</w:t>
+            </w:r>
+          </w:p>
+        </w:tc>
+        <w:tc>
+          <w:tcPr>
+            <w:tcW w:type="dxa" w:w="1083"/>
             <w:tcBorders>
               <w:top w:val="single" w:color="000000" w:sz="4"/>
               <w:left w:val="single" w:color="000000" w:sz="4"/>
@@ -6140,38 +6656,55 @@
         </w:tc>
         <w:tc>
           <w:tcPr>
-            <w:tcW w:type="dxa" w:w="761"/>
-            <w:tcBorders>
-              <w:top w:val="single" w:color="000000" w:sz="4"/>
-              <w:left w:val="single" w:color="000000" w:sz="4"/>
-              <w:bottom w:val="single" w:color="000000" w:sz="4"/>
-              <w:right w:val="single" w:color="000000" w:sz="4"/>
-            </w:tcBorders>
-            <w:tcMar>
-              <w:top w:type="dxa" w:w="60"/>
-              <w:left w:type="dxa" w:w="100"/>
-              <w:bottom w:type="dxa" w:w="60"/>
-              <w:right w:type="dxa" w:w="100"/>
-            </w:tcMar>
-            <w:vAlign w:val="center"/>
-          </w:tcPr>
-          <w:p>
-            <w:pPr>
-              <w:spacing w:line="240"/>
-              <w:jc w:val="center"/>
-            </w:pPr>
-            <w:r>
-              <w:rPr>
-                <w:sz w:val="20"/>
-                <w:szCs w:val="20"/>
-              </w:rPr>
-              <w:t xml:space="preserve">X</w:t>
-            </w:r>
-          </w:p>
-        </w:tc>
-        <w:tc>
-          <w:tcPr>
-            <w:tcW w:type="dxa" w:w="762"/>
+            <w:tcW w:type="dxa" w:w="1083"/>
+            <w:tcBorders>
+              <w:top w:val="single" w:color="000000" w:sz="4"/>
+              <w:left w:val="single" w:color="000000" w:sz="4"/>
+              <w:bottom w:val="single" w:color="000000" w:sz="4"/>
+              <w:right w:val="single" w:color="000000" w:sz="4"/>
+            </w:tcBorders>
+            <w:tcMar>
+              <w:top w:type="dxa" w:w="60"/>
+              <w:left w:type="dxa" w:w="100"/>
+              <w:bottom w:type="dxa" w:w="60"/>
+              <w:right w:type="dxa" w:w="100"/>
+            </w:tcMar>
+            <w:vAlign w:val="center"/>
+          </w:tcPr>
+          <w:p>
+            <w:pPr>
+              <w:spacing w:line="240"/>
+              <w:jc w:val="left"/>
+            </w:pPr>
+          </w:p>
+        </w:tc>
+        <w:tc>
+          <w:tcPr>
+            <w:tcW w:type="dxa" w:w="1083"/>
+            <w:tcBorders>
+              <w:top w:val="single" w:color="000000" w:sz="4"/>
+              <w:left w:val="single" w:color="000000" w:sz="4"/>
+              <w:bottom w:val="single" w:color="000000" w:sz="4"/>
+              <w:right w:val="single" w:color="000000" w:sz="4"/>
+            </w:tcBorders>
+            <w:tcMar>
+              <w:top w:type="dxa" w:w="60"/>
+              <w:left w:type="dxa" w:w="100"/>
+              <w:bottom w:type="dxa" w:w="60"/>
+              <w:right w:type="dxa" w:w="100"/>
+            </w:tcMar>
+            <w:vAlign w:val="center"/>
+          </w:tcPr>
+          <w:p>
+            <w:pPr>
+              <w:spacing w:line="240"/>
+              <w:jc w:val="left"/>
+            </w:pPr>
+          </w:p>
+        </w:tc>
+        <w:tc>
+          <w:tcPr>
+            <w:tcW w:type="dxa" w:w="1083"/>
             <w:tcBorders>
               <w:top w:val="single" w:color="000000" w:sz="4"/>
               <w:left w:val="single" w:color="000000" w:sz="4"/>
@@ -6201,86 +6734,62 @@
         </w:trPr>
         <w:tc>
           <w:tcPr>
-            <w:tcW w:type="dxa" w:w="5742"/>
-            <w:tcBorders>
-              <w:top w:val="single" w:color="000000" w:sz="4"/>
-              <w:left w:val="single" w:color="000000" w:sz="4"/>
-              <w:bottom w:val="single" w:color="000000" w:sz="4"/>
-              <w:right w:val="single" w:color="000000" w:sz="4"/>
-            </w:tcBorders>
-            <w:tcMar>
-              <w:top w:type="dxa" w:w="60"/>
-              <w:left w:type="dxa" w:w="100"/>
-              <w:bottom w:type="dxa" w:w="60"/>
-              <w:right w:type="dxa" w:w="100"/>
-            </w:tcMar>
-            <w:vAlign w:val="center"/>
-          </w:tcPr>
-          <w:p>
-            <w:pPr>
-              <w:spacing w:line="240"/>
-              <w:jc w:val="left"/>
-            </w:pPr>
-            <w:r>
-              <w:rPr>
-                <w:sz w:val="20"/>
-                <w:szCs w:val="20"/>
-              </w:rPr>
-              <w:t xml:space="preserve">Interpretación de resultados y redacción del informe</w:t>
-            </w:r>
-          </w:p>
-        </w:tc>
-        <w:tc>
-          <w:tcPr>
-            <w:tcW w:type="dxa" w:w="761"/>
-            <w:tcBorders>
-              <w:top w:val="single" w:color="000000" w:sz="4"/>
-              <w:left w:val="single" w:color="000000" w:sz="4"/>
-              <w:bottom w:val="single" w:color="000000" w:sz="4"/>
-              <w:right w:val="single" w:color="000000" w:sz="4"/>
-            </w:tcBorders>
-            <w:tcMar>
-              <w:top w:type="dxa" w:w="60"/>
-              <w:left w:type="dxa" w:w="100"/>
-              <w:bottom w:type="dxa" w:w="60"/>
-              <w:right w:type="dxa" w:w="100"/>
-            </w:tcMar>
-            <w:vAlign w:val="center"/>
-          </w:tcPr>
-          <w:p>
-            <w:pPr>
-              <w:spacing w:line="240"/>
-              <w:jc w:val="left"/>
-            </w:pPr>
-          </w:p>
-        </w:tc>
-        <w:tc>
-          <w:tcPr>
-            <w:tcW w:type="dxa" w:w="761"/>
-            <w:tcBorders>
-              <w:top w:val="single" w:color="000000" w:sz="4"/>
-              <w:left w:val="single" w:color="000000" w:sz="4"/>
-              <w:bottom w:val="single" w:color="000000" w:sz="4"/>
-              <w:right w:val="single" w:color="000000" w:sz="4"/>
-            </w:tcBorders>
-            <w:tcMar>
-              <w:top w:type="dxa" w:w="60"/>
-              <w:left w:type="dxa" w:w="100"/>
-              <w:bottom w:type="dxa" w:w="60"/>
-              <w:right w:type="dxa" w:w="100"/>
-            </w:tcMar>
-            <w:vAlign w:val="center"/>
-          </w:tcPr>
-          <w:p>
-            <w:pPr>
-              <w:spacing w:line="240"/>
-              <w:jc w:val="left"/>
-            </w:pPr>
-          </w:p>
-        </w:tc>
-        <w:tc>
-          <w:tcPr>
-            <w:tcW w:type="dxa" w:w="761"/>
+            <w:tcW w:type="dxa" w:w="4455"/>
+            <w:tcBorders>
+              <w:top w:val="single" w:color="000000" w:sz="4"/>
+              <w:left w:val="single" w:color="000000" w:sz="4"/>
+              <w:bottom w:val="single" w:color="000000" w:sz="4"/>
+              <w:right w:val="single" w:color="000000" w:sz="4"/>
+            </w:tcBorders>
+            <w:tcMar>
+              <w:top w:type="dxa" w:w="60"/>
+              <w:left w:type="dxa" w:w="100"/>
+              <w:bottom w:type="dxa" w:w="60"/>
+              <w:right w:type="dxa" w:w="100"/>
+            </w:tcMar>
+            <w:vAlign w:val="center"/>
+          </w:tcPr>
+          <w:p>
+            <w:pPr>
+              <w:spacing w:line="240"/>
+              <w:jc w:val="left"/>
+            </w:pPr>
+            <w:r>
+              <w:rPr>
+                <w:sz w:val="20"/>
+                <w:szCs w:val="20"/>
+              </w:rPr>
+              <w:t xml:space="preserve">Construcción y depuración de la base analítica</w:t>
+            </w:r>
+          </w:p>
+        </w:tc>
+        <w:tc>
+          <w:tcPr>
+            <w:tcW w:type="dxa" w:w="1083"/>
+            <w:tcBorders>
+              <w:top w:val="single" w:color="000000" w:sz="4"/>
+              <w:left w:val="single" w:color="000000" w:sz="4"/>
+              <w:bottom w:val="single" w:color="000000" w:sz="4"/>
+              <w:right w:val="single" w:color="000000" w:sz="4"/>
+            </w:tcBorders>
+            <w:tcMar>
+              <w:top w:type="dxa" w:w="60"/>
+              <w:left w:type="dxa" w:w="100"/>
+              <w:bottom w:type="dxa" w:w="60"/>
+              <w:right w:type="dxa" w:w="100"/>
+            </w:tcMar>
+            <w:vAlign w:val="center"/>
+          </w:tcPr>
+          <w:p>
+            <w:pPr>
+              <w:spacing w:line="240"/>
+              <w:jc w:val="left"/>
+            </w:pPr>
+          </w:p>
+        </w:tc>
+        <w:tc>
+          <w:tcPr>
+            <w:tcW w:type="dxa" w:w="1083"/>
             <w:tcBorders>
               <w:top w:val="single" w:color="000000" w:sz="4"/>
               <w:left w:val="single" w:color="000000" w:sz="4"/>
@@ -6311,33 +6820,50 @@
         </w:tc>
         <w:tc>
           <w:tcPr>
-            <w:tcW w:type="dxa" w:w="762"/>
-            <w:tcBorders>
-              <w:top w:val="single" w:color="000000" w:sz="4"/>
-              <w:left w:val="single" w:color="000000" w:sz="4"/>
-              <w:bottom w:val="single" w:color="000000" w:sz="4"/>
-              <w:right w:val="single" w:color="000000" w:sz="4"/>
-            </w:tcBorders>
-            <w:tcMar>
-              <w:top w:type="dxa" w:w="60"/>
-              <w:left w:type="dxa" w:w="100"/>
-              <w:bottom w:type="dxa" w:w="60"/>
-              <w:right w:type="dxa" w:w="100"/>
-            </w:tcMar>
-            <w:vAlign w:val="center"/>
-          </w:tcPr>
-          <w:p>
-            <w:pPr>
-              <w:spacing w:line="240"/>
-              <w:jc w:val="center"/>
-            </w:pPr>
-            <w:r>
-              <w:rPr>
-                <w:sz w:val="20"/>
-                <w:szCs w:val="20"/>
-              </w:rPr>
-              <w:t xml:space="preserve">X</w:t>
-            </w:r>
+            <w:tcW w:type="dxa" w:w="1083"/>
+            <w:tcBorders>
+              <w:top w:val="single" w:color="000000" w:sz="4"/>
+              <w:left w:val="single" w:color="000000" w:sz="4"/>
+              <w:bottom w:val="single" w:color="000000" w:sz="4"/>
+              <w:right w:val="single" w:color="000000" w:sz="4"/>
+            </w:tcBorders>
+            <w:tcMar>
+              <w:top w:type="dxa" w:w="60"/>
+              <w:left w:type="dxa" w:w="100"/>
+              <w:bottom w:type="dxa" w:w="60"/>
+              <w:right w:type="dxa" w:w="100"/>
+            </w:tcMar>
+            <w:vAlign w:val="center"/>
+          </w:tcPr>
+          <w:p>
+            <w:pPr>
+              <w:spacing w:line="240"/>
+              <w:jc w:val="left"/>
+            </w:pPr>
+          </w:p>
+        </w:tc>
+        <w:tc>
+          <w:tcPr>
+            <w:tcW w:type="dxa" w:w="1083"/>
+            <w:tcBorders>
+              <w:top w:val="single" w:color="000000" w:sz="4"/>
+              <w:left w:val="single" w:color="000000" w:sz="4"/>
+              <w:bottom w:val="single" w:color="000000" w:sz="4"/>
+              <w:right w:val="single" w:color="000000" w:sz="4"/>
+            </w:tcBorders>
+            <w:tcMar>
+              <w:top w:type="dxa" w:w="60"/>
+              <w:left w:type="dxa" w:w="100"/>
+              <w:bottom w:type="dxa" w:w="60"/>
+              <w:right w:type="dxa" w:w="100"/>
+            </w:tcMar>
+            <w:vAlign w:val="center"/>
+          </w:tcPr>
+          <w:p>
+            <w:pPr>
+              <w:spacing w:line="240"/>
+              <w:jc w:val="left"/>
+            </w:pPr>
           </w:p>
         </w:tc>
       </w:tr>
@@ -6348,7 +6874,301 @@
         </w:trPr>
         <w:tc>
           <w:tcPr>
-            <w:tcW w:type="dxa" w:w="5742"/>
+            <w:tcW w:type="dxa" w:w="4455"/>
+            <w:tcBorders>
+              <w:top w:val="single" w:color="000000" w:sz="4"/>
+              <w:left w:val="single" w:color="000000" w:sz="4"/>
+              <w:bottom w:val="single" w:color="000000" w:sz="4"/>
+              <w:right w:val="single" w:color="000000" w:sz="4"/>
+            </w:tcBorders>
+            <w:tcMar>
+              <w:top w:type="dxa" w:w="60"/>
+              <w:left w:type="dxa" w:w="100"/>
+              <w:bottom w:type="dxa" w:w="60"/>
+              <w:right w:type="dxa" w:w="100"/>
+            </w:tcMar>
+            <w:vAlign w:val="center"/>
+          </w:tcPr>
+          <w:p>
+            <w:pPr>
+              <w:spacing w:line="240"/>
+              <w:jc w:val="left"/>
+            </w:pPr>
+            <w:r>
+              <w:rPr>
+                <w:sz w:val="20"/>
+                <w:szCs w:val="20"/>
+              </w:rPr>
+              <w:t xml:space="preserve">Análisis estadístico</w:t>
+            </w:r>
+          </w:p>
+        </w:tc>
+        <w:tc>
+          <w:tcPr>
+            <w:tcW w:type="dxa" w:w="1083"/>
+            <w:tcBorders>
+              <w:top w:val="single" w:color="000000" w:sz="4"/>
+              <w:left w:val="single" w:color="000000" w:sz="4"/>
+              <w:bottom w:val="single" w:color="000000" w:sz="4"/>
+              <w:right w:val="single" w:color="000000" w:sz="4"/>
+            </w:tcBorders>
+            <w:tcMar>
+              <w:top w:type="dxa" w:w="60"/>
+              <w:left w:type="dxa" w:w="100"/>
+              <w:bottom w:type="dxa" w:w="60"/>
+              <w:right w:type="dxa" w:w="100"/>
+            </w:tcMar>
+            <w:vAlign w:val="center"/>
+          </w:tcPr>
+          <w:p>
+            <w:pPr>
+              <w:spacing w:line="240"/>
+              <w:jc w:val="left"/>
+            </w:pPr>
+          </w:p>
+        </w:tc>
+        <w:tc>
+          <w:tcPr>
+            <w:tcW w:type="dxa" w:w="1083"/>
+            <w:tcBorders>
+              <w:top w:val="single" w:color="000000" w:sz="4"/>
+              <w:left w:val="single" w:color="000000" w:sz="4"/>
+              <w:bottom w:val="single" w:color="000000" w:sz="4"/>
+              <w:right w:val="single" w:color="000000" w:sz="4"/>
+            </w:tcBorders>
+            <w:tcMar>
+              <w:top w:type="dxa" w:w="60"/>
+              <w:left w:type="dxa" w:w="100"/>
+              <w:bottom w:type="dxa" w:w="60"/>
+              <w:right w:type="dxa" w:w="100"/>
+            </w:tcMar>
+            <w:vAlign w:val="center"/>
+          </w:tcPr>
+          <w:p>
+            <w:pPr>
+              <w:spacing w:line="240"/>
+              <w:jc w:val="center"/>
+            </w:pPr>
+            <w:r>
+              <w:rPr>
+                <w:sz w:val="20"/>
+                <w:szCs w:val="20"/>
+              </w:rPr>
+              <w:t xml:space="preserve">X</w:t>
+            </w:r>
+          </w:p>
+        </w:tc>
+        <w:tc>
+          <w:tcPr>
+            <w:tcW w:type="dxa" w:w="1083"/>
+            <w:tcBorders>
+              <w:top w:val="single" w:color="000000" w:sz="4"/>
+              <w:left w:val="single" w:color="000000" w:sz="4"/>
+              <w:bottom w:val="single" w:color="000000" w:sz="4"/>
+              <w:right w:val="single" w:color="000000" w:sz="4"/>
+            </w:tcBorders>
+            <w:tcMar>
+              <w:top w:type="dxa" w:w="60"/>
+              <w:left w:type="dxa" w:w="100"/>
+              <w:bottom w:type="dxa" w:w="60"/>
+              <w:right w:type="dxa" w:w="100"/>
+            </w:tcMar>
+            <w:vAlign w:val="center"/>
+          </w:tcPr>
+          <w:p>
+            <w:pPr>
+              <w:spacing w:line="240"/>
+              <w:jc w:val="center"/>
+            </w:pPr>
+            <w:r>
+              <w:rPr>
+                <w:sz w:val="20"/>
+                <w:szCs w:val="20"/>
+              </w:rPr>
+              <w:t xml:space="preserve">X</w:t>
+            </w:r>
+          </w:p>
+        </w:tc>
+        <w:tc>
+          <w:tcPr>
+            <w:tcW w:type="dxa" w:w="1083"/>
+            <w:tcBorders>
+              <w:top w:val="single" w:color="000000" w:sz="4"/>
+              <w:left w:val="single" w:color="000000" w:sz="4"/>
+              <w:bottom w:val="single" w:color="000000" w:sz="4"/>
+              <w:right w:val="single" w:color="000000" w:sz="4"/>
+            </w:tcBorders>
+            <w:tcMar>
+              <w:top w:type="dxa" w:w="60"/>
+              <w:left w:type="dxa" w:w="100"/>
+              <w:bottom w:type="dxa" w:w="60"/>
+              <w:right w:type="dxa" w:w="100"/>
+            </w:tcMar>
+            <w:vAlign w:val="center"/>
+          </w:tcPr>
+          <w:p>
+            <w:pPr>
+              <w:spacing w:line="240"/>
+              <w:jc w:val="left"/>
+            </w:pPr>
+          </w:p>
+        </w:tc>
+      </w:tr>
+      <w:tr>
+        <w:trPr>
+          <w:cantSplit/>
+          <w:tblHeader w:val="false"/>
+        </w:trPr>
+        <w:tc>
+          <w:tcPr>
+            <w:tcW w:type="dxa" w:w="4455"/>
+            <w:tcBorders>
+              <w:top w:val="single" w:color="000000" w:sz="4"/>
+              <w:left w:val="single" w:color="000000" w:sz="4"/>
+              <w:bottom w:val="single" w:color="000000" w:sz="4"/>
+              <w:right w:val="single" w:color="000000" w:sz="4"/>
+            </w:tcBorders>
+            <w:tcMar>
+              <w:top w:type="dxa" w:w="60"/>
+              <w:left w:type="dxa" w:w="100"/>
+              <w:bottom w:type="dxa" w:w="60"/>
+              <w:right w:type="dxa" w:w="100"/>
+            </w:tcMar>
+            <w:vAlign w:val="center"/>
+          </w:tcPr>
+          <w:p>
+            <w:pPr>
+              <w:spacing w:line="240"/>
+              <w:jc w:val="left"/>
+            </w:pPr>
+            <w:r>
+              <w:rPr>
+                <w:sz w:val="20"/>
+                <w:szCs w:val="20"/>
+              </w:rPr>
+              <w:t xml:space="preserve">Interpretación de resultados y redacción del informe</w:t>
+            </w:r>
+          </w:p>
+        </w:tc>
+        <w:tc>
+          <w:tcPr>
+            <w:tcW w:type="dxa" w:w="1083"/>
+            <w:tcBorders>
+              <w:top w:val="single" w:color="000000" w:sz="4"/>
+              <w:left w:val="single" w:color="000000" w:sz="4"/>
+              <w:bottom w:val="single" w:color="000000" w:sz="4"/>
+              <w:right w:val="single" w:color="000000" w:sz="4"/>
+            </w:tcBorders>
+            <w:tcMar>
+              <w:top w:type="dxa" w:w="60"/>
+              <w:left w:type="dxa" w:w="100"/>
+              <w:bottom w:type="dxa" w:w="60"/>
+              <w:right w:type="dxa" w:w="100"/>
+            </w:tcMar>
+            <w:vAlign w:val="center"/>
+          </w:tcPr>
+          <w:p>
+            <w:pPr>
+              <w:spacing w:line="240"/>
+              <w:jc w:val="left"/>
+            </w:pPr>
+          </w:p>
+        </w:tc>
+        <w:tc>
+          <w:tcPr>
+            <w:tcW w:type="dxa" w:w="1083"/>
+            <w:tcBorders>
+              <w:top w:val="single" w:color="000000" w:sz="4"/>
+              <w:left w:val="single" w:color="000000" w:sz="4"/>
+              <w:bottom w:val="single" w:color="000000" w:sz="4"/>
+              <w:right w:val="single" w:color="000000" w:sz="4"/>
+            </w:tcBorders>
+            <w:tcMar>
+              <w:top w:type="dxa" w:w="60"/>
+              <w:left w:type="dxa" w:w="100"/>
+              <w:bottom w:type="dxa" w:w="60"/>
+              <w:right w:type="dxa" w:w="100"/>
+            </w:tcMar>
+            <w:vAlign w:val="center"/>
+          </w:tcPr>
+          <w:p>
+            <w:pPr>
+              <w:spacing w:line="240"/>
+              <w:jc w:val="left"/>
+            </w:pPr>
+          </w:p>
+        </w:tc>
+        <w:tc>
+          <w:tcPr>
+            <w:tcW w:type="dxa" w:w="1083"/>
+            <w:tcBorders>
+              <w:top w:val="single" w:color="000000" w:sz="4"/>
+              <w:left w:val="single" w:color="000000" w:sz="4"/>
+              <w:bottom w:val="single" w:color="000000" w:sz="4"/>
+              <w:right w:val="single" w:color="000000" w:sz="4"/>
+            </w:tcBorders>
+            <w:tcMar>
+              <w:top w:type="dxa" w:w="60"/>
+              <w:left w:type="dxa" w:w="100"/>
+              <w:bottom w:type="dxa" w:w="60"/>
+              <w:right w:type="dxa" w:w="100"/>
+            </w:tcMar>
+            <w:vAlign w:val="center"/>
+          </w:tcPr>
+          <w:p>
+            <w:pPr>
+              <w:spacing w:line="240"/>
+              <w:jc w:val="center"/>
+            </w:pPr>
+            <w:r>
+              <w:rPr>
+                <w:sz w:val="20"/>
+                <w:szCs w:val="20"/>
+              </w:rPr>
+              <w:t xml:space="preserve">X</w:t>
+            </w:r>
+          </w:p>
+        </w:tc>
+        <w:tc>
+          <w:tcPr>
+            <w:tcW w:type="dxa" w:w="1083"/>
+            <w:tcBorders>
+              <w:top w:val="single" w:color="000000" w:sz="4"/>
+              <w:left w:val="single" w:color="000000" w:sz="4"/>
+              <w:bottom w:val="single" w:color="000000" w:sz="4"/>
+              <w:right w:val="single" w:color="000000" w:sz="4"/>
+            </w:tcBorders>
+            <w:tcMar>
+              <w:top w:type="dxa" w:w="60"/>
+              <w:left w:type="dxa" w:w="100"/>
+              <w:bottom w:type="dxa" w:w="60"/>
+              <w:right w:type="dxa" w:w="100"/>
+            </w:tcMar>
+            <w:vAlign w:val="center"/>
+          </w:tcPr>
+          <w:p>
+            <w:pPr>
+              <w:spacing w:line="240"/>
+              <w:jc w:val="center"/>
+            </w:pPr>
+            <w:r>
+              <w:rPr>
+                <w:sz w:val="20"/>
+                <w:szCs w:val="20"/>
+              </w:rPr>
+              <w:t xml:space="preserve">X</w:t>
+            </w:r>
+          </w:p>
+        </w:tc>
+      </w:tr>
+      <w:tr>
+        <w:trPr>
+          <w:cantSplit/>
+          <w:tblHeader w:val="false"/>
+        </w:trPr>
+        <w:tc>
+          <w:tcPr>
+            <w:tcW w:type="dxa" w:w="4455"/>
             <w:tcBorders>
               <w:top w:val="single" w:color="000000" w:sz="4"/>
               <w:left w:val="single" w:color="000000" w:sz="4"/>
@@ -6379,79 +7199,79 @@
         </w:tc>
         <w:tc>
           <w:tcPr>
-            <w:tcW w:type="dxa" w:w="761"/>
-            <w:tcBorders>
-              <w:top w:val="single" w:color="000000" w:sz="4"/>
-              <w:left w:val="single" w:color="000000" w:sz="4"/>
-              <w:bottom w:val="single" w:color="000000" w:sz="4"/>
-              <w:right w:val="single" w:color="000000" w:sz="4"/>
-            </w:tcBorders>
-            <w:tcMar>
-              <w:top w:type="dxa" w:w="60"/>
-              <w:left w:type="dxa" w:w="100"/>
-              <w:bottom w:type="dxa" w:w="60"/>
-              <w:right w:type="dxa" w:w="100"/>
-            </w:tcMar>
-            <w:vAlign w:val="center"/>
-          </w:tcPr>
-          <w:p>
-            <w:pPr>
-              <w:spacing w:line="240"/>
-              <w:jc w:val="left"/>
-            </w:pPr>
-          </w:p>
-        </w:tc>
-        <w:tc>
-          <w:tcPr>
-            <w:tcW w:type="dxa" w:w="761"/>
-            <w:tcBorders>
-              <w:top w:val="single" w:color="000000" w:sz="4"/>
-              <w:left w:val="single" w:color="000000" w:sz="4"/>
-              <w:bottom w:val="single" w:color="000000" w:sz="4"/>
-              <w:right w:val="single" w:color="000000" w:sz="4"/>
-            </w:tcBorders>
-            <w:tcMar>
-              <w:top w:type="dxa" w:w="60"/>
-              <w:left w:type="dxa" w:w="100"/>
-              <w:bottom w:type="dxa" w:w="60"/>
-              <w:right w:type="dxa" w:w="100"/>
-            </w:tcMar>
-            <w:vAlign w:val="center"/>
-          </w:tcPr>
-          <w:p>
-            <w:pPr>
-              <w:spacing w:line="240"/>
-              <w:jc w:val="left"/>
-            </w:pPr>
-          </w:p>
-        </w:tc>
-        <w:tc>
-          <w:tcPr>
-            <w:tcW w:type="dxa" w:w="761"/>
-            <w:tcBorders>
-              <w:top w:val="single" w:color="000000" w:sz="4"/>
-              <w:left w:val="single" w:color="000000" w:sz="4"/>
-              <w:bottom w:val="single" w:color="000000" w:sz="4"/>
-              <w:right w:val="single" w:color="000000" w:sz="4"/>
-            </w:tcBorders>
-            <w:tcMar>
-              <w:top w:type="dxa" w:w="60"/>
-              <w:left w:type="dxa" w:w="100"/>
-              <w:bottom w:type="dxa" w:w="60"/>
-              <w:right w:type="dxa" w:w="100"/>
-            </w:tcMar>
-            <w:vAlign w:val="center"/>
-          </w:tcPr>
-          <w:p>
-            <w:pPr>
-              <w:spacing w:line="240"/>
-              <w:jc w:val="left"/>
-            </w:pPr>
-          </w:p>
-        </w:tc>
-        <w:tc>
-          <w:tcPr>
-            <w:tcW w:type="dxa" w:w="762"/>
+            <w:tcW w:type="dxa" w:w="1083"/>
+            <w:tcBorders>
+              <w:top w:val="single" w:color="000000" w:sz="4"/>
+              <w:left w:val="single" w:color="000000" w:sz="4"/>
+              <w:bottom w:val="single" w:color="000000" w:sz="4"/>
+              <w:right w:val="single" w:color="000000" w:sz="4"/>
+            </w:tcBorders>
+            <w:tcMar>
+              <w:top w:type="dxa" w:w="60"/>
+              <w:left w:type="dxa" w:w="100"/>
+              <w:bottom w:type="dxa" w:w="60"/>
+              <w:right w:type="dxa" w:w="100"/>
+            </w:tcMar>
+            <w:vAlign w:val="center"/>
+          </w:tcPr>
+          <w:p>
+            <w:pPr>
+              <w:spacing w:line="240"/>
+              <w:jc w:val="left"/>
+            </w:pPr>
+          </w:p>
+        </w:tc>
+        <w:tc>
+          <w:tcPr>
+            <w:tcW w:type="dxa" w:w="1083"/>
+            <w:tcBorders>
+              <w:top w:val="single" w:color="000000" w:sz="4"/>
+              <w:left w:val="single" w:color="000000" w:sz="4"/>
+              <w:bottom w:val="single" w:color="000000" w:sz="4"/>
+              <w:right w:val="single" w:color="000000" w:sz="4"/>
+            </w:tcBorders>
+            <w:tcMar>
+              <w:top w:type="dxa" w:w="60"/>
+              <w:left w:type="dxa" w:w="100"/>
+              <w:bottom w:type="dxa" w:w="60"/>
+              <w:right w:type="dxa" w:w="100"/>
+            </w:tcMar>
+            <w:vAlign w:val="center"/>
+          </w:tcPr>
+          <w:p>
+            <w:pPr>
+              <w:spacing w:line="240"/>
+              <w:jc w:val="left"/>
+            </w:pPr>
+          </w:p>
+        </w:tc>
+        <w:tc>
+          <w:tcPr>
+            <w:tcW w:type="dxa" w:w="1083"/>
+            <w:tcBorders>
+              <w:top w:val="single" w:color="000000" w:sz="4"/>
+              <w:left w:val="single" w:color="000000" w:sz="4"/>
+              <w:bottom w:val="single" w:color="000000" w:sz="4"/>
+              <w:right w:val="single" w:color="000000" w:sz="4"/>
+            </w:tcBorders>
+            <w:tcMar>
+              <w:top w:type="dxa" w:w="60"/>
+              <w:left w:type="dxa" w:w="100"/>
+              <w:bottom w:type="dxa" w:w="60"/>
+              <w:right w:type="dxa" w:w="100"/>
+            </w:tcMar>
+            <w:vAlign w:val="center"/>
+          </w:tcPr>
+          <w:p>
+            <w:pPr>
+              <w:spacing w:line="240"/>
+              <w:jc w:val="left"/>
+            </w:pPr>
+          </w:p>
+        </w:tc>
+        <w:tc>
+          <w:tcPr>
+            <w:tcW w:type="dxa" w:w="1083"/>
             <w:tcBorders>
               <w:top w:val="single" w:color="000000" w:sz="4"/>
               <w:left w:val="single" w:color="000000" w:sz="4"/>

</xml_diff>

<commit_message>
Address novelty, exposure validity and external validity in NHANES protocol
Cite the KNHANES STOP-BANG/PHQ-9 studies and narrow the knowledge gap, add
the polysomnography-validated SOPBAG as a prespecified secondary exposure
and the MAP index as a sensitivity analysis, and add a Hispanic subgroup
objective with its feasibility counts.

Co-Authored-By: Claude Opus 5.5 <noreply@anthropic.com>
Claude-Session: https://claude.ai/code/session_01CVJPPDyHtXiZh6u6qkcjXo
</commit_message>
<xml_diff>
--- a/protocolo-nhanes/Protocolo_AOS_Depresion_NHANES.docx
+++ b/protocolo-nhanes/Protocolo_AOS_Depresion_NHANES.docx
@@ -142,7 +142,7 @@
         <w:jc w:val="center"/>
       </w:pPr>
       <w:r>
-        <w:t xml:space="preserve">Cartagena Vela, Christian Gianfranco ([código])</w:t>
+        <w:t xml:space="preserve">Cartagena Vela, Christian Gianfranco (identificador ORCID)</w:t>
       </w:r>
     </w:p>
     <w:p>
@@ -151,7 +151,7 @@
         <w:jc w:val="center"/>
       </w:pPr>
       <w:r>
-        <w:t xml:space="preserve">Paz Orihuela, Gabriel Adrián ([código])</w:t>
+        <w:t xml:space="preserve">Paz Orihuela, Gabriel Adrián (identificador ORCID)</w:t>
       </w:r>
     </w:p>
     <w:p>
@@ -277,19 +277,19 @@
     </w:p>
     <w:p>
       <w:pPr>
-        <w:pStyle w:val="Heading1"/>
-      </w:pPr>
-      <w:r>
-        <w:t xml:space="preserve">2. JUSTIFICACIÓN</w:t>
-      </w:r>
-    </w:p>
-    <w:p>
-      <w:pPr>
         <w:spacing w:after="160" w:line="480"/>
         <w:jc w:val="both"/>
       </w:pPr>
       <w:r>
-        <w:t xml:space="preserve">La justificación de este estudio se apoya en tres ejes.</w:t>
+        <w:t xml:space="preserve">Esta asociación ya fue explorada con el STOP-BANG en la Encuesta Nacional de Salud y Nutrición de Corea (KNHANES). En 8,030 adultos de la edición 2019–2020, el alto riesgo de AOS se asoció con mayor probabilidad de síntomas depresivos según el PHQ-9 (OR 4.31) (22), y en 4,352 adultos de 40 años o más de la edición 2020, con puntajes más altos de PHQ-9 en ambos sexos (23). Sin embargo, estos hallazgos provienen de una población étnicamente homogénea, con una prevalencia de obesidad y una distribución de factores de riesgo distintas a las de poblaciones multiétnicas como la estadounidense o la latinoamericana.</w:t>
+      </w:r>
+    </w:p>
+    <w:p>
+      <w:pPr>
+        <w:pStyle w:val="Heading1"/>
+      </w:pPr>
+      <w:r>
+        <w:t xml:space="preserve">2. JUSTIFICACIÓN</w:t>
       </w:r>
     </w:p>
     <w:p>
@@ -298,6 +298,15 @@
         <w:jc w:val="both"/>
       </w:pPr>
       <w:r>
+        <w:t xml:space="preserve">La justificación de este estudio se apoya en tres ejes.</w:t>
+      </w:r>
+    </w:p>
+    <w:p>
+      <w:pPr>
+        <w:spacing w:after="160" w:line="480"/>
+        <w:jc w:val="both"/>
+      </w:pPr>
+      <w:r>
         <w:rPr>
           <w:b/>
           <w:bCs/>
@@ -321,7 +330,7 @@
         <w:t xml:space="preserve">Vacío de conocimiento.</w:t>
       </w:r>
       <w:r>
-        <w:t xml:space="preserve"> Los estudios poblacionales previos en NHANES evaluaron síntomas aislados de AOS, como el ronquido o las pausas respiratorias, en ciclos anteriores a 2009 (6). En la literatura revisada para este protocolo no se identificó un estudio que evalúe la asociación entre un puntaje compuesto de tamizaje basado en el STOP-BANG y los síntomas depresivos en el ciclo NHANES 2017–marzo 2020, el último que incluye preguntas sobre síntomas de AOS (11,16).</w:t>
+        <w:t xml:space="preserve"> La asociación entre el alto riesgo de AOS según el STOP-BANG y los síntomas depresivos se ha descrito en encuestas nacionales de Corea (22,23), pero no se ha confirmado en poblaciones multiétnicas. En Estados Unidos, los estudios poblacionales en NHANES evaluaron síntomas aislados de AOS, como el ronquido o las pausas respiratorias, en ciclos anteriores a 2009 (6). En la literatura revisada para este protocolo no se identificó un estudio que evalúe esta asociación con un puntaje compuesto basado en el STOP-BANG en el ciclo NHANES 2017–marzo 2020, el último que incluye preguntas sobre síntomas de AOS (11,16), ni que la examine en adultos hispanos, cuyo perfil es más cercano al de la población latinoamericana.</w:t>
       </w:r>
     </w:p>
     <w:p>
@@ -342,27 +351,43 @@
     </w:p>
     <w:p>
       <w:pPr>
-        <w:pStyle w:val="Heading1"/>
-      </w:pPr>
-      <w:r>
-        <w:t xml:space="preserve">3. PROBLEMA DE INVESTIGACIÓN</w:t>
-      </w:r>
-    </w:p>
-    <w:p>
-      <w:pPr>
-        <w:pStyle w:val="Heading2"/>
-      </w:pPr>
-      <w:r>
-        <w:t xml:space="preserve">3.1 Planteamiento del problema</w:t>
-      </w:r>
-    </w:p>
-    <w:p>
-      <w:pPr>
         <w:spacing w:after="160" w:line="480"/>
         <w:jc w:val="both"/>
       </w:pPr>
       <w:r>
-        <w:t xml:space="preserve">La AOS y la depresión comparten síntomas, factores de riesgo y posibles mecanismos fisiopatológicos, pero ambas suelen evaluarse por separado en la práctica clínica (5–8). La mayoría de la evidencia poblacional proviene de síntomas aislados de AOS y de ciclos antiguos de NHANES (6). No se conoce con precisión si el alto riesgo de AOS, definido mediante un puntaje compuesto de tamizaje, se asocia con síntomas depresivos clínicamente relevantes en una muestra nacional reciente, después de considerar las características sociodemográficas y clínicas de los participantes.</w:t>
+        <w:rPr>
+          <w:b/>
+          <w:bCs/>
+        </w:rPr>
+        <w:t xml:space="preserve">Relevancia para el Perú.</w:t>
+      </w:r>
+      <w:r>
+        <w:t xml:space="preserve"> En el Perú no existe una encuesta nacional que incluya preguntas sobre síntomas de AOS: la Encuesta Demográfica y de Salud Familiar (ENDES) incluye el PHQ-9, pero no preguntas sobre ronquido, apneas observadas ni somnolencia. Por ello, el análisis del subgrupo de adultos hispanos de NHANES ofrece la evidencia poblacional disponible más cercana a la población peruana, y sus resultados podrán justificar la inclusión de estas preguntas en encuestas nacionales y el diseño de estudios primarios en el país.</w:t>
+      </w:r>
+    </w:p>
+    <w:p>
+      <w:pPr>
+        <w:pStyle w:val="Heading1"/>
+      </w:pPr>
+      <w:r>
+        <w:t xml:space="preserve">3. PROBLEMA DE INVESTIGACIÓN</w:t>
+      </w:r>
+    </w:p>
+    <w:p>
+      <w:pPr>
+        <w:pStyle w:val="Heading2"/>
+      </w:pPr>
+      <w:r>
+        <w:t xml:space="preserve">3.1 Planteamiento del problema</w:t>
+      </w:r>
+    </w:p>
+    <w:p>
+      <w:pPr>
+        <w:spacing w:after="160" w:line="480"/>
+        <w:jc w:val="both"/>
+      </w:pPr>
+      <w:r>
+        <w:t xml:space="preserve">La AOS y la depresión comparten síntomas, factores de riesgo y posibles mecanismos fisiopatológicos, pero ambas suelen evaluarse por separado en la práctica clínica (5–8). La evidencia poblacional con el STOP-BANG proviene principalmente de Corea (22,23), y la evidencia en Estados Unidos, de síntomas aislados de AOS en ciclos antiguos de NHANES (6). No se conoce con precisión si el alto riesgo de AOS, definido mediante un puntaje compuesto de tamizaje, se asocia con síntomas depresivos clínicamente relevantes en una muestra nacional multiétnica y reciente, ni si esta asociación se mantiene en adultos hispanos, después de considerar las características sociodemográficas y clínicas de los participantes.</w:t>
       </w:r>
     </w:p>
     <w:p>
@@ -863,6 +888,34 @@
       </w:pPr>
       <w:r>
         <w:t xml:space="preserve">Evaluar la existencia de un gradiente en la prevalencia de síntomas depresivos según el puntaje del STOP-BANG adaptado (0–2, 3–4 y 5–7 puntos).</w:t>
+      </w:r>
+    </w:p>
+    <w:p>
+      <w:pPr>
+        <w:pStyle w:val="ListParagraph"/>
+        <w:numPr>
+          <w:ilvl w:val="0"/>
+          <w:numId w:val="2"/>
+        </w:numPr>
+        <w:spacing w:after="0" w:line="480"/>
+        <w:jc w:val="both"/>
+      </w:pPr>
+      <w:r>
+        <w:t xml:space="preserve">Evaluar la consistencia de la asociación con una versión reducida del STOP-BANG validada frente a la polisomnografía (SOPBAG) y con el índice multivariable de predicción de apnea (MAP).</w:t>
+      </w:r>
+    </w:p>
+    <w:p>
+      <w:pPr>
+        <w:pStyle w:val="ListParagraph"/>
+        <w:numPr>
+          <w:ilvl w:val="0"/>
+          <w:numId w:val="2"/>
+        </w:numPr>
+        <w:spacing w:after="0" w:line="480"/>
+        <w:jc w:val="both"/>
+      </w:pPr>
+      <w:r>
+        <w:t xml:space="preserve">Estimar la asociación en el subgrupo de adultos hispanos.</w:t>
       </w:r>
     </w:p>
     <w:p>
@@ -2285,6 +2338,66 @@
       </w:r>
       <w:r>
         <w:t xml:space="preserve"> un puntaje de 0 a 2, en concordancia con el punto de corte del cuestionario original (9). Para el análisis de gradiente, el puntaje se agrupará en 0–2, 3–4 y 5–7 puntos. Las respuestas "No sabe" (9) o "Rechazado" (7) se considerarán datos faltantes.</w:t>
+      </w:r>
+    </w:p>
+    <w:p>
+      <w:pPr>
+        <w:spacing w:after="160" w:line="480"/>
+        <w:jc w:val="both"/>
+      </w:pPr>
+      <w:r>
+        <w:t xml:space="preserve">La omisión del cuello tiene respaldo empírico. En 541 pacientes evaluados con polisomnografía, una versión reducida que excluye la circunferencia de cuello y el cansancio (SOPBAG) tuvo un área bajo la curva de 0.811, equivalente a la del STOP-BANG completo (0.809) (24). Por ello, se prespecifican dos definiciones complementarias de la exposición:</w:t>
+      </w:r>
+    </w:p>
+    <w:p>
+      <w:pPr>
+        <w:pStyle w:val="ListParagraph"/>
+        <w:numPr>
+          <w:ilvl w:val="0"/>
+          <w:numId w:val="2"/>
+        </w:numPr>
+        <w:spacing w:after="0" w:line="480"/>
+        <w:jc w:val="both"/>
+      </w:pPr>
+      <w:r>
+        <w:rPr>
+          <w:b/>
+          <w:bCs/>
+        </w:rPr>
+        <w:t xml:space="preserve">SOPBAG (exposición secundaria prespecificada):</w:t>
+      </w:r>
+      <w:r>
+        <w:t xml:space="preserve"> los ítems S, O, P, B, A y G (0 a 6 puntos), sin el ítem de cansancio. Para mantener la comparabilidad con la exposición principal se usará el punto de corte de 3 o más, y además el puntaje continuo. Esta versión, además de estar validada frente a la polisomnografía, elimina el ítem que se superpone con el PHQ-9.</w:t>
+      </w:r>
+    </w:p>
+    <w:p>
+      <w:pPr>
+        <w:pStyle w:val="ListParagraph"/>
+        <w:numPr>
+          <w:ilvl w:val="0"/>
+          <w:numId w:val="2"/>
+        </w:numPr>
+        <w:spacing w:after="0" w:line="480"/>
+        <w:jc w:val="both"/>
+      </w:pPr>
+      <w:r>
+        <w:rPr>
+          <w:b/>
+          <w:bCs/>
+        </w:rPr>
+        <w:t xml:space="preserve">Índice MAP (análisis de sensibilidad):</w:t>
+      </w:r>
+      <w:r>
+        <w:t xml:space="preserve"> probabilidad estimada de AOS según la ecuación de Maislin et al., validada frente a la polisomnografía, que combina la frecuencia de síntomas nocturnos (SLQ030 y SLQ040, reescalados a la escala original de 0 a 4), el IMC, la edad y el sexo (25). Se analizará como variable continua (por cada aumento de 0.1) y en terciles.</w:t>
+      </w:r>
+    </w:p>
+    <w:p>
+      <w:pPr>
+        <w:spacing w:after="160" w:line="480"/>
+        <w:jc w:val="both"/>
+      </w:pPr>
+      <w:r>
+        <w:t xml:space="preserve">Ninguna de estas versiones reemplaza la polisomnografía: miden riesgo de AOS y no su diagnóstico, por lo que los resultados se interpretarán siempre en esos términos.</w:t>
       </w:r>
     </w:p>
     <w:p>
@@ -5467,6 +5580,15 @@
         <w:jc w:val="both"/>
       </w:pPr>
       <w:r>
+        <w:t xml:space="preserve">Con la versión SOPBAG, 2,818 participantes (40.6%) tuvieron alto riesgo, con una prevalencia no ponderada de síntomas depresivos de 11.3%, frente a 6.8% en los de bajo riesgo. El subgrupo hispano (mexicano-americano y otro hispano) incluyó 1,509 participantes y 143 casos (14.2% en alto riesgo y 6.1% en bajo riesgo). Como el modelo ajustado sin la variable raza/etnia tiene unos 16 parámetros, el subgrupo dispone de alrededor de 9 eventos por parámetro; por ello, su análisis se considerará exploratorio y, de ser necesario, se reducirá el número de covariables según su relevancia clínica.</w:t>
+      </w:r>
+    </w:p>
+    <w:p>
+      <w:pPr>
+        <w:spacing w:after="160" w:line="480"/>
+        <w:jc w:val="both"/>
+      </w:pPr>
+      <w:r>
         <w:t xml:space="preserve">Estas estimaciones solo verifican la factibilidad y no constituyen el análisis final. Las razones de prevalencia ponderadas, crudas y ajustadas, y su interpretación se obtendrán después, según la metodología de este protocolo, para evitar modificar las hipótesis o la estrategia analítica en función de los datos explorados.</w:t>
       </w:r>
     </w:p>
@@ -5594,7 +5716,7 @@
         <w:t xml:space="preserve">Superposición de síntomas.</w:t>
       </w:r>
       <w:r>
-        <w:t xml:space="preserve"> La somnolencia diurna (ítem T) se parece a los ítems de problemas de sueño (DPQ030) y de cansancio (DPQ040) del PHQ-9. Para evitar que esta superposición explique la asociación, se prespecifican análisis de sensibilidad sin estos ítems (sección 6.9).</w:t>
+        <w:t xml:space="preserve"> La somnolencia diurna (ítem T) se parece a los ítems de problemas de sueño (DPQ030) y de cansancio (DPQ040) del PHQ-9. Para evitar que esta superposición explique la asociación, se usará como exposición secundaria el SOPBAG, que no incluye el ítem de cansancio (24), y se prespecifican análisis con un puntaje PHQ-9 sin los ítems de sueño y cansancio (sección 6.9).</w:t>
       </w:r>
     </w:p>
     <w:p>
@@ -5740,6 +5862,22 @@
       </w:r>
       <w:r>
         <w:t xml:space="preserve"> Se estimarán las RP de las categorías 3–4 y 5–7 frente a 0–2, y la tendencia se evaluará incorporando el puntaje agrupado como término ordinal (p de tendencia).</w:t>
+      </w:r>
+    </w:p>
+    <w:p>
+      <w:pPr>
+        <w:spacing w:after="160" w:line="480"/>
+        <w:jc w:val="both"/>
+      </w:pPr>
+      <w:r>
+        <w:rPr>
+          <w:b/>
+          <w:bCs/>
+        </w:rPr>
+        <w:t xml:space="preserve">Exposición secundaria y subgrupo hispano.</w:t>
+      </w:r>
+      <w:r>
+        <w:t xml:space="preserve"> El análisis multivariado se repetirá con el SOPBAG como exposición y en el subgrupo de adultos hispanos, definido como una subpoblación del diseño muestral (opción subpop()), sin la variable raza/etnia en el modelo.</w:t>
       </w:r>
     </w:p>
     <w:p>
@@ -5782,7 +5920,7 @@
         <w:jc w:val="left"/>
       </w:pPr>
       <w:r>
-        <w:t xml:space="preserve">Exposición sin el ítem de cansancio (STOP-BAG sin T, 0 a 6 puntos, alto riesgo ≥ 3).</w:t>
+        <w:t xml:space="preserve">Exposición definida por el índice MAP, como variable continua y en terciles (25).</w:t>
       </w:r>
     </w:p>
     <w:p>
@@ -5843,6 +5981,20 @@
     </w:p>
     <w:p>
       <w:pPr>
+        <w:pStyle w:val="ListParagraph"/>
+        <w:numPr>
+          <w:ilvl w:val="0"/>
+          <w:numId w:val="4"/>
+        </w:numPr>
+        <w:spacing w:after="0" w:line="480"/>
+        <w:jc w:val="left"/>
+      </w:pPr>
+      <w:r>
+        <w:t xml:space="preserve">Puntos de corte alternativos del STOP-BAG (2 o más y 4 o más).</w:t>
+      </w:r>
+    </w:p>
+    <w:p>
+      <w:pPr>
         <w:spacing w:after="160" w:line="480"/>
         <w:jc w:val="both"/>
       </w:pPr>
@@ -5937,7 +6089,7 @@
         <w:jc w:val="both"/>
       </w:pPr>
       <w:r>
-        <w:t xml:space="preserve">Incluye análisis de sensibilidad prespecificados para controlar la superposición de síntomas entre la exposición y el desenlace.</w:t>
+        <w:t xml:space="preserve">Evalúa la exposición con tres instrumentos complementarios (STOP-BAG, SOPBAG e índice MAP), dos de ellos validados frente a la polisomnografía.</w:t>
       </w:r>
     </w:p>
     <w:p>
@@ -5951,15 +6103,7 @@
         <w:jc w:val="both"/>
       </w:pPr>
       <w:r>
-        <w:t xml:space="preserve">La factibilidad se verificó con los datos reales de NHANES 2017–marzo 2020 antes del análisis final.</w:t>
-      </w:r>
-    </w:p>
-    <w:p>
-      <w:pPr>
-        <w:pStyle w:val="Heading1"/>
-      </w:pPr>
-      <w:r>
-        <w:t xml:space="preserve">9. LIMITACIONES</w:t>
+        <w:t xml:space="preserve">Incluye análisis de sensibilidad prespecificados para controlar la superposición de síntomas entre la exposición y el desenlace.</w:t>
       </w:r>
     </w:p>
     <w:p>
@@ -5973,14 +6117,7 @@
         <w:jc w:val="both"/>
       </w:pPr>
       <w:r>
-        <w:rPr>
-          <w:b/>
-          <w:bCs/>
-        </w:rPr>
-        <w:t xml:space="preserve">Validez externa:</w:t>
-      </w:r>
-      <w:r>
-        <w:t xml:space="preserve"> los resultados serán generalizables a la población de Estados Unidos y no directamente a la población peruana.</w:t>
+        <w:t xml:space="preserve">Analiza a los adultos hispanos, la población de NHANES más cercana a la peruana.</w:t>
       </w:r>
     </w:p>
     <w:p>
@@ -5994,14 +6131,15 @@
         <w:jc w:val="both"/>
       </w:pPr>
       <w:r>
-        <w:rPr>
-          <w:b/>
-          <w:bCs/>
-        </w:rPr>
-        <w:t xml:space="preserve">Exposición indirecta:</w:t>
-      </w:r>
-      <w:r>
-        <w:t xml:space="preserve"> el STOP-BAG adaptado no incluye la circunferencia de cuello ni confirma la AOS con polisomnografía; mide riesgo, no diagnóstico.</w:t>
+        <w:t xml:space="preserve">La factibilidad se verificó con los datos reales de NHANES 2017–marzo 2020 antes del análisis final.</w:t>
+      </w:r>
+    </w:p>
+    <w:p>
+      <w:pPr>
+        <w:pStyle w:val="Heading1"/>
+      </w:pPr>
+      <w:r>
+        <w:t xml:space="preserve">9. LIMITACIONES</w:t>
       </w:r>
     </w:p>
     <w:p>
@@ -6019,10 +6157,52 @@
           <w:b/>
           <w:bCs/>
         </w:rPr>
+        <w:t xml:space="preserve">Validez externa:</w:t>
+      </w:r>
+      <w:r>
+        <w:t xml:space="preserve"> los resultados serán generalizables a la población de Estados Unidos y no directamente a la población peruana. Para acercarlos a la realidad latinoamericana se analizará el subgrupo hispano, aunque con menor precisión.</w:t>
+      </w:r>
+    </w:p>
+    <w:p>
+      <w:pPr>
+        <w:pStyle w:val="ListParagraph"/>
+        <w:numPr>
+          <w:ilvl w:val="0"/>
+          <w:numId w:val="2"/>
+        </w:numPr>
+        <w:spacing w:after="0" w:line="480"/>
+        <w:jc w:val="both"/>
+      </w:pPr>
+      <w:r>
+        <w:rPr>
+          <w:b/>
+          <w:bCs/>
+        </w:rPr>
+        <w:t xml:space="preserve">Exposición indirecta:</w:t>
+      </w:r>
+      <w:r>
+        <w:t xml:space="preserve"> el STOP-BAG adaptado no incluye la circunferencia de cuello ni confirma la AOS con polisomnografía; mide riesgo, no diagnóstico. Para reducir esta limitación se usarán dos instrumentos validados frente a la polisomnografía, el SOPBAG y el índice MAP (24,25). La clasificación incorrecta de la exposición, probablemente no diferencial, tendería a subestimar la asociación.</w:t>
+      </w:r>
+    </w:p>
+    <w:p>
+      <w:pPr>
+        <w:pStyle w:val="ListParagraph"/>
+        <w:numPr>
+          <w:ilvl w:val="0"/>
+          <w:numId w:val="2"/>
+        </w:numPr>
+        <w:spacing w:after="0" w:line="480"/>
+        <w:jc w:val="both"/>
+      </w:pPr>
+      <w:r>
+        <w:rPr>
+          <w:b/>
+          <w:bCs/>
+        </w:rPr>
         <w:t xml:space="preserve">Diseño transversal:</w:t>
       </w:r>
       <w:r>
-        <w:t xml:space="preserve"> no permite establecer causalidad ni la dirección de la asociación.</w:t>
+        <w:t xml:space="preserve"> no permite establecer causalidad ni la dirección de la asociación; la depresión podría aumentar la percepción de somnolencia o de los síntomas nocturnos. El gradiente según el puntaje y la consistencia entre instrumentos apoyarán la coherencia de la asociación, pero no su causalidad.</w:t>
       </w:r>
     </w:p>
     <w:p>
@@ -7622,6 +7802,62 @@
       </w:pPr>
       <w:r>
         <w:t xml:space="preserve">StataCorp. Stata Statistical Software: Release 18. College Station (TX): StataCorp LLC; 2023.</w:t>
+      </w:r>
+    </w:p>
+    <w:p>
+      <w:pPr>
+        <w:pStyle w:val="ListParagraph"/>
+        <w:numPr>
+          <w:ilvl w:val="0"/>
+          <w:numId w:val="5"/>
+        </w:numPr>
+        <w:spacing w:after="0" w:line="480"/>
+        <w:jc w:val="left"/>
+      </w:pPr>
+      <w:r>
+        <w:t xml:space="preserve">Lee MR, Jung SM. Obstructive sleep apnea related to mental health, health-related quality of life and multimorbidity: a nationwide survey of a representative sample in Republic of Korea. PLoS One. 2023;18(6):e0287182.</w:t>
+      </w:r>
+    </w:p>
+    <w:p>
+      <w:pPr>
+        <w:pStyle w:val="ListParagraph"/>
+        <w:numPr>
+          <w:ilvl w:val="0"/>
+          <w:numId w:val="5"/>
+        </w:numPr>
+        <w:spacing w:after="0" w:line="480"/>
+        <w:jc w:val="left"/>
+      </w:pPr>
+      <w:r>
+        <w:t xml:space="preserve">Lee MS, Lee H. The risk of obstructive sleep apnea is highly correlated with depressive symptoms among the Korean adults population: results from the 2020 Korea National Health and Nutrition Examination Survey. BMC Psychiatry. 2023;23. doi:10.1186/s12888-023-04983-7</w:t>
+      </w:r>
+    </w:p>
+    <w:p>
+      <w:pPr>
+        <w:pStyle w:val="ListParagraph"/>
+        <w:numPr>
+          <w:ilvl w:val="0"/>
+          <w:numId w:val="5"/>
+        </w:numPr>
+        <w:spacing w:after="0" w:line="480"/>
+        <w:jc w:val="left"/>
+      </w:pPr>
+      <w:r>
+        <w:t xml:space="preserve">Kim KT, Cho YW. Real-world STOPBANG: how useful is STOPBANG for sleep clinics? Sleep Breath. 2019. doi:10.1007/s11325-019-01806-6</w:t>
+      </w:r>
+    </w:p>
+    <w:p>
+      <w:pPr>
+        <w:pStyle w:val="ListParagraph"/>
+        <w:numPr>
+          <w:ilvl w:val="0"/>
+          <w:numId w:val="5"/>
+        </w:numPr>
+        <w:spacing w:after="0" w:line="480"/>
+        <w:jc w:val="left"/>
+      </w:pPr>
+      <w:r>
+        <w:t xml:space="preserve">Maislin G, Pack AI, Kribbs NB, Smith PL, Schwartz AR, Kline LR, et al. A survey screen for prediction of apnea. Sleep. 1995;18(3):158-66.</w:t>
       </w:r>
     </w:p>
     <w:p>

</xml_diff>

<commit_message>
Cite Li et al. 2023 NHANES sleep apnea-depression study and refine gap
Co-Authored-By: Claude Opus 5.5 <noreply@anthropic.com>
Claude-Session: https://claude.ai/code/session_01CVJPPDyHtXiZh6u6qkcjXo
</commit_message>
<xml_diff>
--- a/protocolo-nhanes/Protocolo_AOS_Depresion_NHANES.docx
+++ b/protocolo-nhanes/Protocolo_AOS_Depresion_NHANES.docx
@@ -263,7 +263,7 @@
         <w:jc w:val="both"/>
       </w:pPr>
       <w:r>
-        <w:t xml:space="preserve">Existen mecanismos plausibles que vinculan ambas condiciones. La hipoxia intermitente, la fragmentación del sueño, la inflamación sistémica y la somnolencia diurna podrían afectar el estado de ánimo y la función cognitiva (5,7). En la cohorte de Wisconsin, el empeoramiento de los trastornos respiratorios del sueño se asoció con un mayor riesgo de desarrollar depresión (5). En NHANES 2005–2008, la frecuencia de ronquidos con resoplidos o pausas respiratorias durante el sueño se asoció con depresión probable según el PHQ-9 (6). Asimismo, las revisiones sistemáticas reportan una elevada frecuencia de síntomas depresivos en pacientes con AOS y de AOS en pacientes con depresión (7,8).</w:t>
+        <w:t xml:space="preserve">Existen mecanismos plausibles que vinculan ambas condiciones. La hipoxia intermitente, la fragmentación del sueño, la inflamación sistémica y la somnolencia diurna podrían afectar el estado de ánimo y la función cognitiva (5,7). En la cohorte de Wisconsin, el empeoramiento de los trastornos respiratorios del sueño se asoció con un mayor riesgo de desarrollar depresión (5). En NHANES 2005–2008, la frecuencia de ronquidos con resoplidos o pausas respiratorias durante el sueño se asoció con depresión probable según el PHQ-9 (6), y en un análisis de los ciclos 2005 a 2018, la AOS autorreportada se asoció con mayor probabilidad de síntomas depresivos (26). Asimismo, las revisiones sistemáticas reportan una elevada frecuencia de síntomas depresivos en pacientes con AOS y de AOS en pacientes con depresión (7,8).</w:t>
       </w:r>
     </w:p>
     <w:p>
@@ -330,7 +330,7 @@
         <w:t xml:space="preserve">Vacío de conocimiento.</w:t>
       </w:r>
       <w:r>
-        <w:t xml:space="preserve"> La asociación entre el alto riesgo de AOS según el STOP-BANG y los síntomas depresivos se ha descrito en encuestas nacionales de Corea (22,23), pero no se ha confirmado en poblaciones multiétnicas. En Estados Unidos, los estudios poblacionales en NHANES evaluaron síntomas aislados de AOS, como el ronquido o las pausas respiratorias, en ciclos anteriores a 2009 (6). En la literatura revisada para este protocolo no se identificó un estudio que evalúe esta asociación con un puntaje compuesto basado en el STOP-BANG en el ciclo NHANES 2017–marzo 2020, el último que incluye preguntas sobre síntomas de AOS (11,16), ni que la examine en adultos hispanos, cuyo perfil es más cercano al de la población latinoamericana.</w:t>
+        <w:t xml:space="preserve"> La asociación entre el alto riesgo de AOS según el STOP-BANG y los síntomas depresivos se ha descrito en encuestas nacionales de Corea (22,23), pero no se ha confirmado en poblaciones multiétnicas. En Estados Unidos, los estudios en NHANES evaluaron síntomas aislados de AOS o su autorreporte: con datos de 2005–2008, los resoplidos o pausas respiratorias frecuentes se asociaron con depresión probable (6), y con datos combinados de 2005 a 2018, la AOS autorreportada se asoció con síntomas depresivos (OR 2.36) (26). En la literatura revisada para este protocolo no se identificó un estudio que evalúe esta asociación con un puntaje compuesto de tamizaje basado en el STOP-BANG, que incluya los datos de 2019–2020 del archivo prepandémico, el último con preguntas sobre síntomas de AOS (11,16), ni que la examine específicamente en adultos hispanos, cuyo perfil es más cercano al de la población latinoamericana.</w:t>
       </w:r>
     </w:p>
     <w:p>
@@ -387,7 +387,7 @@
         <w:jc w:val="both"/>
       </w:pPr>
       <w:r>
-        <w:t xml:space="preserve">La AOS y la depresión comparten síntomas, factores de riesgo y posibles mecanismos fisiopatológicos, pero ambas suelen evaluarse por separado en la práctica clínica (5–8). La evidencia poblacional con el STOP-BANG proviene principalmente de Corea (22,23), y la evidencia en Estados Unidos, de síntomas aislados de AOS en ciclos antiguos de NHANES (6). No se conoce con precisión si el alto riesgo de AOS, definido mediante un puntaje compuesto de tamizaje, se asocia con síntomas depresivos clínicamente relevantes en una muestra nacional multiétnica y reciente, ni si esta asociación se mantiene en adultos hispanos, después de considerar las características sociodemográficas y clínicas de los participantes.</w:t>
+        <w:t xml:space="preserve">La AOS y la depresión comparten síntomas, factores de riesgo y posibles mecanismos fisiopatológicos, pero ambas suelen evaluarse por separado en la práctica clínica (5–8). La evidencia poblacional con el STOP-BANG proviene principalmente de Corea (22,23), y la evidencia en Estados Unidos, del autorreporte o de síntomas aislados de AOS en NHANES (6,26). No se conoce con precisión si el alto riesgo de AOS, definido mediante un puntaje compuesto de tamizaje, se asocia con síntomas depresivos clínicamente relevantes en una muestra nacional multiétnica y reciente, ni si esta asociación se mantiene en adultos hispanos, después de considerar las características sociodemográficas y clínicas de los participantes.</w:t>
       </w:r>
     </w:p>
     <w:p>
@@ -10008,6 +10008,20 @@
       </w:pPr>
       <w:r>
         <w:t xml:space="preserve">Maislin G, Pack AI, Kribbs NB, Smith PL, Schwartz AR, Kline LR, et al. A survey screen for prediction of apnea. Sleep. 1995;18(3):158-66.</w:t>
+      </w:r>
+    </w:p>
+    <w:p>
+      <w:pPr>
+        <w:pStyle w:val="ListParagraph"/>
+        <w:numPr>
+          <w:ilvl w:val="0"/>
+          <w:numId w:val="5"/>
+        </w:numPr>
+        <w:spacing w:after="0" w:line="480"/>
+        <w:jc w:val="left"/>
+      </w:pPr>
+      <w:r>
+        <w:t xml:space="preserve">Li M, Zou X, Lu H, Li F, Xin Y, Zhang W, et al. Association of sleep apnea and depressive symptoms among US adults: a cross-sectional study. BMC Public Health. 2023;23. doi:10.1186/s12889-023-15358-8</w:t>
       </w:r>
     </w:p>
     <w:p>

</xml_diff>